<commit_message>
Scenario 2: rename ship Hard Bargain, rival crew at wreck, space-fight guidance
Co-Authored-By: Claude Sonnet 5.5 <noreply@anthropic.com>
</commit_message>
<xml_diff>
--- a/docs/scenarios/Scenario 2 - Dead Reckoning.docx
+++ b/docs/scenarios/Scenario 2 - Dead Reckoning.docx
@@ -1505,7 +1505,7 @@
               <w:rPr>
                 <w:rFonts w:ascii="Calibri" w:cs="Calibri" w:eastAsia="Calibri" w:hAnsi="Calibri"/>
               </w:rPr>
-              <w:t xml:space="preserve">The rival crew breaks through the cargo hatch outer plate. If the party is still at the rival camp, they hear the work stop.</w:t>
+              <w:t xml:space="preserve">The rival crew breaks through the cargo hatch outer plate. If the party is watching the wreck, they hear the cutting stop.</w:t>
             </w:r>
           </w:p>
         </w:tc>
@@ -1560,7 +1560,7 @@
               <w:rPr>
                 <w:rFonts w:ascii="Calibri" w:cs="Calibri" w:eastAsia="Calibri" w:hAnsi="Calibri"/>
               </w:rPr>
-              <w:t xml:space="preserve">The rival crew's freight sled arrives. After this, the rivals start carrying containers out. (If the party hasn't dealt with them, they lose a container every hour.)</w:t>
+              <w:t xml:space="preserve">The rivals finish cutting into the hold and start carrying containers out on their freight sled. (If the party hasn't dealt with them, they lose a container every hour.)</w:t>
             </w:r>
           </w:p>
         </w:tc>
@@ -2243,7 +2243,91 @@
         <w:rPr>
           <w:rFonts w:ascii="Calibri" w:cs="Calibri" w:eastAsia="Calibri" w:hAnsi="Calibri"/>
         </w:rPr>
-        <w:t xml:space="preserve"> It is the rival crew's freighter, the Scrapper's Dream, a modified Type-J Seeker with one pulse laser turret. It is in low orbit on a quiet profile, not at the landing site. The pilot has sent a landing party down and is waiting for the freight sled. The party can passively detect it with Electronics (sensors) 8+. Do not let the party fight it in space; its turret is the reason the rival crew feels safe, but it is a speed bump, not a fight, and only matters in Scene 3 if the party is spotted.</w:t>
+        <w:t xml:space="preserve"> It is the rival crew's freighter, the Hard Bargain, a modified Type-J Seeker with one pulse laser turret. It is in low orbit on a quiet profile, not at the landing site. The pilot has sent a landing party down and is waiting for the freight sled. The party can passively detect it with Electronics (sensors) 8+. Attacking her is a poor trade, and the scenario makes that visible rather than forbidding it (see below).</w:t>
+      </w:r>
+    </w:p>
+    <w:p>
+      <w:pPr>
+        <w:pStyle w:val="Heading3"/>
+        <w:spacing w:after="80" w:before="160"/>
+      </w:pPr>
+      <w:r>
+        <w:rPr>
+          <w:rFonts w:ascii="Calibri" w:cs="Calibri" w:eastAsia="Calibri" w:hAnsi="Calibri"/>
+        </w:rPr>
+        <w:t xml:space="preserve">If the party considers attacking the Hard Bargain</w:t>
+      </w:r>
+    </w:p>
+    <w:p>
+      <w:pPr>
+        <w:pStyle w:val="ListParagraph"/>
+        <w:numPr>
+          <w:ilvl w:val="0"/>
+          <w:numId w:val="2"/>
+        </w:numPr>
+        <w:spacing w:after="60"/>
+      </w:pPr>
+      <w:r>
+        <w:rPr>
+          <w:rFonts w:ascii="Calibri" w:cs="Calibri" w:eastAsia="Calibri" w:hAnsi="Calibri"/>
+          <w:b/>
+          <w:bCs/>
+        </w:rPr>
+        <w:t xml:space="preserve">Make it unattractive.</w:t>
+      </w:r>
+      <w:r>
+        <w:rPr>
+          <w:rFonts w:ascii="Calibri" w:cs="Calibri" w:eastAsia="Calibri" w:hAnsi="Calibri"/>
+        </w:rPr>
+        <w:t xml:space="preserve"> She is a long burn away, so every hour spent in space is an hour the rivals spend on the hatch. She carries a pulse laser turret, so it is a real fight for a trader with nothing to gain. Her pilot and gunner aren't carrying the cargo.</w:t>
+      </w:r>
+    </w:p>
+    <w:p>
+      <w:pPr>
+        <w:pStyle w:val="ListParagraph"/>
+        <w:numPr>
+          <w:ilvl w:val="0"/>
+          <w:numId w:val="2"/>
+        </w:numPr>
+        <w:spacing w:after="60"/>
+      </w:pPr>
+      <w:r>
+        <w:rPr>
+          <w:rFonts w:ascii="Calibri" w:cs="Calibri" w:eastAsia="Calibri" w:hAnsi="Calibri"/>
+          <w:b/>
+          <w:bCs/>
+        </w:rPr>
+        <w:t xml:space="preserve">Make it unnecessary.</w:t>
+      </w:r>
+      <w:r>
+        <w:rPr>
+          <w:rFonts w:ascii="Calibri" w:cs="Calibri" w:eastAsia="Calibri" w:hAnsi="Calibri"/>
+        </w:rPr>
+        <w:t xml:space="preserve"> Sensors show the landing party is already on the ground and the ship is only waiting. The real contest is at the wreck.</w:t>
+      </w:r>
+    </w:p>
+    <w:p>
+      <w:pPr>
+        <w:pStyle w:val="ListParagraph"/>
+        <w:numPr>
+          <w:ilvl w:val="0"/>
+          <w:numId w:val="2"/>
+        </w:numPr>
+        <w:spacing w:after="60"/>
+      </w:pPr>
+      <w:r>
+        <w:rPr>
+          <w:rFonts w:ascii="Calibri" w:cs="Calibri" w:eastAsia="Calibri" w:hAnsi="Calibri"/>
+          <w:b/>
+          <w:bCs/>
+        </w:rPr>
+        <w:t xml:space="preserve">If they do it anyway.</w:t>
+      </w:r>
+      <w:r>
+        <w:rPr>
+          <w:rFonts w:ascii="Calibri" w:cs="Calibri" w:eastAsia="Calibri" w:hAnsi="Calibri"/>
+        </w:rPr>
+        <w:t xml:space="preserve"> Run it short: the Bargain's pilot breaks off and runs for the far side of the planet, or surrenders and calls Rourke to say they have lost. Rourke is then alerted, so the wreck site in Scene 4 is on guard (DM-2 to Stealth). Or make it a trap: her gunner holds fire until the party is committed, and the Scene 6 return strike arrives early.</w:t>
       </w:r>
     </w:p>
     <w:p>
@@ -3283,7 +3367,7 @@
         <w:rPr>
           <w:rFonts w:ascii="Calibri" w:cs="Calibri" w:eastAsia="Calibri" w:hAnsi="Calibri"/>
         </w:rPr>
-        <w:t xml:space="preserve"> The wreck lies on the floor of a long basin, with a ridge on the north and a dry riverbed on the east. The rival camp is on the near side of the ridge. Give the players a rough map (see the sketch below) and let them choose. A good player will look at what each choice costs.</w:t>
+        <w:t xml:space="preserve"> The wreck lies on the floor of a long basin, with a ridge on the north and a dry riverbed on the east. The rival crew has set up beside the wreck itself, with their sled and gear against the hull. Give the players a rough map (see the sketch below) and let them choose. A good player will look at what each choice costs.</w:t>
       </w:r>
     </w:p>
     <w:tbl>
@@ -3467,7 +3551,7 @@
               <w:rPr>
                 <w:rFonts w:ascii="Calibri" w:cs="Calibri" w:eastAsia="Calibri" w:hAnsi="Calibri"/>
               </w:rPr>
-              <w:t xml:space="preserve">In plain sight of the rival camp. Pilot (Difficult, 10+) to land quietly; failure alerts the rivals and removes the chance of a stealth approach.</w:t>
+              <w:t xml:space="preserve">In plain sight of the rival crew at the wreck. Pilot (Difficult, 10+) to land quietly; failure alerts the rivals and removes the chance of a stealth approach.</w:t>
             </w:r>
           </w:p>
         </w:tc>
@@ -3522,7 +3606,7 @@
               <w:rPr>
                 <w:rFonts w:ascii="Calibri" w:cs="Calibri" w:eastAsia="Calibri" w:hAnsi="Calibri"/>
               </w:rPr>
-              <w:t xml:space="preserve">Hidden from the camp. The ridge blocks sensors.</w:t>
+              <w:t xml:space="preserve">Hidden from the wreck site. The ridge blocks sensors.</w:t>
             </w:r>
           </w:p>
         </w:tc>
@@ -3652,7 +3736,7 @@
           <w:i/>
           <w:iCs/>
         </w:rPr>
-        <w:t xml:space="preserve">The ship settles with a long sigh of thrusters. Beyond the viewport the landscape is the colour of old ash: grey dunes, black rock, a sky the colour of dishwater. Far out on the basin floor something catches the light, a long scar of torn earth and, at the end of it, a pale shape that used to be a ship. And a thin column of smoke rising from a camp on the far side.</w:t>
+        <w:t xml:space="preserve">The ship settles with a long sigh of thrusters. Beyond the viewport the landscape is the colour of old ash: grey dunes, black rock, a sky the colour of dishwater. Far out on the basin floor something catches the light, a long scar of torn earth and, at the end of it, a pale shape that used to be a ship. And beside it, a thin column of smoke rising from the rival crew's camp set against the hull.</w:t>
       </w:r>
     </w:p>
     <w:p>
@@ -3782,7 +3866,7 @@
         <w:rPr>
           <w:rFonts w:ascii="Calibri" w:cs="Calibri" w:eastAsia="Calibri" w:hAnsi="Calibri"/>
         </w:rPr>
-        <w:t xml:space="preserve">The rival crew is led by Captain Dessa Rourke, a tough, practical salvager who has done this a hundred times. She has five crew with her at the wreck. Two are working on the cargo hatch with cutting gear. Two are on guard. One stays at the camp with the freight sled. The ship's pilot and gunner remain in orbit aboard the Scrapper's Dream.</w:t>
+        <w:t xml:space="preserve">The rival crew is led by Captain Dessa Rourke, a tough, practical salvager who has done this a hundred times. She has five crew with her at the wreck. Two are working on the cargo hatch with cutting gear. Two are on guard. One stays with the freight sled and the camp gear parked against the hull. The ship's pilot and gunner remain in orbit aboard the Hard Bargain.</w:t>
       </w:r>
     </w:p>
     <w:p>
@@ -4135,7 +4219,7 @@
               <w:rPr>
                 <w:rFonts w:ascii="Calibri" w:cs="Calibri" w:eastAsia="Calibri" w:hAnsi="Calibri"/>
               </w:rPr>
-              <w:t xml:space="preserve">Personal combat. The wreck and camp offer plenty of cover: crates, the sled, dunes, the hull plates.</w:t>
+              <w:t xml:space="preserve">Personal combat. The wreck and the rivals' camp beside it offer plenty of cover: crates, the sled, dunes, the hull plates.</w:t>
             </w:r>
           </w:p>
         </w:tc>
@@ -5521,7 +5605,7 @@
         <w:rPr>
           <w:rFonts w:ascii="Calibri" w:cs="Calibri" w:eastAsia="Calibri" w:hAnsi="Calibri"/>
         </w:rPr>
-        <w:t xml:space="preserve"> For a party of three or fewer, remove Hask and Imre. For five or six, add a second guard identical to Pell, and have the Scrapper's Dream's gunner threaten to fire on the party's ship from orbit; the sensor operator can jam him with a successful opposed Electronics (comms) check.</w:t>
+        <w:t xml:space="preserve"> For a party of three or fewer, remove Hask and Imre. For five or six, add a second guard identical to Pell, and have the Hard Bargain's gunner threaten to fire on the party's ship from orbit; the sensor operator can jam him with a successful opposed Electronics (comms) check.</w:t>
       </w:r>
     </w:p>
     <w:p>
@@ -7169,7 +7253,7 @@
         <w:rPr>
           <w:rFonts w:ascii="Calibri" w:cs="Calibri" w:eastAsia="Calibri" w:hAnsi="Calibri"/>
         </w:rPr>
-        <w:t xml:space="preserve"> If any of the crew escaped, or if Rourke has been told the cargo is moving, a return strike arrives after about 4 hours of loading: three fresh salvagers from the Scrapper's Dream, using the Dream's landing craft. Use Hask's stat block for each.</w:t>
+        <w:t xml:space="preserve"> If any of the crew escaped, or if Rourke has been told the cargo is moving, a return strike arrives after about 4 hours of loading: three fresh salvagers from the Hard Bargain, using the Bargain's landing craft. Use Hask's stat block for each.</w:t>
       </w:r>
     </w:p>
     <w:p>
@@ -7319,7 +7403,7 @@
           <w:b/>
           <w:bCs/>
         </w:rPr>
-        <w:t xml:space="preserve">The Scrapper's Dream.</w:t>
+        <w:t xml:space="preserve">The Hard Bargain.</w:t>
       </w:r>
       <w:r>
         <w:rPr>
@@ -8068,7 +8152,7 @@
               <w:rPr>
                 <w:rFonts w:ascii="Calibri" w:cs="Calibri" w:eastAsia="Calibri" w:hAnsi="Calibri"/>
               </w:rPr>
-              <w:t xml:space="preserve">The Scrapper's Dream</w:t>
+              <w:t xml:space="preserve">The Hard Bargain</w:t>
             </w:r>
           </w:p>
         </w:tc>

</xml_diff>

<commit_message>
Scenario 2: wreck-site hex maps, map key appendix, Far Trader wreck
Co-Authored-By: Claude Sonnet 5.5 <noreply@anthropic.com>
</commit_message>
<xml_diff>
--- a/docs/scenarios/Scenario 2 - Dead Reckoning.docx
+++ b/docs/scenarios/Scenario 2 - Dead Reckoning.docx
@@ -5735,7 +5735,7 @@
         <w:rPr>
           <w:rFonts w:ascii="Calibri" w:cs="Calibri" w:eastAsia="Calibri" w:hAnsi="Calibri"/>
         </w:rPr>
-        <w:t xml:space="preserve">A Type-A Free Trader, 200 tons, lying on her port side where she slid to a stop. The bow is crumpled, the engineering section is torn open, and the hull is a tangle of buckled plates. Every compartment is dark and cold. The air inside has leaked away, so a respirator is not enough: anyone entering needs a vacc suit or a sealed environment suit, or must hold their breath. Use this to prompt the question "how long can we stay inside?".</w:t>
+        <w:t xml:space="preserve">A Type-A2 Far Trader, 200 tons, lying belly-down where she slid to a stop, her crumpled bow against the foot of the ridge. The west engine pod is torn open and the hull is a tangle of buckled plates. Every compartment is dark and cold. The air inside has leaked away, so a respirator is not enough: anyone entering needs a vacc suit or a sealed environment suit, or must hold their breath. Use this to prompt the question "how long can we stay inside?".</w:t>
       </w:r>
     </w:p>
     <w:tbl>
@@ -5840,7 +5840,7 @@
               <w:rPr>
                 <w:rFonts w:ascii="Calibri" w:cs="Calibri" w:eastAsia="Calibri" w:hAnsi="Calibri"/>
               </w:rPr>
-              <w:t xml:space="preserve">The breach (engineering)</w:t>
+              <w:t xml:space="preserve">The west pod breach (engineering)</w:t>
             </w:r>
           </w:p>
         </w:tc>
@@ -5865,7 +5865,7 @@
               <w:rPr>
                 <w:rFonts w:ascii="Calibri" w:cs="Calibri" w:eastAsia="Calibri" w:hAnsi="Calibri"/>
               </w:rPr>
-              <w:t xml:space="preserve">The easiest way in. A torn hull plate leaves a 2 m gap. Sharp edges: Athletics (dexterity) Routine (6+) to enter without damage, or 1D damage. Fuel residue coats the floor; any spark has a 1 in 6 chance of igniting it (2D damage in a 3 m radius).</w:t>
+              <w:t xml:space="preserve">The easiest way in, and hidden from the rivals' camp. A torn hull plate leaves a 2 m gap into the power plant and drive compartment, which has a door into the hold. Sharp edges: Athletics (dexterity) Routine (6+) to enter without damage, or 1D damage. Fuel residue coats the floor; any spark has a 1 in 6 chance of igniting it (2D damage in a 3 m radius).</w:t>
             </w:r>
           </w:p>
         </w:tc>
@@ -5895,7 +5895,7 @@
               <w:rPr>
                 <w:rFonts w:ascii="Calibri" w:cs="Calibri" w:eastAsia="Calibri" w:hAnsi="Calibri"/>
               </w:rPr>
-              <w:t xml:space="preserve">The main corridor</w:t>
+              <w:t xml:space="preserve">The staterooms and corridor</w:t>
             </w:r>
           </w:p>
         </w:tc>
@@ -5920,7 +5920,7 @@
               <w:rPr>
                 <w:rFonts w:ascii="Calibri" w:cs="Calibri" w:eastAsia="Calibri" w:hAnsi="Calibri"/>
               </w:rPr>
-              <w:t xml:space="preserve">Tilted 90 degrees, so it works like a vertical shaft. Climbing requires Athletics (dexterity) 6+ in 0.4 G. A failure is a fall of 2D metres; in this gravity that is 1D damage.</w:t>
+              <w:t xml:space="preserve">Wrecked but passable. Buckled bulkheads and jammed stateroom doors run across the ship between the hold and the bridge. Pushing through the debris is an Athletics (dexterity) Routine (6+) check; a failure is 1D damage from sharp edges.</w:t>
             </w:r>
           </w:p>
         </w:tc>
@@ -6005,7 +6005,7 @@
               <w:rPr>
                 <w:rFonts w:ascii="Calibri" w:cs="Calibri" w:eastAsia="Calibri" w:hAnsi="Calibri"/>
               </w:rPr>
-              <w:t xml:space="preserve">The cargo hold (aft)</w:t>
+              <w:t xml:space="preserve">The cargo hold (amidships)</w:t>
             </w:r>
           </w:p>
         </w:tc>
@@ -6030,7 +6030,7 @@
               <w:rPr>
                 <w:rFonts w:ascii="Calibri" w:cs="Calibri" w:eastAsia="Calibri" w:hAnsi="Calibri"/>
               </w:rPr>
-              <w:t xml:space="preserve">A sealed double door, twice the thickness of the rest of the bulkhead. The door control panel is on the corridor side. The rival crew has cut a gouge halfway through the outer plate but stopped when the torch failed. See below.</w:t>
+              <w:t xml:space="preserve">The hold fills the middle of the ship. Every way into it ends at a sealed door: the inner doors of the two cargo airlocks, the corridor bulkhead and the power plant door. The rivals have cut halfway through the outer plate of the east cargo hatch and stopped when the torch failed, so the east airlock's inner door is the one the party will most likely face. See below.</w:t>
             </w:r>
           </w:p>
         </w:tc>
@@ -8232,7 +8232,7 @@
               <w:rPr>
                 <w:rFonts w:ascii="Calibri" w:cs="Calibri" w:eastAsia="Calibri" w:hAnsi="Calibri"/>
               </w:rPr>
-              <w:t xml:space="preserve">The wreck. Type-A Free Trader, 200 tons. Her captain, Anselm Calloway, shut down the drive deliberately after discovering the saboteur; he did not survive the landing.</w:t>
+              <w:t xml:space="preserve">The wreck. Type-A2 Far Trader, 200 tons. Her captain, Anselm Calloway, shut down the drive deliberately after discovering the saboteur; he did not survive the landing.</w:t>
             </w:r>
           </w:p>
         </w:tc>
@@ -8448,6 +8448,1560 @@
           <w:rFonts w:ascii="Calibri" w:cs="Calibri" w:eastAsia="Calibri" w:hAnsi="Calibri"/>
         </w:rPr>
         <w:t xml:space="preserve">Fuel: a successful fuel-skimming run saves the Cr20,000 advance.</w:t>
+      </w:r>
+    </w:p>
+    <w:p>
+      <w:r>
+        <w:br w:type="page"/>
+      </w:r>
+    </w:p>
+    <w:p>
+      <w:pPr>
+        <w:pStyle w:val="Heading1"/>
+        <w:spacing w:after="140" w:before="360"/>
+      </w:pPr>
+      <w:r>
+        <w:rPr>
+          <w:rFonts w:ascii="Calibri" w:cs="Calibri" w:eastAsia="Calibri" w:hAnsi="Calibri"/>
+        </w:rPr>
+        <w:t xml:space="preserve">Appendix: Wreck site map key</w:t>
+      </w:r>
+    </w:p>
+    <w:p>
+      <w:pPr>
+        <w:spacing w:after="120"/>
+      </w:pPr>
+      <w:r>
+        <w:rPr>
+          <w:rFonts w:ascii="Calibri" w:cs="Calibri" w:eastAsia="Calibri" w:hAnsi="Calibri"/>
+        </w:rPr>
+        <w:t xml:space="preserve">Two hex maps cover Scenes 4 and 5. They are saved as SVG files in docs/scenarios/maps. Open one in a browser on the TV and go full-screen. Each is built for a 55" screen (about 47.9" by 27"), with hexes 1" across at 1.5 m per hex, so the map is roughly 72 m by 40 m. A 10-hex scale bar on the map should measure 8.7" on the TV; zoom the browser until it does. Each hex carries a small column.row label for calling out positions.</w:t>
+      </w:r>
+    </w:p>
+    <w:tbl>
+      <w:tblPr>
+        <w:tblW w:type="dxa" w:w="9360"/>
+        <w:tblBorders>
+          <w:top w:val="single" w:color="auto" w:sz="4"/>
+          <w:left w:val="single" w:color="auto" w:sz="4"/>
+          <w:bottom w:val="single" w:color="auto" w:sz="4"/>
+          <w:right w:val="single" w:color="auto" w:sz="4"/>
+          <w:insideH w:val="single" w:color="auto" w:sz="4"/>
+          <w:insideV w:val="single" w:color="auto" w:sz="4"/>
+        </w:tblBorders>
+      </w:tblPr>
+      <w:tblGrid>
+        <w:gridCol w:w="3400"/>
+        <w:gridCol w:w="5960"/>
+      </w:tblGrid>
+      <w:tr>
+        <w:trPr>
+          <w:tblHeader/>
+        </w:trPr>
+        <w:tc>
+          <w:tcPr>
+            <w:tcW w:type="dxa" w:w="3400"/>
+            <w:tcBorders>
+              <w:top w:val="single" w:color="B8C4C8" w:sz="4"/>
+              <w:left w:val="single" w:color="B8C4C8" w:sz="4"/>
+              <w:bottom w:val="single" w:color="B8C4C8" w:sz="4"/>
+              <w:right w:val="single" w:color="B8C4C8" w:sz="4"/>
+            </w:tcBorders>
+            <w:shd w:fill="D5E8EC" w:val="clear"/>
+            <w:tcMar>
+              <w:top w:type="dxa" w:w="60"/>
+              <w:left w:type="dxa" w:w="100"/>
+              <w:bottom w:type="dxa" w:w="60"/>
+              <w:right w:type="dxa" w:w="100"/>
+            </w:tcMar>
+          </w:tcPr>
+          <w:p>
+            <w:r>
+              <w:rPr>
+                <w:rFonts w:ascii="Calibri" w:cs="Calibri" w:eastAsia="Calibri" w:hAnsi="Calibri"/>
+                <w:b/>
+                <w:bCs/>
+              </w:rPr>
+              <w:t xml:space="preserve">Map</w:t>
+            </w:r>
+          </w:p>
+        </w:tc>
+        <w:tc>
+          <w:tcPr>
+            <w:tcW w:type="dxa" w:w="5960"/>
+            <w:tcBorders>
+              <w:top w:val="single" w:color="B8C4C8" w:sz="4"/>
+              <w:left w:val="single" w:color="B8C4C8" w:sz="4"/>
+              <w:bottom w:val="single" w:color="B8C4C8" w:sz="4"/>
+              <w:right w:val="single" w:color="B8C4C8" w:sz="4"/>
+            </w:tcBorders>
+            <w:shd w:fill="D5E8EC" w:val="clear"/>
+            <w:tcMar>
+              <w:top w:type="dxa" w:w="60"/>
+              <w:left w:type="dxa" w:w="100"/>
+              <w:bottom w:type="dxa" w:w="60"/>
+              <w:right w:type="dxa" w:w="100"/>
+            </w:tcMar>
+          </w:tcPr>
+          <w:p>
+            <w:r>
+              <w:rPr>
+                <w:rFonts w:ascii="Calibri" w:cs="Calibri" w:eastAsia="Calibri" w:hAnsi="Calibri"/>
+                <w:b/>
+                <w:bCs/>
+              </w:rPr>
+              <w:t xml:space="preserve">Layout</w:t>
+            </w:r>
+          </w:p>
+        </w:tc>
+      </w:tr>
+      <w:tr>
+        <w:trPr>
+          <w:tblHeader w:val="off"/>
+        </w:trPr>
+        <w:tc>
+          <w:tcPr>
+            <w:tcW w:type="dxa" w:w="3400"/>
+            <w:tcBorders>
+              <w:top w:val="single" w:color="B8C4C8" w:sz="4"/>
+              <w:left w:val="single" w:color="B8C4C8" w:sz="4"/>
+              <w:bottom w:val="single" w:color="B8C4C8" w:sz="4"/>
+              <w:right w:val="single" w:color="B8C4C8" w:sz="4"/>
+            </w:tcBorders>
+            <w:tcMar>
+              <w:top w:type="dxa" w:w="60"/>
+              <w:left w:type="dxa" w:w="100"/>
+              <w:bottom w:type="dxa" w:w="60"/>
+              <w:right w:type="dxa" w:w="100"/>
+            </w:tcMar>
+          </w:tcPr>
+          <w:p>
+            <w:r>
+              <w:rPr>
+                <w:rFonts w:ascii="Calibri" w:cs="Calibri" w:eastAsia="Calibri" w:hAnsi="Calibri"/>
+              </w:rPr>
+              <w:t xml:space="preserve">Scenario 2 - Wreck Site</w:t>
+            </w:r>
+          </w:p>
+        </w:tc>
+        <w:tc>
+          <w:tcPr>
+            <w:tcW w:type="dxa" w:w="5960"/>
+            <w:tcBorders>
+              <w:top w:val="single" w:color="B8C4C8" w:sz="4"/>
+              <w:left w:val="single" w:color="B8C4C8" w:sz="4"/>
+              <w:bottom w:val="single" w:color="B8C4C8" w:sz="4"/>
+              <w:right w:val="single" w:color="B8C4C8" w:sz="4"/>
+            </w:tcBorders>
+            <w:tcMar>
+              <w:top w:type="dxa" w:w="60"/>
+              <w:left w:type="dxa" w:w="100"/>
+              <w:bottom w:type="dxa" w:w="60"/>
+              <w:right w:type="dxa" w:w="100"/>
+            </w:tcMar>
+          </w:tcPr>
+          <w:p>
+            <w:r>
+              <w:rPr>
+                <w:rFonts w:ascii="Calibri" w:cs="Calibri" w:eastAsia="Calibri" w:hAnsi="Calibri"/>
+              </w:rPr>
+              <w:t xml:space="preserve">The Calloway's Pride lies nose-east across the middle of the map, with the rivals' camp south of the east-side cargo hatch.</w:t>
+            </w:r>
+          </w:p>
+        </w:tc>
+      </w:tr>
+      <w:tr>
+        <w:trPr>
+          <w:tblHeader w:val="off"/>
+        </w:trPr>
+        <w:tc>
+          <w:tcPr>
+            <w:tcW w:type="dxa" w:w="3400"/>
+            <w:tcBorders>
+              <w:top w:val="single" w:color="B8C4C8" w:sz="4"/>
+              <w:left w:val="single" w:color="B8C4C8" w:sz="4"/>
+              <w:bottom w:val="single" w:color="B8C4C8" w:sz="4"/>
+              <w:right w:val="single" w:color="B8C4C8" w:sz="4"/>
+            </w:tcBorders>
+            <w:tcMar>
+              <w:top w:type="dxa" w:w="60"/>
+              <w:left w:type="dxa" w:w="100"/>
+              <w:bottom w:type="dxa" w:w="60"/>
+              <w:right w:type="dxa" w:w="100"/>
+            </w:tcMar>
+          </w:tcPr>
+          <w:p>
+            <w:r>
+              <w:rPr>
+                <w:rFonts w:ascii="Calibri" w:cs="Calibri" w:eastAsia="Calibri" w:hAnsi="Calibri"/>
+              </w:rPr>
+              <w:t xml:space="preserve">Scenario 2 - Wreck Site (angled, west edge)</w:t>
+            </w:r>
+          </w:p>
+        </w:tc>
+        <w:tc>
+          <w:tcPr>
+            <w:tcW w:type="dxa" w:w="5960"/>
+            <w:tcBorders>
+              <w:top w:val="single" w:color="B8C4C8" w:sz="4"/>
+              <w:left w:val="single" w:color="B8C4C8" w:sz="4"/>
+              <w:bottom w:val="single" w:color="B8C4C8" w:sz="4"/>
+              <w:right w:val="single" w:color="B8C4C8" w:sz="4"/>
+            </w:tcBorders>
+            <w:tcMar>
+              <w:top w:type="dxa" w:w="60"/>
+              <w:left w:type="dxa" w:w="100"/>
+              <w:bottom w:type="dxa" w:w="60"/>
+              <w:right w:type="dxa" w:w="100"/>
+            </w:tcMar>
+          </w:tcPr>
+          <w:p>
+            <w:r>
+              <w:rPr>
+                <w:rFonts w:ascii="Calibri" w:cs="Calibri" w:eastAsia="Calibri" w:hAnsi="Calibri"/>
+              </w:rPr>
+              <w:t xml:space="preserve">The ship sits against the left edge, her nose pointing about 20 degrees east of north against the foot of the ridge. The cargo hatch and the camp face east, with open ground to the right for the party's approach.</w:t>
+            </w:r>
+          </w:p>
+        </w:tc>
+      </w:tr>
+    </w:tbl>
+    <w:p>
+      <w:pPr>
+        <w:spacing w:after="80"/>
+      </w:pPr>
+    </w:p>
+    <w:p>
+      <w:pPr>
+        <w:pStyle w:val="Heading3"/>
+        <w:spacing w:after="80" w:before="160"/>
+      </w:pPr>
+      <w:r>
+        <w:rPr>
+          <w:rFonts w:ascii="Calibri" w:cs="Calibri" w:eastAsia="Calibri" w:hAnsi="Calibri"/>
+        </w:rPr>
+        <w:t xml:space="preserve">Rival start positions</w:t>
+      </w:r>
+    </w:p>
+    <w:tbl>
+      <w:tblPr>
+        <w:tblW w:type="dxa" w:w="9360"/>
+        <w:tblBorders>
+          <w:top w:val="single" w:color="auto" w:sz="4"/>
+          <w:left w:val="single" w:color="auto" w:sz="4"/>
+          <w:bottom w:val="single" w:color="auto" w:sz="4"/>
+          <w:right w:val="single" w:color="auto" w:sz="4"/>
+          <w:insideH w:val="single" w:color="auto" w:sz="4"/>
+          <w:insideV w:val="single" w:color="auto" w:sz="4"/>
+        </w:tblBorders>
+      </w:tblPr>
+      <w:tblGrid>
+        <w:gridCol w:w="1000"/>
+        <w:gridCol w:w="3200"/>
+        <w:gridCol w:w="5160"/>
+      </w:tblGrid>
+      <w:tr>
+        <w:trPr>
+          <w:tblHeader/>
+        </w:trPr>
+        <w:tc>
+          <w:tcPr>
+            <w:tcW w:type="dxa" w:w="1000"/>
+            <w:tcBorders>
+              <w:top w:val="single" w:color="B8C4C8" w:sz="4"/>
+              <w:left w:val="single" w:color="B8C4C8" w:sz="4"/>
+              <w:bottom w:val="single" w:color="B8C4C8" w:sz="4"/>
+              <w:right w:val="single" w:color="B8C4C8" w:sz="4"/>
+            </w:tcBorders>
+            <w:shd w:fill="D5E8EC" w:val="clear"/>
+            <w:tcMar>
+              <w:top w:type="dxa" w:w="60"/>
+              <w:left w:type="dxa" w:w="100"/>
+              <w:bottom w:type="dxa" w:w="60"/>
+              <w:right w:type="dxa" w:w="100"/>
+            </w:tcMar>
+          </w:tcPr>
+          <w:p>
+            <w:r>
+              <w:rPr>
+                <w:rFonts w:ascii="Calibri" w:cs="Calibri" w:eastAsia="Calibri" w:hAnsi="Calibri"/>
+                <w:b/>
+                <w:bCs/>
+              </w:rPr>
+              <w:t xml:space="preserve">Token</w:t>
+            </w:r>
+          </w:p>
+        </w:tc>
+        <w:tc>
+          <w:tcPr>
+            <w:tcW w:type="dxa" w:w="3200"/>
+            <w:tcBorders>
+              <w:top w:val="single" w:color="B8C4C8" w:sz="4"/>
+              <w:left w:val="single" w:color="B8C4C8" w:sz="4"/>
+              <w:bottom w:val="single" w:color="B8C4C8" w:sz="4"/>
+              <w:right w:val="single" w:color="B8C4C8" w:sz="4"/>
+            </w:tcBorders>
+            <w:shd w:fill="D5E8EC" w:val="clear"/>
+            <w:tcMar>
+              <w:top w:type="dxa" w:w="60"/>
+              <w:left w:type="dxa" w:w="100"/>
+              <w:bottom w:type="dxa" w:w="60"/>
+              <w:right w:type="dxa" w:w="100"/>
+            </w:tcMar>
+          </w:tcPr>
+          <w:p>
+            <w:r>
+              <w:rPr>
+                <w:rFonts w:ascii="Calibri" w:cs="Calibri" w:eastAsia="Calibri" w:hAnsi="Calibri"/>
+                <w:b/>
+                <w:bCs/>
+              </w:rPr>
+              <w:t xml:space="preserve">Who</w:t>
+            </w:r>
+          </w:p>
+        </w:tc>
+        <w:tc>
+          <w:tcPr>
+            <w:tcW w:type="dxa" w:w="5160"/>
+            <w:tcBorders>
+              <w:top w:val="single" w:color="B8C4C8" w:sz="4"/>
+              <w:left w:val="single" w:color="B8C4C8" w:sz="4"/>
+              <w:bottom w:val="single" w:color="B8C4C8" w:sz="4"/>
+              <w:right w:val="single" w:color="B8C4C8" w:sz="4"/>
+            </w:tcBorders>
+            <w:shd w:fill="D5E8EC" w:val="clear"/>
+            <w:tcMar>
+              <w:top w:type="dxa" w:w="60"/>
+              <w:left w:type="dxa" w:w="100"/>
+              <w:bottom w:type="dxa" w:w="60"/>
+              <w:right w:type="dxa" w:w="100"/>
+            </w:tcMar>
+          </w:tcPr>
+          <w:p>
+            <w:r>
+              <w:rPr>
+                <w:rFonts w:ascii="Calibri" w:cs="Calibri" w:eastAsia="Calibri" w:hAnsi="Calibri"/>
+                <w:b/>
+                <w:bCs/>
+              </w:rPr>
+              <w:t xml:space="preserve">Notes</w:t>
+            </w:r>
+          </w:p>
+        </w:tc>
+      </w:tr>
+      <w:tr>
+        <w:trPr>
+          <w:tblHeader w:val="off"/>
+        </w:trPr>
+        <w:tc>
+          <w:tcPr>
+            <w:tcW w:type="dxa" w:w="1000"/>
+            <w:tcBorders>
+              <w:top w:val="single" w:color="B8C4C8" w:sz="4"/>
+              <w:left w:val="single" w:color="B8C4C8" w:sz="4"/>
+              <w:bottom w:val="single" w:color="B8C4C8" w:sz="4"/>
+              <w:right w:val="single" w:color="B8C4C8" w:sz="4"/>
+            </w:tcBorders>
+            <w:tcMar>
+              <w:top w:type="dxa" w:w="60"/>
+              <w:left w:type="dxa" w:w="100"/>
+              <w:bottom w:type="dxa" w:w="60"/>
+              <w:right w:type="dxa" w:w="100"/>
+            </w:tcMar>
+          </w:tcPr>
+          <w:p>
+            <w:r>
+              <w:rPr>
+                <w:rFonts w:ascii="Calibri" w:cs="Calibri" w:eastAsia="Calibri" w:hAnsi="Calibri"/>
+              </w:rPr>
+              <w:t xml:space="preserve">R</w:t>
+            </w:r>
+          </w:p>
+        </w:tc>
+        <w:tc>
+          <w:tcPr>
+            <w:tcW w:type="dxa" w:w="3200"/>
+            <w:tcBorders>
+              <w:top w:val="single" w:color="B8C4C8" w:sz="4"/>
+              <w:left w:val="single" w:color="B8C4C8" w:sz="4"/>
+              <w:bottom w:val="single" w:color="B8C4C8" w:sz="4"/>
+              <w:right w:val="single" w:color="B8C4C8" w:sz="4"/>
+            </w:tcBorders>
+            <w:tcMar>
+              <w:top w:type="dxa" w:w="60"/>
+              <w:left w:type="dxa" w:w="100"/>
+              <w:bottom w:type="dxa" w:w="60"/>
+              <w:right w:type="dxa" w:w="100"/>
+            </w:tcMar>
+          </w:tcPr>
+          <w:p>
+            <w:r>
+              <w:rPr>
+                <w:rFonts w:ascii="Calibri" w:cs="Calibri" w:eastAsia="Calibri" w:hAnsi="Calibri"/>
+              </w:rPr>
+              <w:t xml:space="preserve">Captain Dessa Rourke</w:t>
+            </w:r>
+          </w:p>
+        </w:tc>
+        <w:tc>
+          <w:tcPr>
+            <w:tcW w:type="dxa" w:w="5160"/>
+            <w:tcBorders>
+              <w:top w:val="single" w:color="B8C4C8" w:sz="4"/>
+              <w:left w:val="single" w:color="B8C4C8" w:sz="4"/>
+              <w:bottom w:val="single" w:color="B8C4C8" w:sz="4"/>
+              <w:right w:val="single" w:color="B8C4C8" w:sz="4"/>
+            </w:tcBorders>
+            <w:tcMar>
+              <w:top w:type="dxa" w:w="60"/>
+              <w:left w:type="dxa" w:w="100"/>
+              <w:bottom w:type="dxa" w:w="60"/>
+              <w:right w:type="dxa" w:w="100"/>
+            </w:tcMar>
+          </w:tcPr>
+          <w:p>
+            <w:r>
+              <w:rPr>
+                <w:rFonts w:ascii="Calibri" w:cs="Calibri" w:eastAsia="Calibri" w:hAnsi="Calibri"/>
+              </w:rPr>
+              <w:t xml:space="preserve">Near the sled, directing the work. Carbine, partial combat armour.</w:t>
+            </w:r>
+          </w:p>
+        </w:tc>
+      </w:tr>
+      <w:tr>
+        <w:trPr>
+          <w:tblHeader w:val="off"/>
+        </w:trPr>
+        <w:tc>
+          <w:tcPr>
+            <w:tcW w:type="dxa" w:w="1000"/>
+            <w:tcBorders>
+              <w:top w:val="single" w:color="B8C4C8" w:sz="4"/>
+              <w:left w:val="single" w:color="B8C4C8" w:sz="4"/>
+              <w:bottom w:val="single" w:color="B8C4C8" w:sz="4"/>
+              <w:right w:val="single" w:color="B8C4C8" w:sz="4"/>
+            </w:tcBorders>
+            <w:tcMar>
+              <w:top w:type="dxa" w:w="60"/>
+              <w:left w:type="dxa" w:w="100"/>
+              <w:bottom w:type="dxa" w:w="60"/>
+              <w:right w:type="dxa" w:w="100"/>
+            </w:tcMar>
+          </w:tcPr>
+          <w:p>
+            <w:r>
+              <w:rPr>
+                <w:rFonts w:ascii="Calibri" w:cs="Calibri" w:eastAsia="Calibri" w:hAnsi="Calibri"/>
+              </w:rPr>
+              <w:t xml:space="preserve">H</w:t>
+            </w:r>
+          </w:p>
+        </w:tc>
+        <w:tc>
+          <w:tcPr>
+            <w:tcW w:type="dxa" w:w="3200"/>
+            <w:tcBorders>
+              <w:top w:val="single" w:color="B8C4C8" w:sz="4"/>
+              <w:left w:val="single" w:color="B8C4C8" w:sz="4"/>
+              <w:bottom w:val="single" w:color="B8C4C8" w:sz="4"/>
+              <w:right w:val="single" w:color="B8C4C8" w:sz="4"/>
+            </w:tcBorders>
+            <w:tcMar>
+              <w:top w:type="dxa" w:w="60"/>
+              <w:left w:type="dxa" w:w="100"/>
+              <w:bottom w:type="dxa" w:w="60"/>
+              <w:right w:type="dxa" w:w="100"/>
+            </w:tcMar>
+          </w:tcPr>
+          <w:p>
+            <w:r>
+              <w:rPr>
+                <w:rFonts w:ascii="Calibri" w:cs="Calibri" w:eastAsia="Calibri" w:hAnsi="Calibri"/>
+              </w:rPr>
+              <w:t xml:space="preserve">Hask, shotgun guard</w:t>
+            </w:r>
+          </w:p>
+        </w:tc>
+        <w:tc>
+          <w:tcPr>
+            <w:tcW w:type="dxa" w:w="5160"/>
+            <w:tcBorders>
+              <w:top w:val="single" w:color="B8C4C8" w:sz="4"/>
+              <w:left w:val="single" w:color="B8C4C8" w:sz="4"/>
+              <w:bottom w:val="single" w:color="B8C4C8" w:sz="4"/>
+              <w:right w:val="single" w:color="B8C4C8" w:sz="4"/>
+            </w:tcBorders>
+            <w:tcMar>
+              <w:top w:type="dxa" w:w="60"/>
+              <w:left w:type="dxa" w:w="100"/>
+              <w:bottom w:type="dxa" w:w="60"/>
+              <w:right w:type="dxa" w:w="100"/>
+            </w:tcMar>
+          </w:tcPr>
+          <w:p>
+            <w:r>
+              <w:rPr>
+                <w:rFonts w:ascii="Calibri" w:cs="Calibri" w:eastAsia="Calibri" w:hAnsi="Calibri"/>
+              </w:rPr>
+              <w:t xml:space="preserve">On the camp edge, watching the open approach.</w:t>
+            </w:r>
+          </w:p>
+        </w:tc>
+      </w:tr>
+      <w:tr>
+        <w:trPr>
+          <w:tblHeader w:val="off"/>
+        </w:trPr>
+        <w:tc>
+          <w:tcPr>
+            <w:tcW w:type="dxa" w:w="1000"/>
+            <w:tcBorders>
+              <w:top w:val="single" w:color="B8C4C8" w:sz="4"/>
+              <w:left w:val="single" w:color="B8C4C8" w:sz="4"/>
+              <w:bottom w:val="single" w:color="B8C4C8" w:sz="4"/>
+              <w:right w:val="single" w:color="B8C4C8" w:sz="4"/>
+            </w:tcBorders>
+            <w:tcMar>
+              <w:top w:type="dxa" w:w="60"/>
+              <w:left w:type="dxa" w:w="100"/>
+              <w:bottom w:type="dxa" w:w="60"/>
+              <w:right w:type="dxa" w:w="100"/>
+            </w:tcMar>
+          </w:tcPr>
+          <w:p>
+            <w:r>
+              <w:rPr>
+                <w:rFonts w:ascii="Calibri" w:cs="Calibri" w:eastAsia="Calibri" w:hAnsi="Calibri"/>
+              </w:rPr>
+              <w:t xml:space="preserve">P</w:t>
+            </w:r>
+          </w:p>
+        </w:tc>
+        <w:tc>
+          <w:tcPr>
+            <w:tcW w:type="dxa" w:w="3200"/>
+            <w:tcBorders>
+              <w:top w:val="single" w:color="B8C4C8" w:sz="4"/>
+              <w:left w:val="single" w:color="B8C4C8" w:sz="4"/>
+              <w:bottom w:val="single" w:color="B8C4C8" w:sz="4"/>
+              <w:right w:val="single" w:color="B8C4C8" w:sz="4"/>
+            </w:tcBorders>
+            <w:tcMar>
+              <w:top w:type="dxa" w:w="60"/>
+              <w:left w:type="dxa" w:w="100"/>
+              <w:bottom w:type="dxa" w:w="60"/>
+              <w:right w:type="dxa" w:w="100"/>
+            </w:tcMar>
+          </w:tcPr>
+          <w:p>
+            <w:r>
+              <w:rPr>
+                <w:rFonts w:ascii="Calibri" w:cs="Calibri" w:eastAsia="Calibri" w:hAnsi="Calibri"/>
+              </w:rPr>
+              <w:t xml:space="preserve">Pell, quick guard</w:t>
+            </w:r>
+          </w:p>
+        </w:tc>
+        <w:tc>
+          <w:tcPr>
+            <w:tcW w:type="dxa" w:w="5160"/>
+            <w:tcBorders>
+              <w:top w:val="single" w:color="B8C4C8" w:sz="4"/>
+              <w:left w:val="single" w:color="B8C4C8" w:sz="4"/>
+              <w:bottom w:val="single" w:color="B8C4C8" w:sz="4"/>
+              <w:right w:val="single" w:color="B8C4C8" w:sz="4"/>
+            </w:tcBorders>
+            <w:tcMar>
+              <w:top w:type="dxa" w:w="60"/>
+              <w:left w:type="dxa" w:w="100"/>
+              <w:bottom w:type="dxa" w:w="60"/>
+              <w:right w:type="dxa" w:w="100"/>
+            </w:tcMar>
+          </w:tcPr>
+          <w:p>
+            <w:r>
+              <w:rPr>
+                <w:rFonts w:ascii="Calibri" w:cs="Calibri" w:eastAsia="Calibri" w:hAnsi="Calibri"/>
+              </w:rPr>
+              <w:t xml:space="preserve">Away from the camp, covering the flank near the stern.</w:t>
+            </w:r>
+          </w:p>
+        </w:tc>
+      </w:tr>
+      <w:tr>
+        <w:trPr>
+          <w:tblHeader w:val="off"/>
+        </w:trPr>
+        <w:tc>
+          <w:tcPr>
+            <w:tcW w:type="dxa" w:w="1000"/>
+            <w:tcBorders>
+              <w:top w:val="single" w:color="B8C4C8" w:sz="4"/>
+              <w:left w:val="single" w:color="B8C4C8" w:sz="4"/>
+              <w:bottom w:val="single" w:color="B8C4C8" w:sz="4"/>
+              <w:right w:val="single" w:color="B8C4C8" w:sz="4"/>
+            </w:tcBorders>
+            <w:tcMar>
+              <w:top w:type="dxa" w:w="60"/>
+              <w:left w:type="dxa" w:w="100"/>
+              <w:bottom w:type="dxa" w:w="60"/>
+              <w:right w:type="dxa" w:w="100"/>
+            </w:tcMar>
+          </w:tcPr>
+          <w:p>
+            <w:r>
+              <w:rPr>
+                <w:rFonts w:ascii="Calibri" w:cs="Calibri" w:eastAsia="Calibri" w:hAnsi="Calibri"/>
+              </w:rPr>
+              <w:t xml:space="preserve">T</w:t>
+            </w:r>
+          </w:p>
+        </w:tc>
+        <w:tc>
+          <w:tcPr>
+            <w:tcW w:type="dxa" w:w="3200"/>
+            <w:tcBorders>
+              <w:top w:val="single" w:color="B8C4C8" w:sz="4"/>
+              <w:left w:val="single" w:color="B8C4C8" w:sz="4"/>
+              <w:bottom w:val="single" w:color="B8C4C8" w:sz="4"/>
+              <w:right w:val="single" w:color="B8C4C8" w:sz="4"/>
+            </w:tcBorders>
+            <w:tcMar>
+              <w:top w:type="dxa" w:w="60"/>
+              <w:left w:type="dxa" w:w="100"/>
+              <w:bottom w:type="dxa" w:w="60"/>
+              <w:right w:type="dxa" w:w="100"/>
+            </w:tcMar>
+          </w:tcPr>
+          <w:p>
+            <w:r>
+              <w:rPr>
+                <w:rFonts w:ascii="Calibri" w:cs="Calibri" w:eastAsia="Calibri" w:hAnsi="Calibri"/>
+              </w:rPr>
+              <w:t xml:space="preserve">Tolliver, cutter</w:t>
+            </w:r>
+          </w:p>
+        </w:tc>
+        <w:tc>
+          <w:tcPr>
+            <w:tcW w:type="dxa" w:w="5160"/>
+            <w:tcBorders>
+              <w:top w:val="single" w:color="B8C4C8" w:sz="4"/>
+              <w:left w:val="single" w:color="B8C4C8" w:sz="4"/>
+              <w:bottom w:val="single" w:color="B8C4C8" w:sz="4"/>
+              <w:right w:val="single" w:color="B8C4C8" w:sz="4"/>
+            </w:tcBorders>
+            <w:tcMar>
+              <w:top w:type="dxa" w:w="60"/>
+              <w:left w:type="dxa" w:w="100"/>
+              <w:bottom w:type="dxa" w:w="60"/>
+              <w:right w:type="dxa" w:w="100"/>
+            </w:tcMar>
+          </w:tcPr>
+          <w:p>
+            <w:r>
+              <w:rPr>
+                <w:rFonts w:ascii="Calibri" w:cs="Calibri" w:eastAsia="Calibri" w:hAnsi="Calibri"/>
+              </w:rPr>
+              <w:t xml:space="preserve">At the cargo hatch with the cutting torch.</w:t>
+            </w:r>
+          </w:p>
+        </w:tc>
+      </w:tr>
+      <w:tr>
+        <w:trPr>
+          <w:tblHeader w:val="off"/>
+        </w:trPr>
+        <w:tc>
+          <w:tcPr>
+            <w:tcW w:type="dxa" w:w="1000"/>
+            <w:tcBorders>
+              <w:top w:val="single" w:color="B8C4C8" w:sz="4"/>
+              <w:left w:val="single" w:color="B8C4C8" w:sz="4"/>
+              <w:bottom w:val="single" w:color="B8C4C8" w:sz="4"/>
+              <w:right w:val="single" w:color="B8C4C8" w:sz="4"/>
+            </w:tcBorders>
+            <w:tcMar>
+              <w:top w:type="dxa" w:w="60"/>
+              <w:left w:type="dxa" w:w="100"/>
+              <w:bottom w:type="dxa" w:w="60"/>
+              <w:right w:type="dxa" w:w="100"/>
+            </w:tcMar>
+          </w:tcPr>
+          <w:p>
+            <w:r>
+              <w:rPr>
+                <w:rFonts w:ascii="Calibri" w:cs="Calibri" w:eastAsia="Calibri" w:hAnsi="Calibri"/>
+              </w:rPr>
+              <w:t xml:space="preserve">I</w:t>
+            </w:r>
+          </w:p>
+        </w:tc>
+        <w:tc>
+          <w:tcPr>
+            <w:tcW w:type="dxa" w:w="3200"/>
+            <w:tcBorders>
+              <w:top w:val="single" w:color="B8C4C8" w:sz="4"/>
+              <w:left w:val="single" w:color="B8C4C8" w:sz="4"/>
+              <w:bottom w:val="single" w:color="B8C4C8" w:sz="4"/>
+              <w:right w:val="single" w:color="B8C4C8" w:sz="4"/>
+            </w:tcBorders>
+            <w:tcMar>
+              <w:top w:type="dxa" w:w="60"/>
+              <w:left w:type="dxa" w:w="100"/>
+              <w:bottom w:type="dxa" w:w="60"/>
+              <w:right w:type="dxa" w:w="100"/>
+            </w:tcMar>
+          </w:tcPr>
+          <w:p>
+            <w:r>
+              <w:rPr>
+                <w:rFonts w:ascii="Calibri" w:cs="Calibri" w:eastAsia="Calibri" w:hAnsi="Calibri"/>
+              </w:rPr>
+              <w:t xml:space="preserve">Imre, cutter</w:t>
+            </w:r>
+          </w:p>
+        </w:tc>
+        <w:tc>
+          <w:tcPr>
+            <w:tcW w:type="dxa" w:w="5160"/>
+            <w:tcBorders>
+              <w:top w:val="single" w:color="B8C4C8" w:sz="4"/>
+              <w:left w:val="single" w:color="B8C4C8" w:sz="4"/>
+              <w:bottom w:val="single" w:color="B8C4C8" w:sz="4"/>
+              <w:right w:val="single" w:color="B8C4C8" w:sz="4"/>
+            </w:tcBorders>
+            <w:tcMar>
+              <w:top w:type="dxa" w:w="60"/>
+              <w:left w:type="dxa" w:w="100"/>
+              <w:bottom w:type="dxa" w:w="60"/>
+              <w:right w:type="dxa" w:w="100"/>
+            </w:tcMar>
+          </w:tcPr>
+          <w:p>
+            <w:r>
+              <w:rPr>
+                <w:rFonts w:ascii="Calibri" w:cs="Calibri" w:eastAsia="Calibri" w:hAnsi="Calibri"/>
+              </w:rPr>
+              <w:t xml:space="preserve">At the cargo hatch. Surrenders when Rourke is down.</w:t>
+            </w:r>
+          </w:p>
+        </w:tc>
+      </w:tr>
+      <w:tr>
+        <w:trPr>
+          <w:tblHeader w:val="off"/>
+        </w:trPr>
+        <w:tc>
+          <w:tcPr>
+            <w:tcW w:type="dxa" w:w="1000"/>
+            <w:tcBorders>
+              <w:top w:val="single" w:color="B8C4C8" w:sz="4"/>
+              <w:left w:val="single" w:color="B8C4C8" w:sz="4"/>
+              <w:bottom w:val="single" w:color="B8C4C8" w:sz="4"/>
+              <w:right w:val="single" w:color="B8C4C8" w:sz="4"/>
+            </w:tcBorders>
+            <w:tcMar>
+              <w:top w:type="dxa" w:w="60"/>
+              <w:left w:type="dxa" w:w="100"/>
+              <w:bottom w:type="dxa" w:w="60"/>
+              <w:right w:type="dxa" w:w="100"/>
+            </w:tcMar>
+          </w:tcPr>
+          <w:p>
+            <w:r>
+              <w:rPr>
+                <w:rFonts w:ascii="Calibri" w:cs="Calibri" w:eastAsia="Calibri" w:hAnsi="Calibri"/>
+              </w:rPr>
+              <w:t xml:space="preserve">M</w:t>
+            </w:r>
+          </w:p>
+        </w:tc>
+        <w:tc>
+          <w:tcPr>
+            <w:tcW w:type="dxa" w:w="3200"/>
+            <w:tcBorders>
+              <w:top w:val="single" w:color="B8C4C8" w:sz="4"/>
+              <w:left w:val="single" w:color="B8C4C8" w:sz="4"/>
+              <w:bottom w:val="single" w:color="B8C4C8" w:sz="4"/>
+              <w:right w:val="single" w:color="B8C4C8" w:sz="4"/>
+            </w:tcBorders>
+            <w:tcMar>
+              <w:top w:type="dxa" w:w="60"/>
+              <w:left w:type="dxa" w:w="100"/>
+              <w:bottom w:type="dxa" w:w="60"/>
+              <w:right w:type="dxa" w:w="100"/>
+            </w:tcMar>
+          </w:tcPr>
+          <w:p>
+            <w:r>
+              <w:rPr>
+                <w:rFonts w:ascii="Calibri" w:cs="Calibri" w:eastAsia="Calibri" w:hAnsi="Calibri"/>
+              </w:rPr>
+              <w:t xml:space="preserve">Mule, sled driver</w:t>
+            </w:r>
+          </w:p>
+        </w:tc>
+        <w:tc>
+          <w:tcPr>
+            <w:tcW w:type="dxa" w:w="5160"/>
+            <w:tcBorders>
+              <w:top w:val="single" w:color="B8C4C8" w:sz="4"/>
+              <w:left w:val="single" w:color="B8C4C8" w:sz="4"/>
+              <w:bottom w:val="single" w:color="B8C4C8" w:sz="4"/>
+              <w:right w:val="single" w:color="B8C4C8" w:sz="4"/>
+            </w:tcBorders>
+            <w:tcMar>
+              <w:top w:type="dxa" w:w="60"/>
+              <w:left w:type="dxa" w:w="100"/>
+              <w:bottom w:type="dxa" w:w="60"/>
+              <w:right w:type="dxa" w:w="100"/>
+            </w:tcMar>
+          </w:tcPr>
+          <w:p>
+            <w:r>
+              <w:rPr>
+                <w:rFonts w:ascii="Calibri" w:cs="Calibri" w:eastAsia="Calibri" w:hAnsi="Calibri"/>
+              </w:rPr>
+              <w:t xml:space="preserve">At the freight sled. Prefers to stay out of it.</w:t>
+            </w:r>
+          </w:p>
+        </w:tc>
+      </w:tr>
+    </w:tbl>
+    <w:p>
+      <w:pPr>
+        <w:spacing w:after="80"/>
+      </w:pPr>
+    </w:p>
+    <w:p>
+      <w:pPr>
+        <w:pStyle w:val="Heading3"/>
+        <w:spacing w:after="80" w:before="160"/>
+      </w:pPr>
+      <w:r>
+        <w:rPr>
+          <w:rFonts w:ascii="Calibri" w:cs="Calibri" w:eastAsia="Calibri" w:hAnsi="Calibri"/>
+        </w:rPr>
+        <w:t xml:space="preserve">Terrain and objects</w:t>
+      </w:r>
+    </w:p>
+    <w:tbl>
+      <w:tblPr>
+        <w:tblW w:type="dxa" w:w="9360"/>
+        <w:tblBorders>
+          <w:top w:val="single" w:color="auto" w:sz="4"/>
+          <w:left w:val="single" w:color="auto" w:sz="4"/>
+          <w:bottom w:val="single" w:color="auto" w:sz="4"/>
+          <w:right w:val="single" w:color="auto" w:sz="4"/>
+          <w:insideH w:val="single" w:color="auto" w:sz="4"/>
+          <w:insideV w:val="single" w:color="auto" w:sz="4"/>
+        </w:tblBorders>
+      </w:tblPr>
+      <w:tblGrid>
+        <w:gridCol w:w="3000"/>
+        <w:gridCol w:w="6360"/>
+      </w:tblGrid>
+      <w:tr>
+        <w:trPr>
+          <w:tblHeader/>
+        </w:trPr>
+        <w:tc>
+          <w:tcPr>
+            <w:tcW w:type="dxa" w:w="3000"/>
+            <w:tcBorders>
+              <w:top w:val="single" w:color="B8C4C8" w:sz="4"/>
+              <w:left w:val="single" w:color="B8C4C8" w:sz="4"/>
+              <w:bottom w:val="single" w:color="B8C4C8" w:sz="4"/>
+              <w:right w:val="single" w:color="B8C4C8" w:sz="4"/>
+            </w:tcBorders>
+            <w:shd w:fill="D5E8EC" w:val="clear"/>
+            <w:tcMar>
+              <w:top w:type="dxa" w:w="60"/>
+              <w:left w:type="dxa" w:w="100"/>
+              <w:bottom w:type="dxa" w:w="60"/>
+              <w:right w:type="dxa" w:w="100"/>
+            </w:tcMar>
+          </w:tcPr>
+          <w:p>
+            <w:r>
+              <w:rPr>
+                <w:rFonts w:ascii="Calibri" w:cs="Calibri" w:eastAsia="Calibri" w:hAnsi="Calibri"/>
+                <w:b/>
+                <w:bCs/>
+              </w:rPr>
+              <w:t xml:space="preserve">Symbol</w:t>
+            </w:r>
+          </w:p>
+        </w:tc>
+        <w:tc>
+          <w:tcPr>
+            <w:tcW w:type="dxa" w:w="6360"/>
+            <w:tcBorders>
+              <w:top w:val="single" w:color="B8C4C8" w:sz="4"/>
+              <w:left w:val="single" w:color="B8C4C8" w:sz="4"/>
+              <w:bottom w:val="single" w:color="B8C4C8" w:sz="4"/>
+              <w:right w:val="single" w:color="B8C4C8" w:sz="4"/>
+            </w:tcBorders>
+            <w:shd w:fill="D5E8EC" w:val="clear"/>
+            <w:tcMar>
+              <w:top w:type="dxa" w:w="60"/>
+              <w:left w:type="dxa" w:w="100"/>
+              <w:bottom w:type="dxa" w:w="60"/>
+              <w:right w:type="dxa" w:w="100"/>
+            </w:tcMar>
+          </w:tcPr>
+          <w:p>
+            <w:r>
+              <w:rPr>
+                <w:rFonts w:ascii="Calibri" w:cs="Calibri" w:eastAsia="Calibri" w:hAnsi="Calibri"/>
+                <w:b/>
+                <w:bCs/>
+              </w:rPr>
+              <w:t xml:space="preserve">Meaning</w:t>
+            </w:r>
+          </w:p>
+        </w:tc>
+      </w:tr>
+      <w:tr>
+        <w:trPr>
+          <w:tblHeader w:val="off"/>
+        </w:trPr>
+        <w:tc>
+          <w:tcPr>
+            <w:tcW w:type="dxa" w:w="3000"/>
+            <w:tcBorders>
+              <w:top w:val="single" w:color="B8C4C8" w:sz="4"/>
+              <w:left w:val="single" w:color="B8C4C8" w:sz="4"/>
+              <w:bottom w:val="single" w:color="B8C4C8" w:sz="4"/>
+              <w:right w:val="single" w:color="B8C4C8" w:sz="4"/>
+            </w:tcBorders>
+            <w:tcMar>
+              <w:top w:type="dxa" w:w="60"/>
+              <w:left w:type="dxa" w:w="100"/>
+              <w:bottom w:type="dxa" w:w="60"/>
+              <w:right w:type="dxa" w:w="100"/>
+            </w:tcMar>
+          </w:tcPr>
+          <w:p>
+            <w:r>
+              <w:rPr>
+                <w:rFonts w:ascii="Calibri" w:cs="Calibri" w:eastAsia="Calibri" w:hAnsi="Calibri"/>
+              </w:rPr>
+              <w:t xml:space="preserve">Grey-blue hull</w:t>
+            </w:r>
+          </w:p>
+        </w:tc>
+        <w:tc>
+          <w:tcPr>
+            <w:tcW w:type="dxa" w:w="6360"/>
+            <w:tcBorders>
+              <w:top w:val="single" w:color="B8C4C8" w:sz="4"/>
+              <w:left w:val="single" w:color="B8C4C8" w:sz="4"/>
+              <w:bottom w:val="single" w:color="B8C4C8" w:sz="4"/>
+              <w:right w:val="single" w:color="B8C4C8" w:sz="4"/>
+            </w:tcBorders>
+            <w:tcMar>
+              <w:top w:type="dxa" w:w="60"/>
+              <w:left w:type="dxa" w:w="100"/>
+              <w:bottom w:type="dxa" w:w="60"/>
+              <w:right w:type="dxa" w:w="100"/>
+            </w:tcMar>
+          </w:tcPr>
+          <w:p>
+            <w:r>
+              <w:rPr>
+                <w:rFonts w:ascii="Calibri" w:cs="Calibri" w:eastAsia="Calibri" w:hAnsi="Calibri"/>
+              </w:rPr>
+              <w:t xml:space="preserve">The Calloway's Pride. Full cover. The deck plan inside is the Far Trader layout: cargo hold amidships, drives aft, bridge and sensors forward.</w:t>
+            </w:r>
+          </w:p>
+        </w:tc>
+      </w:tr>
+      <w:tr>
+        <w:trPr>
+          <w:tblHeader w:val="off"/>
+        </w:trPr>
+        <w:tc>
+          <w:tcPr>
+            <w:tcW w:type="dxa" w:w="3000"/>
+            <w:tcBorders>
+              <w:top w:val="single" w:color="B8C4C8" w:sz="4"/>
+              <w:left w:val="single" w:color="B8C4C8" w:sz="4"/>
+              <w:bottom w:val="single" w:color="B8C4C8" w:sz="4"/>
+              <w:right w:val="single" w:color="B8C4C8" w:sz="4"/>
+            </w:tcBorders>
+            <w:tcMar>
+              <w:top w:type="dxa" w:w="60"/>
+              <w:left w:type="dxa" w:w="100"/>
+              <w:bottom w:type="dxa" w:w="60"/>
+              <w:right w:type="dxa" w:w="100"/>
+            </w:tcMar>
+          </w:tcPr>
+          <w:p>
+            <w:r>
+              <w:rPr>
+                <w:rFonts w:ascii="Calibri" w:cs="Calibri" w:eastAsia="Calibri" w:hAnsi="Calibri"/>
+              </w:rPr>
+              <w:t xml:space="preserve">Dark grey rocks</w:t>
+            </w:r>
+          </w:p>
+        </w:tc>
+        <w:tc>
+          <w:tcPr>
+            <w:tcW w:type="dxa" w:w="6360"/>
+            <w:tcBorders>
+              <w:top w:val="single" w:color="B8C4C8" w:sz="4"/>
+              <w:left w:val="single" w:color="B8C4C8" w:sz="4"/>
+              <w:bottom w:val="single" w:color="B8C4C8" w:sz="4"/>
+              <w:right w:val="single" w:color="B8C4C8" w:sz="4"/>
+            </w:tcBorders>
+            <w:tcMar>
+              <w:top w:type="dxa" w:w="60"/>
+              <w:left w:type="dxa" w:w="100"/>
+              <w:bottom w:type="dxa" w:w="60"/>
+              <w:right w:type="dxa" w:w="100"/>
+            </w:tcMar>
+          </w:tcPr>
+          <w:p>
+            <w:r>
+              <w:rPr>
+                <w:rFonts w:ascii="Calibri" w:cs="Calibri" w:eastAsia="Calibri" w:hAnsi="Calibri"/>
+              </w:rPr>
+              <w:t xml:space="preserve">Boulders. Cover.</w:t>
+            </w:r>
+          </w:p>
+        </w:tc>
+      </w:tr>
+      <w:tr>
+        <w:trPr>
+          <w:tblHeader w:val="off"/>
+        </w:trPr>
+        <w:tc>
+          <w:tcPr>
+            <w:tcW w:type="dxa" w:w="3000"/>
+            <w:tcBorders>
+              <w:top w:val="single" w:color="B8C4C8" w:sz="4"/>
+              <w:left w:val="single" w:color="B8C4C8" w:sz="4"/>
+              <w:bottom w:val="single" w:color="B8C4C8" w:sz="4"/>
+              <w:right w:val="single" w:color="B8C4C8" w:sz="4"/>
+            </w:tcBorders>
+            <w:tcMar>
+              <w:top w:type="dxa" w:w="60"/>
+              <w:left w:type="dxa" w:w="100"/>
+              <w:bottom w:type="dxa" w:w="60"/>
+              <w:right w:type="dxa" w:w="100"/>
+            </w:tcMar>
+          </w:tcPr>
+          <w:p>
+            <w:r>
+              <w:rPr>
+                <w:rFonts w:ascii="Calibri" w:cs="Calibri" w:eastAsia="Calibri" w:hAnsi="Calibri"/>
+              </w:rPr>
+              <w:t xml:space="preserve">Pale ovals</w:t>
+            </w:r>
+          </w:p>
+        </w:tc>
+        <w:tc>
+          <w:tcPr>
+            <w:tcW w:type="dxa" w:w="6360"/>
+            <w:tcBorders>
+              <w:top w:val="single" w:color="B8C4C8" w:sz="4"/>
+              <w:left w:val="single" w:color="B8C4C8" w:sz="4"/>
+              <w:bottom w:val="single" w:color="B8C4C8" w:sz="4"/>
+              <w:right w:val="single" w:color="B8C4C8" w:sz="4"/>
+            </w:tcBorders>
+            <w:tcMar>
+              <w:top w:type="dxa" w:w="60"/>
+              <w:left w:type="dxa" w:w="100"/>
+              <w:bottom w:type="dxa" w:w="60"/>
+              <w:right w:type="dxa" w:w="100"/>
+            </w:tcMar>
+          </w:tcPr>
+          <w:p>
+            <w:r>
+              <w:rPr>
+                <w:rFonts w:ascii="Calibri" w:cs="Calibri" w:eastAsia="Calibri" w:hAnsi="Calibri"/>
+              </w:rPr>
+              <w:t xml:space="preserve">Dunes. Partial cover; a prone Traveller can use them.</w:t>
+            </w:r>
+          </w:p>
+        </w:tc>
+      </w:tr>
+      <w:tr>
+        <w:trPr>
+          <w:tblHeader w:val="off"/>
+        </w:trPr>
+        <w:tc>
+          <w:tcPr>
+            <w:tcW w:type="dxa" w:w="3000"/>
+            <w:tcBorders>
+              <w:top w:val="single" w:color="B8C4C8" w:sz="4"/>
+              <w:left w:val="single" w:color="B8C4C8" w:sz="4"/>
+              <w:bottom w:val="single" w:color="B8C4C8" w:sz="4"/>
+              <w:right w:val="single" w:color="B8C4C8" w:sz="4"/>
+            </w:tcBorders>
+            <w:tcMar>
+              <w:top w:type="dxa" w:w="60"/>
+              <w:left w:type="dxa" w:w="100"/>
+              <w:bottom w:type="dxa" w:w="60"/>
+              <w:right w:type="dxa" w:w="100"/>
+            </w:tcMar>
+          </w:tcPr>
+          <w:p>
+            <w:r>
+              <w:rPr>
+                <w:rFonts w:ascii="Calibri" w:cs="Calibri" w:eastAsia="Calibri" w:hAnsi="Calibri"/>
+              </w:rPr>
+              <w:t xml:space="preserve">Brown crates, grey sled, green generator</w:t>
+            </w:r>
+          </w:p>
+        </w:tc>
+        <w:tc>
+          <w:tcPr>
+            <w:tcW w:type="dxa" w:w="6360"/>
+            <w:tcBorders>
+              <w:top w:val="single" w:color="B8C4C8" w:sz="4"/>
+              <w:left w:val="single" w:color="B8C4C8" w:sz="4"/>
+              <w:bottom w:val="single" w:color="B8C4C8" w:sz="4"/>
+              <w:right w:val="single" w:color="B8C4C8" w:sz="4"/>
+            </w:tcBorders>
+            <w:tcMar>
+              <w:top w:type="dxa" w:w="60"/>
+              <w:left w:type="dxa" w:w="100"/>
+              <w:bottom w:type="dxa" w:w="60"/>
+              <w:right w:type="dxa" w:w="100"/>
+            </w:tcMar>
+          </w:tcPr>
+          <w:p>
+            <w:r>
+              <w:rPr>
+                <w:rFonts w:ascii="Calibri" w:cs="Calibri" w:eastAsia="Calibri" w:hAnsi="Calibri"/>
+              </w:rPr>
+              <w:t xml:space="preserve">Rival camp gear. Cover.</w:t>
+            </w:r>
+          </w:p>
+        </w:tc>
+      </w:tr>
+      <w:tr>
+        <w:trPr>
+          <w:tblHeader w:val="off"/>
+        </w:trPr>
+        <w:tc>
+          <w:tcPr>
+            <w:tcW w:type="dxa" w:w="3000"/>
+            <w:tcBorders>
+              <w:top w:val="single" w:color="B8C4C8" w:sz="4"/>
+              <w:left w:val="single" w:color="B8C4C8" w:sz="4"/>
+              <w:bottom w:val="single" w:color="B8C4C8" w:sz="4"/>
+              <w:right w:val="single" w:color="B8C4C8" w:sz="4"/>
+            </w:tcBorders>
+            <w:tcMar>
+              <w:top w:type="dxa" w:w="60"/>
+              <w:left w:type="dxa" w:w="100"/>
+              <w:bottom w:type="dxa" w:w="60"/>
+              <w:right w:type="dxa" w:w="100"/>
+            </w:tcMar>
+          </w:tcPr>
+          <w:p>
+            <w:r>
+              <w:rPr>
+                <w:rFonts w:ascii="Calibri" w:cs="Calibri" w:eastAsia="Calibri" w:hAnsi="Calibri"/>
+              </w:rPr>
+              <w:t xml:space="preserve">Red circles with yellow centres</w:t>
+            </w:r>
+          </w:p>
+        </w:tc>
+        <w:tc>
+          <w:tcPr>
+            <w:tcW w:type="dxa" w:w="6360"/>
+            <w:tcBorders>
+              <w:top w:val="single" w:color="B8C4C8" w:sz="4"/>
+              <w:left w:val="single" w:color="B8C4C8" w:sz="4"/>
+              <w:bottom w:val="single" w:color="B8C4C8" w:sz="4"/>
+              <w:right w:val="single" w:color="B8C4C8" w:sz="4"/>
+            </w:tcBorders>
+            <w:tcMar>
+              <w:top w:type="dxa" w:w="60"/>
+              <w:left w:type="dxa" w:w="100"/>
+              <w:bottom w:type="dxa" w:w="60"/>
+              <w:right w:type="dxa" w:w="100"/>
+            </w:tcMar>
+          </w:tcPr>
+          <w:p>
+            <w:r>
+              <w:rPr>
+                <w:rFonts w:ascii="Calibri" w:cs="Calibri" w:eastAsia="Calibri" w:hAnsi="Calibri"/>
+              </w:rPr>
+              <w:t xml:space="preserve">Fuel canisters. A stray hit may ignite them (see Scene 4).</w:t>
+            </w:r>
+          </w:p>
+        </w:tc>
+      </w:tr>
+      <w:tr>
+        <w:trPr>
+          <w:tblHeader w:val="off"/>
+        </w:trPr>
+        <w:tc>
+          <w:tcPr>
+            <w:tcW w:type="dxa" w:w="3000"/>
+            <w:tcBorders>
+              <w:top w:val="single" w:color="B8C4C8" w:sz="4"/>
+              <w:left w:val="single" w:color="B8C4C8" w:sz="4"/>
+              <w:bottom w:val="single" w:color="B8C4C8" w:sz="4"/>
+              <w:right w:val="single" w:color="B8C4C8" w:sz="4"/>
+            </w:tcBorders>
+            <w:tcMar>
+              <w:top w:type="dxa" w:w="60"/>
+              <w:left w:type="dxa" w:w="100"/>
+              <w:bottom w:type="dxa" w:w="60"/>
+              <w:right w:type="dxa" w:w="100"/>
+            </w:tcMar>
+          </w:tcPr>
+          <w:p>
+            <w:r>
+              <w:rPr>
+                <w:rFonts w:ascii="Calibri" w:cs="Calibri" w:eastAsia="Calibri" w:hAnsi="Calibri"/>
+              </w:rPr>
+              <w:t xml:space="preserve">Dark band along the top</w:t>
+            </w:r>
+          </w:p>
+        </w:tc>
+        <w:tc>
+          <w:tcPr>
+            <w:tcW w:type="dxa" w:w="6360"/>
+            <w:tcBorders>
+              <w:top w:val="single" w:color="B8C4C8" w:sz="4"/>
+              <w:left w:val="single" w:color="B8C4C8" w:sz="4"/>
+              <w:bottom w:val="single" w:color="B8C4C8" w:sz="4"/>
+              <w:right w:val="single" w:color="B8C4C8" w:sz="4"/>
+            </w:tcBorders>
+            <w:tcMar>
+              <w:top w:type="dxa" w:w="60"/>
+              <w:left w:type="dxa" w:w="100"/>
+              <w:bottom w:type="dxa" w:w="60"/>
+              <w:right w:type="dxa" w:w="100"/>
+            </w:tcMar>
+          </w:tcPr>
+          <w:p>
+            <w:r>
+              <w:rPr>
+                <w:rFonts w:ascii="Calibri" w:cs="Calibri" w:eastAsia="Calibri" w:hAnsi="Calibri"/>
+              </w:rPr>
+              <w:t xml:space="preserve">The ridge. High ground; Athletics 8+ to climb.</w:t>
+            </w:r>
+          </w:p>
+        </w:tc>
+      </w:tr>
+      <w:tr>
+        <w:trPr>
+          <w:tblHeader w:val="off"/>
+        </w:trPr>
+        <w:tc>
+          <w:tcPr>
+            <w:tcW w:type="dxa" w:w="3000"/>
+            <w:tcBorders>
+              <w:top w:val="single" w:color="B8C4C8" w:sz="4"/>
+              <w:left w:val="single" w:color="B8C4C8" w:sz="4"/>
+              <w:bottom w:val="single" w:color="B8C4C8" w:sz="4"/>
+              <w:right w:val="single" w:color="B8C4C8" w:sz="4"/>
+            </w:tcBorders>
+            <w:tcMar>
+              <w:top w:type="dxa" w:w="60"/>
+              <w:left w:type="dxa" w:w="100"/>
+              <w:bottom w:type="dxa" w:w="60"/>
+              <w:right w:type="dxa" w:w="100"/>
+            </w:tcMar>
+          </w:tcPr>
+          <w:p>
+            <w:r>
+              <w:rPr>
+                <w:rFonts w:ascii="Calibri" w:cs="Calibri" w:eastAsia="Calibri" w:hAnsi="Calibri"/>
+              </w:rPr>
+              <w:t xml:space="preserve">Pale winding band (east)</w:t>
+            </w:r>
+          </w:p>
+        </w:tc>
+        <w:tc>
+          <w:tcPr>
+            <w:tcW w:type="dxa" w:w="6360"/>
+            <w:tcBorders>
+              <w:top w:val="single" w:color="B8C4C8" w:sz="4"/>
+              <w:left w:val="single" w:color="B8C4C8" w:sz="4"/>
+              <w:bottom w:val="single" w:color="B8C4C8" w:sz="4"/>
+              <w:right w:val="single" w:color="B8C4C8" w:sz="4"/>
+            </w:tcBorders>
+            <w:tcMar>
+              <w:top w:type="dxa" w:w="60"/>
+              <w:left w:type="dxa" w:w="100"/>
+              <w:bottom w:type="dxa" w:w="60"/>
+              <w:right w:type="dxa" w:w="100"/>
+            </w:tcMar>
+          </w:tcPr>
+          <w:p>
+            <w:r>
+              <w:rPr>
+                <w:rFonts w:ascii="Calibri" w:cs="Calibri" w:eastAsia="Calibri" w:hAnsi="Calibri"/>
+              </w:rPr>
+              <w:t xml:space="preserve">The dry riverbed.</w:t>
+            </w:r>
+          </w:p>
+        </w:tc>
+      </w:tr>
+      <w:tr>
+        <w:trPr>
+          <w:tblHeader w:val="off"/>
+        </w:trPr>
+        <w:tc>
+          <w:tcPr>
+            <w:tcW w:type="dxa" w:w="3000"/>
+            <w:tcBorders>
+              <w:top w:val="single" w:color="B8C4C8" w:sz="4"/>
+              <w:left w:val="single" w:color="B8C4C8" w:sz="4"/>
+              <w:bottom w:val="single" w:color="B8C4C8" w:sz="4"/>
+              <w:right w:val="single" w:color="B8C4C8" w:sz="4"/>
+            </w:tcBorders>
+            <w:tcMar>
+              <w:top w:type="dxa" w:w="60"/>
+              <w:left w:type="dxa" w:w="100"/>
+              <w:bottom w:type="dxa" w:w="60"/>
+              <w:right w:type="dxa" w:w="100"/>
+            </w:tcMar>
+          </w:tcPr>
+          <w:p>
+            <w:r>
+              <w:rPr>
+                <w:rFonts w:ascii="Calibri" w:cs="Calibri" w:eastAsia="Calibri" w:hAnsi="Calibri"/>
+              </w:rPr>
+              <w:t xml:space="preserve">Orange cut marks on the hull</w:t>
+            </w:r>
+          </w:p>
+        </w:tc>
+        <w:tc>
+          <w:tcPr>
+            <w:tcW w:type="dxa" w:w="6360"/>
+            <w:tcBorders>
+              <w:top w:val="single" w:color="B8C4C8" w:sz="4"/>
+              <w:left w:val="single" w:color="B8C4C8" w:sz="4"/>
+              <w:bottom w:val="single" w:color="B8C4C8" w:sz="4"/>
+              <w:right w:val="single" w:color="B8C4C8" w:sz="4"/>
+            </w:tcBorders>
+            <w:tcMar>
+              <w:top w:type="dxa" w:w="60"/>
+              <w:left w:type="dxa" w:w="100"/>
+              <w:bottom w:type="dxa" w:w="60"/>
+              <w:right w:type="dxa" w:w="100"/>
+            </w:tcMar>
+          </w:tcPr>
+          <w:p>
+            <w:r>
+              <w:rPr>
+                <w:rFonts w:ascii="Calibri" w:cs="Calibri" w:eastAsia="Calibri" w:hAnsi="Calibri"/>
+              </w:rPr>
+              <w:t xml:space="preserve">The half-cut outer plate of the east cargo hatch. The inner airlock door is still sealed.</w:t>
+            </w:r>
+          </w:p>
+        </w:tc>
+      </w:tr>
+      <w:tr>
+        <w:trPr>
+          <w:tblHeader w:val="off"/>
+        </w:trPr>
+        <w:tc>
+          <w:tcPr>
+            <w:tcW w:type="dxa" w:w="3000"/>
+            <w:tcBorders>
+              <w:top w:val="single" w:color="B8C4C8" w:sz="4"/>
+              <w:left w:val="single" w:color="B8C4C8" w:sz="4"/>
+              <w:bottom w:val="single" w:color="B8C4C8" w:sz="4"/>
+              <w:right w:val="single" w:color="B8C4C8" w:sz="4"/>
+            </w:tcBorders>
+            <w:tcMar>
+              <w:top w:type="dxa" w:w="60"/>
+              <w:left w:type="dxa" w:w="100"/>
+              <w:bottom w:type="dxa" w:w="60"/>
+              <w:right w:type="dxa" w:w="100"/>
+            </w:tcMar>
+          </w:tcPr>
+          <w:p>
+            <w:r>
+              <w:rPr>
+                <w:rFonts w:ascii="Calibri" w:cs="Calibri" w:eastAsia="Calibri" w:hAnsi="Calibri"/>
+              </w:rPr>
+              <w:t xml:space="preserve">Black jagged area</w:t>
+            </w:r>
+          </w:p>
+        </w:tc>
+        <w:tc>
+          <w:tcPr>
+            <w:tcW w:type="dxa" w:w="6360"/>
+            <w:tcBorders>
+              <w:top w:val="single" w:color="B8C4C8" w:sz="4"/>
+              <w:left w:val="single" w:color="B8C4C8" w:sz="4"/>
+              <w:bottom w:val="single" w:color="B8C4C8" w:sz="4"/>
+              <w:right w:val="single" w:color="B8C4C8" w:sz="4"/>
+            </w:tcBorders>
+            <w:tcMar>
+              <w:top w:type="dxa" w:w="60"/>
+              <w:left w:type="dxa" w:w="100"/>
+              <w:bottom w:type="dxa" w:w="60"/>
+              <w:right w:type="dxa" w:w="100"/>
+            </w:tcMar>
+          </w:tcPr>
+          <w:p>
+            <w:r>
+              <w:rPr>
+                <w:rFonts w:ascii="Calibri" w:cs="Calibri" w:eastAsia="Calibri" w:hAnsi="Calibri"/>
+              </w:rPr>
+              <w:t xml:space="preserve">The torn-open west engine pod. The breach into engineering is hidden from the camp.</w:t>
+            </w:r>
+          </w:p>
+        </w:tc>
+      </w:tr>
+      <w:tr>
+        <w:trPr>
+          <w:tblHeader w:val="off"/>
+        </w:trPr>
+        <w:tc>
+          <w:tcPr>
+            <w:tcW w:type="dxa" w:w="3000"/>
+            <w:tcBorders>
+              <w:top w:val="single" w:color="B8C4C8" w:sz="4"/>
+              <w:left w:val="single" w:color="B8C4C8" w:sz="4"/>
+              <w:bottom w:val="single" w:color="B8C4C8" w:sz="4"/>
+              <w:right w:val="single" w:color="B8C4C8" w:sz="4"/>
+            </w:tcBorders>
+            <w:tcMar>
+              <w:top w:type="dxa" w:w="60"/>
+              <w:left w:type="dxa" w:w="100"/>
+              <w:bottom w:type="dxa" w:w="60"/>
+              <w:right w:type="dxa" w:w="100"/>
+            </w:tcMar>
+          </w:tcPr>
+          <w:p>
+            <w:r>
+              <w:rPr>
+                <w:rFonts w:ascii="Calibri" w:cs="Calibri" w:eastAsia="Calibri" w:hAnsi="Calibri"/>
+              </w:rPr>
+              <w:t xml:space="preserve">Torn-off turret and plates</w:t>
+            </w:r>
+          </w:p>
+        </w:tc>
+        <w:tc>
+          <w:tcPr>
+            <w:tcW w:type="dxa" w:w="6360"/>
+            <w:tcBorders>
+              <w:top w:val="single" w:color="B8C4C8" w:sz="4"/>
+              <w:left w:val="single" w:color="B8C4C8" w:sz="4"/>
+              <w:bottom w:val="single" w:color="B8C4C8" w:sz="4"/>
+              <w:right w:val="single" w:color="B8C4C8" w:sz="4"/>
+            </w:tcBorders>
+            <w:tcMar>
+              <w:top w:type="dxa" w:w="60"/>
+              <w:left w:type="dxa" w:w="100"/>
+              <w:bottom w:type="dxa" w:w="60"/>
+              <w:right w:type="dxa" w:w="100"/>
+            </w:tcMar>
+          </w:tcPr>
+          <w:p>
+            <w:r>
+              <w:rPr>
+                <w:rFonts w:ascii="Calibri" w:cs="Calibri" w:eastAsia="Calibri" w:hAnsi="Calibri"/>
+              </w:rPr>
+              <w:t xml:space="preserve">Wreckage thrown clear. Light cover.</w:t>
+            </w:r>
+          </w:p>
+        </w:tc>
+      </w:tr>
+    </w:tbl>
+    <w:p>
+      <w:pPr>
+        <w:spacing w:after="80"/>
+      </w:pPr>
+    </w:p>
+    <w:p>
+      <w:pPr>
+        <w:pStyle w:val="Heading3"/>
+        <w:spacing w:after="80" w:before="160"/>
+      </w:pPr>
+      <w:r>
+        <w:rPr>
+          <w:rFonts w:ascii="Calibri" w:cs="Calibri" w:eastAsia="Calibri" w:hAnsi="Calibri"/>
+        </w:rPr>
+        <w:t xml:space="preserve">Landing sites (off-map)</w:t>
+      </w:r>
+    </w:p>
+    <w:p>
+      <w:pPr>
+        <w:pStyle w:val="ListParagraph"/>
+        <w:numPr>
+          <w:ilvl w:val="0"/>
+          <w:numId w:val="2"/>
+        </w:numPr>
+        <w:spacing w:after="60"/>
+      </w:pPr>
+      <w:r>
+        <w:rPr>
+          <w:rFonts w:ascii="Calibri" w:cs="Calibri" w:eastAsia="Calibri" w:hAnsi="Calibri"/>
+          <w:b/>
+          <w:bCs/>
+        </w:rPr>
+        <w:t xml:space="preserve">Basin floor:</w:t>
+      </w:r>
+      <w:r>
+        <w:rPr>
+          <w:rFonts w:ascii="Calibri" w:cs="Calibri" w:eastAsia="Calibri" w:hAnsi="Calibri"/>
+        </w:rPr>
+        <w:t xml:space="preserve"> 300 m along the scar the ship cut. On the first map the scar runs west; on the angled map it runs south-south-west.</w:t>
+      </w:r>
+    </w:p>
+    <w:p>
+      <w:pPr>
+        <w:pStyle w:val="ListParagraph"/>
+        <w:numPr>
+          <w:ilvl w:val="0"/>
+          <w:numId w:val="2"/>
+        </w:numPr>
+        <w:spacing w:after="60"/>
+      </w:pPr>
+      <w:r>
+        <w:rPr>
+          <w:rFonts w:ascii="Calibri" w:cs="Calibri" w:eastAsia="Calibri" w:hAnsi="Calibri"/>
+          <w:b/>
+          <w:bCs/>
+        </w:rPr>
+        <w:t xml:space="preserve">Behind the ridge:</w:t>
+      </w:r>
+      <w:r>
+        <w:rPr>
+          <w:rFonts w:ascii="Calibri" w:cs="Calibri" w:eastAsia="Calibri" w:hAnsi="Calibri"/>
+        </w:rPr>
+        <w:t xml:space="preserve"> a 1.5 km hike over the ridge to the north.</w:t>
+      </w:r>
+    </w:p>
+    <w:p>
+      <w:pPr>
+        <w:pStyle w:val="ListParagraph"/>
+        <w:numPr>
+          <w:ilvl w:val="0"/>
+          <w:numId w:val="2"/>
+        </w:numPr>
+        <w:spacing w:after="60"/>
+      </w:pPr>
+      <w:r>
+        <w:rPr>
+          <w:rFonts w:ascii="Calibri" w:cs="Calibri" w:eastAsia="Calibri" w:hAnsi="Calibri"/>
+          <w:b/>
+          <w:bCs/>
+        </w:rPr>
+        <w:t xml:space="preserve">Riverbed:</w:t>
+      </w:r>
+      <w:r>
+        <w:rPr>
+          <w:rFonts w:ascii="Calibri" w:cs="Calibri" w:eastAsia="Calibri" w:hAnsi="Calibri"/>
+        </w:rPr>
+        <w:t xml:space="preserve"> 800 m east.</w:t>
       </w:r>
     </w:p>
     <w:sectPr>

</xml_diff>

<commit_message>
Scenario 2: same-system timeline, zoom-in skill chain, bridge breach, strap cargo timing
Co-Authored-By: Claude Sonnet 5.5 <noreply@anthropic.com>
</commit_message>
<xml_diff>
--- a/docs/scenarios/Scenario 2 - Dead Reckoning.docx
+++ b/docs/scenarios/Scenario 2 - Dead Reckoning.docx
@@ -41,7 +41,7 @@
         <w:rPr>
           <w:rFonts w:ascii="Calibri" w:cs="Calibri" w:eastAsia="Calibri" w:hAnsi="Calibri"/>
         </w:rPr>
-        <w:t xml:space="preserve">A one-session cargo recovery scenario: the party tracks a downed freighter to a cold, dusty world, beats a rival salvage crew to the wreck, cracks open the sealed hold and gets the cargo home. Where Scenario 1 was built around combat, this one is built around exploration, environmental hazards, skill checks, skill chains and hacking.</w:t>
+        <w:t xml:space="preserve">A one-session cargo recovery scenario: the party flies out to a cold, dusty world in the same system as the starport, finds a downed Far Trader, beats a rival salvage crew to the wreck, opens the sealed hold and gets the cargo home. Where Scenario 1 was built around combat, this one is built around exploration, environmental hazards, skill checks, skill chains and hacking.</w:t>
       </w:r>
     </w:p>
     <w:p>
@@ -98,7 +98,7 @@
           <w:i/>
           <w:iCs/>
         </w:rPr>
-        <w:t xml:space="preserve">"Eleven days ago a free trader called the Calloway's Pride lost power on approach to a world called Cinder and came down hard. No distress call, no survivors reported, no salvage claim filed. She was carrying twelve sealed containers of Hesperin-4 reagent. It's the stuff every clinic between here and the Spinward Marches uses to culture vaccines. Boring cargo. Expensive cargo. We insured it."</w:t>
+        <w:t xml:space="preserve">"A day and a half ago a free trader called the Calloway's Pride lost power on approach to Cinder, the cold rock in our own system, and came down hard. No distress call, no survivors reported, no salvage claim filed. She was carrying twelve sealed containers of Hesperin-4 reagent. It's the stuff every clinic between here and the Spinward Marches uses to culture vaccines. Boring cargo. Expensive cargo. We insured it."</w:t>
       </w:r>
     </w:p>
     <w:p>
@@ -115,7 +115,7 @@
           <w:i/>
           <w:iCs/>
         </w:rPr>
-        <w:t xml:space="preserve">He taps the tablet. A cargo manifest, a last known position, a fee: eighty thousand credits on delivery, twenty thousand up front for fuel. "The containers have a cold-chain cell good for about two more weeks. After that it's sludge. Get there, get inside, and bring them back to me. And be quick. I'm told other people have noticed the wreck."</w:t>
+        <w:t xml:space="preserve">He taps the tablet. A cargo manifest, a last known track, a fee: eighty thousand credits on delivery, five thousand up front for expenses, and ten thousand more if the cargo is on his dock inside a week. "The containers carry cold-chain cells good for six days without power. The clock started when she went down. Get there, get inside, and bring them back to me. And be quick. I'm told other people have noticed the wreck."</w:t>
       </w:r>
     </w:p>
     <w:p>
@@ -155,7 +155,7 @@
         <w:rPr>
           <w:rFonts w:ascii="Calibri" w:cs="Calibri" w:eastAsia="Calibri" w:hAnsi="Calibri"/>
         </w:rPr>
-        <w:t xml:space="preserve">The party wins by getting all twelve containers aboard their own ship and delivering them to Kell. Plan on 3 to 4 hours, with roughly 30 minutes per scene. Scenes 1 to 3 are the journey and the search, Scenes 4 to 6 are the fight at the wreck, and Scene 7 is the payoff.</w:t>
+        <w:t xml:space="preserve">The party wins by getting all twelve containers aboard their own ship and delivering them to Kell. Plan on 3 to 4 hours, with roughly 30 minutes per scene. Scenes 1 to 3 are the flight and the search, Scenes 4 to 6 are the fight and the work at the wreck, and Scene 7 is the payoff.</w:t>
       </w:r>
     </w:p>
     <w:p>
@@ -174,7 +174,7 @@
         <w:rPr>
           <w:rFonts w:ascii="Calibri" w:cs="Calibri" w:eastAsia="Calibri" w:hAnsi="Calibri"/>
         </w:rPr>
-        <w:t xml:space="preserve"> Nothing here is supernatural and the cargo is exactly what Kell says it is. The twist is human. The Calloway's Pride didn't simply crash: her drive was sabotaged by a competitor, Marrow-Thane Logistics, which wants Kell-Brandt to pay out on a total loss. Marrow-Thane has hired the salvage crew at the wreck to get there first and either strip the cargo or make sure it is never recovered. Kell suspects as much but won't say so up front. It matters in Scene 7.</w:t>
+        <w:t xml:space="preserve"> Nothing here is supernatural and the cargo is exactly what Kell says it is. The twist is human. The Calloway's Pride didn't simply crash: her drive was sabotaged by a competitor, Marrow-Thane Logistics, which wants Kell-Brandt to pay out on a total loss. Marrow-Thane has hired a salvage crew to get to the wreck first and either strip the cargo or make sure it is never recovered. Kell suspects as much but won't say so up front. It matters in Scene 7.</w:t>
       </w:r>
     </w:p>
     <w:p>
@@ -193,7 +193,7 @@
         <w:rPr>
           <w:rFonts w:ascii="Calibri" w:cs="Calibri" w:eastAsia="Calibri" w:hAnsi="Calibri"/>
         </w:rPr>
-        <w:t xml:space="preserve"> A small, cold, dusty world with a very thin atmosphere. It is a perfect location for hazards that the players have to think through rather than just roll at.</w:t>
+        <w:t xml:space="preserve"> A small, cold, dusty world with a very thin atmosphere, in the same system as the starport. It is a perfect location for hazards that the players have to think through rather than just roll at.</w:t>
       </w:r>
     </w:p>
     <w:tbl>
@@ -323,7 +323,7 @@
               <w:rPr>
                 <w:rFonts w:ascii="Calibri" w:cs="Calibri" w:eastAsia="Calibri" w:hAnsi="Calibri"/>
               </w:rPr>
-              <w:t xml:space="preserve">Size 5: 8,000 km diameter, about 0.4 G. Everything is lighter. Athletics (strength) checks to lift or carry get DM+2, Athletics (dexterity) jumps go further, and falling damage is reduced.</w:t>
+              <w:t xml:space="preserve">Size 5: 8,000 km diameter, about 0.4 G. Everything is lighter. Athletics (dexterity) jumps go further, falling damage is reduced and cargo weighs less.</w:t>
             </w:r>
           </w:p>
         </w:tc>
@@ -378,7 +378,7 @@
               <w:rPr>
                 <w:rFonts w:ascii="Calibri" w:cs="Calibri" w:eastAsia="Calibri" w:hAnsi="Calibri"/>
               </w:rPr>
-              <w:t xml:space="preserve">Very Thin. Breathable only with a respirator (a compressor mask). Anyone without one is gasping within a minute and suffering END damage like an asphyxiation. A vacc suit also works.</w:t>
+              <w:t xml:space="preserve">Very Thin. Breathable only with a respirator (a compressor mask). Anyone without one is gasping within a minute and suffering END damage like an asphyxiation. A vacc suit also works. The air inside the wreck is the same as outside, because the hull is breached.</w:t>
             </w:r>
           </w:p>
         </w:tc>
@@ -488,7 +488,7 @@
               <w:rPr>
                 <w:rFonts w:ascii="Calibri" w:cs="Calibri" w:eastAsia="Calibri" w:hAnsi="Calibri"/>
               </w:rPr>
-              <w:t xml:space="preserve">Ash storms roll off the dormant volcanoes to the north. A storm front is due about 12 hours after the party arrives (see the clock below). Inside a storm: no flying under 500 m, visibility 20 m, DM-2 to all sensor and comms checks.</w:t>
+              <w:t xml:space="preserve">Ash storms roll off the dormant volcanoes to the north. A storm front is due about 12 hours after the party lands (see the clock below). Inside a storm: no flying under 500 m, visibility 20 m, DM-2 to all sensor and comms checks.</w:t>
             </w:r>
           </w:p>
         </w:tc>
@@ -543,7 +543,7 @@
               <w:rPr>
                 <w:rFonts w:ascii="Calibri" w:cs="Calibri" w:eastAsia="Calibri" w:hAnsi="Calibri"/>
               </w:rPr>
-              <w:t xml:space="preserve">None. Cinder has a mining outpost on the other side of the planet and a single orbital nav buoy, Cinder Beacon-2.</w:t>
+              <w:t xml:space="preserve">None. Cinder has a mining outpost on the other side of the planet.</w:t>
             </w:r>
           </w:p>
         </w:tc>
@@ -570,7 +570,7 @@
         <w:rPr>
           <w:rFonts w:ascii="Calibri" w:cs="Calibri" w:eastAsia="Calibri" w:hAnsi="Calibri"/>
         </w:rPr>
-        <w:t xml:space="preserve"> Use the group's ship from the Spacecraft Record. It needs a cargo bay big enough for 24 tons (12 containers of 2 tons each), Jump-1 for the outbound leg, and an airlock. If the group has no ship that fits, Kell has leased them a Type-A Free Trader for the job. A ship with a Fuel Processor lets the pilot skim the fuel needed for the return leg and saves the twenty thousand fuel advance, which is a nice bonus for clever players.</w:t>
+        <w:t xml:space="preserve"> Use the group's ship from the Spacecraft Record. It needs an airlock and a cargo bay big enough for 24 tons (12 containers of 2 tons each). If the group has no ship that fits, Kell has leased them a Type-A Free Trader for the job. The scenario assumes Thrust 1. See Scene 1 for faster ships.</w:t>
       </w:r>
     </w:p>
     <w:p>
@@ -589,7 +589,7 @@
         <w:rPr>
           <w:rFonts w:ascii="Calibri" w:cs="Calibri" w:eastAsia="Calibri" w:hAnsi="Calibri"/>
         </w:rPr>
-        <w:t xml:space="preserve"> Either works. Every scene has a job for a Pilot, an Astrogator or Navigator, an Electronics specialist (sensors, comms, computers), an Engineer or Mechanic, and at least one person who can shoot. An unskilled roll is DM-3. Hacking in Scenes 2 and 5 is the heaviest skill demand.</w:t>
+        <w:t xml:space="preserve"> Either works. Every scene has a job for a Pilot, a Navigator, an Electronics specialist (sensors, comms, computers), an Engineer or Mechanic, and at least one person who can shoot. An unskilled roll is DM-3. Hacking in Scene 5 is the heaviest skill demand.</w:t>
       </w:r>
     </w:p>
     <w:p>
@@ -760,7 +760,7 @@
               <w:rPr>
                 <w:rFonts w:ascii="Calibri" w:cs="Calibri" w:eastAsia="Calibri" w:hAnsi="Calibri"/>
               </w:rPr>
-              <w:t xml:space="preserve">Jump travel, the 100-diameter limit, in-system flight times</w:t>
+              <w:t xml:space="preserve">In-system travel, Thrust and time, spotting another ship</w:t>
             </w:r>
           </w:p>
         </w:tc>
@@ -785,7 +785,7 @@
               <w:rPr>
                 <w:rFonts w:ascii="Calibri" w:cs="Calibri" w:eastAsia="Calibri" w:hAnsi="Calibri"/>
               </w:rPr>
-              <w:t xml:space="preserve">Astrogation, Engineer (j-drive), Pilot, Broker / Admin</w:t>
+              <w:t xml:space="preserve">Admin, Broker, Pilot, Electronics (sensors)</w:t>
             </w:r>
           </w:p>
         </w:tc>
@@ -840,7 +840,7 @@
               <w:rPr>
                 <w:rFonts w:ascii="Calibri" w:cs="Calibri" w:eastAsia="Calibri" w:hAnsi="Calibri"/>
               </w:rPr>
-              <w:t xml:space="preserve">Skill chains, sensors, hacking a satellite</w:t>
+              <w:t xml:space="preserve">Skill chains: each check feeds the next. Sensors and comms.</w:t>
             </w:r>
           </w:p>
         </w:tc>
@@ -865,7 +865,7 @@
               <w:rPr>
                 <w:rFonts w:ascii="Calibri" w:cs="Calibri" w:eastAsia="Calibri" w:hAnsi="Calibri"/>
               </w:rPr>
-              <w:t xml:space="preserve">Electronics (sensors / comms / computers), Astrogation, Investigate</w:t>
+              <w:t xml:space="preserve">Admin or Broker, Navigation, Electronics (comms), Electronics (sensors)</w:t>
             </w:r>
           </w:p>
         </w:tc>
@@ -945,7 +945,7 @@
               <w:rPr>
                 <w:rFonts w:ascii="Calibri" w:cs="Calibri" w:eastAsia="Calibri" w:hAnsi="Calibri"/>
               </w:rPr>
-              <w:t xml:space="preserve">Pilot, Navigation, Recon, Survival</w:t>
+              <w:t xml:space="preserve">Pilot, Recon, Survival</w:t>
             </w:r>
           </w:p>
         </w:tc>
@@ -1080,7 +1080,7 @@
               <w:rPr>
                 <w:rFonts w:ascii="Calibri" w:cs="Calibri" w:eastAsia="Calibri" w:hAnsi="Calibri"/>
               </w:rPr>
-              <w:t xml:space="preserve">Hazardous structures, forcing / hacking a sealed hold</w:t>
+              <w:t xml:space="preserve">Hazardous structures, restoring power, hacking a sealed hold</w:t>
             </w:r>
           </w:p>
         </w:tc>
@@ -1105,7 +1105,7 @@
               <w:rPr>
                 <w:rFonts w:ascii="Calibri" w:cs="Calibri" w:eastAsia="Calibri" w:hAnsi="Calibri"/>
               </w:rPr>
-              <w:t xml:space="preserve">Mechanic, Electronics (computers), Athletics, Engineer</w:t>
+              <w:t xml:space="preserve">Engineer, Electronics (computers), Mechanic, Athletics, Investigate</w:t>
             </w:r>
           </w:p>
         </w:tc>
@@ -1160,7 +1160,7 @@
               <w:rPr>
                 <w:rFonts w:ascii="Calibri" w:cs="Calibri" w:eastAsia="Calibri" w:hAnsi="Calibri"/>
               </w:rPr>
-              <w:t xml:space="preserve">Extended tasks, working against a clock</w:t>
+              <w:t xml:space="preserve">Time-based tasks against a clock</w:t>
             </w:r>
           </w:p>
         </w:tc>
@@ -1185,7 +1185,7 @@
               <w:rPr>
                 <w:rFonts w:ascii="Calibri" w:cs="Calibri" w:eastAsia="Calibri" w:hAnsi="Calibri"/>
               </w:rPr>
-              <w:t xml:space="preserve">Athletics (strength), Mechanic, Leadership</w:t>
+              <w:t xml:space="preserve">Mechanic, Athletics (strength), Drive, Leadership</w:t>
             </w:r>
           </w:p>
         </w:tc>
@@ -1309,6 +1309,442 @@
         <w:rPr>
           <w:rFonts w:ascii="Calibri" w:cs="Calibri" w:eastAsia="Calibri" w:hAnsi="Calibri"/>
         </w:rPr>
+        <w:t xml:space="preserve">The timeline</w:t>
+      </w:r>
+    </w:p>
+    <w:p>
+      <w:pPr>
+        <w:spacing w:after="120"/>
+      </w:pPr>
+      <w:r>
+        <w:rPr>
+          <w:rFonts w:ascii="Calibri" w:cs="Calibri" w:eastAsia="Calibri" w:hAnsi="Calibri"/>
+        </w:rPr>
+        <w:t xml:space="preserve">Cinder is 2.8 days from the starport at Thrust 1 (about 67 hours). The speed bonus needs the cargo on Kell's dock within 7 days of the briefing, and the return flight takes another 67 hours. With about 6 hours of prep, the 3-hour default scan and an hour of descent, the party lands about 77 hours after the briefing and has about 24 hours on Cinder to make the bonus.</w:t>
+      </w:r>
+    </w:p>
+    <w:tbl>
+      <w:tblPr>
+        <w:tblW w:type="dxa" w:w="9360"/>
+        <w:tblBorders>
+          <w:top w:val="single" w:color="auto" w:sz="4"/>
+          <w:left w:val="single" w:color="auto" w:sz="4"/>
+          <w:bottom w:val="single" w:color="auto" w:sz="4"/>
+          <w:right w:val="single" w:color="auto" w:sz="4"/>
+          <w:insideH w:val="single" w:color="auto" w:sz="4"/>
+          <w:insideV w:val="single" w:color="auto" w:sz="4"/>
+        </w:tblBorders>
+      </w:tblPr>
+      <w:tblGrid>
+        <w:gridCol w:w="3000"/>
+        <w:gridCol w:w="6360"/>
+      </w:tblGrid>
+      <w:tr>
+        <w:trPr>
+          <w:tblHeader/>
+        </w:trPr>
+        <w:tc>
+          <w:tcPr>
+            <w:tcW w:type="dxa" w:w="3000"/>
+            <w:tcBorders>
+              <w:top w:val="single" w:color="B8C4C8" w:sz="4"/>
+              <w:left w:val="single" w:color="B8C4C8" w:sz="4"/>
+              <w:bottom w:val="single" w:color="B8C4C8" w:sz="4"/>
+              <w:right w:val="single" w:color="B8C4C8" w:sz="4"/>
+            </w:tcBorders>
+            <w:shd w:fill="D5E8EC" w:val="clear"/>
+            <w:tcMar>
+              <w:top w:type="dxa" w:w="60"/>
+              <w:left w:type="dxa" w:w="100"/>
+              <w:bottom w:type="dxa" w:w="60"/>
+              <w:right w:type="dxa" w:w="100"/>
+            </w:tcMar>
+          </w:tcPr>
+          <w:p>
+            <w:r>
+              <w:rPr>
+                <w:rFonts w:ascii="Calibri" w:cs="Calibri" w:eastAsia="Calibri" w:hAnsi="Calibri"/>
+                <w:b/>
+                <w:bCs/>
+              </w:rPr>
+              <w:t xml:space="preserve">When</w:t>
+            </w:r>
+          </w:p>
+        </w:tc>
+        <w:tc>
+          <w:tcPr>
+            <w:tcW w:type="dxa" w:w="6360"/>
+            <w:tcBorders>
+              <w:top w:val="single" w:color="B8C4C8" w:sz="4"/>
+              <w:left w:val="single" w:color="B8C4C8" w:sz="4"/>
+              <w:bottom w:val="single" w:color="B8C4C8" w:sz="4"/>
+              <w:right w:val="single" w:color="B8C4C8" w:sz="4"/>
+            </w:tcBorders>
+            <w:shd w:fill="D5E8EC" w:val="clear"/>
+            <w:tcMar>
+              <w:top w:type="dxa" w:w="60"/>
+              <w:left w:type="dxa" w:w="100"/>
+              <w:bottom w:type="dxa" w:w="60"/>
+              <w:right w:type="dxa" w:w="100"/>
+            </w:tcMar>
+          </w:tcPr>
+          <w:p>
+            <w:r>
+              <w:rPr>
+                <w:rFonts w:ascii="Calibri" w:cs="Calibri" w:eastAsia="Calibri" w:hAnsi="Calibri"/>
+                <w:b/>
+                <w:bCs/>
+              </w:rPr>
+              <w:t xml:space="preserve">What</w:t>
+            </w:r>
+          </w:p>
+        </w:tc>
+      </w:tr>
+      <w:tr>
+        <w:trPr>
+          <w:tblHeader w:val="off"/>
+        </w:trPr>
+        <w:tc>
+          <w:tcPr>
+            <w:tcW w:type="dxa" w:w="3000"/>
+            <w:tcBorders>
+              <w:top w:val="single" w:color="B8C4C8" w:sz="4"/>
+              <w:left w:val="single" w:color="B8C4C8" w:sz="4"/>
+              <w:bottom w:val="single" w:color="B8C4C8" w:sz="4"/>
+              <w:right w:val="single" w:color="B8C4C8" w:sz="4"/>
+            </w:tcBorders>
+            <w:tcMar>
+              <w:top w:type="dxa" w:w="60"/>
+              <w:left w:type="dxa" w:w="100"/>
+              <w:bottom w:type="dxa" w:w="60"/>
+              <w:right w:type="dxa" w:w="100"/>
+            </w:tcMar>
+          </w:tcPr>
+          <w:p>
+            <w:r>
+              <w:rPr>
+                <w:rFonts w:ascii="Calibri" w:cs="Calibri" w:eastAsia="Calibri" w:hAnsi="Calibri"/>
+              </w:rPr>
+              <w:t xml:space="preserve">About 1.5 days before the briefing</w:t>
+            </w:r>
+          </w:p>
+        </w:tc>
+        <w:tc>
+          <w:tcPr>
+            <w:tcW w:type="dxa" w:w="6360"/>
+            <w:tcBorders>
+              <w:top w:val="single" w:color="B8C4C8" w:sz="4"/>
+              <w:left w:val="single" w:color="B8C4C8" w:sz="4"/>
+              <w:bottom w:val="single" w:color="B8C4C8" w:sz="4"/>
+              <w:right w:val="single" w:color="B8C4C8" w:sz="4"/>
+            </w:tcBorders>
+            <w:tcMar>
+              <w:top w:type="dxa" w:w="60"/>
+              <w:left w:type="dxa" w:w="100"/>
+              <w:bottom w:type="dxa" w:w="60"/>
+              <w:right w:type="dxa" w:w="100"/>
+            </w:tcMar>
+          </w:tcPr>
+          <w:p>
+            <w:r>
+              <w:rPr>
+                <w:rFonts w:ascii="Calibri" w:cs="Calibri" w:eastAsia="Calibri" w:hAnsi="Calibri"/>
+              </w:rPr>
+              <w:t xml:space="preserve">The Calloway's Pride crashes. Her cold-chain cells are good for 6 days without power.</w:t>
+            </w:r>
+          </w:p>
+        </w:tc>
+      </w:tr>
+      <w:tr>
+        <w:trPr>
+          <w:tblHeader w:val="off"/>
+        </w:trPr>
+        <w:tc>
+          <w:tcPr>
+            <w:tcW w:type="dxa" w:w="3000"/>
+            <w:tcBorders>
+              <w:top w:val="single" w:color="B8C4C8" w:sz="4"/>
+              <w:left w:val="single" w:color="B8C4C8" w:sz="4"/>
+              <w:bottom w:val="single" w:color="B8C4C8" w:sz="4"/>
+              <w:right w:val="single" w:color="B8C4C8" w:sz="4"/>
+            </w:tcBorders>
+            <w:tcMar>
+              <w:top w:type="dxa" w:w="60"/>
+              <w:left w:type="dxa" w:w="100"/>
+              <w:bottom w:type="dxa" w:w="60"/>
+              <w:right w:type="dxa" w:w="100"/>
+            </w:tcMar>
+          </w:tcPr>
+          <w:p>
+            <w:r>
+              <w:rPr>
+                <w:rFonts w:ascii="Calibri" w:cs="Calibri" w:eastAsia="Calibri" w:hAnsi="Calibri"/>
+              </w:rPr>
+              <w:t xml:space="preserve">Briefing</w:t>
+            </w:r>
+          </w:p>
+        </w:tc>
+        <w:tc>
+          <w:tcPr>
+            <w:tcW w:type="dxa" w:w="6360"/>
+            <w:tcBorders>
+              <w:top w:val="single" w:color="B8C4C8" w:sz="4"/>
+              <w:left w:val="single" w:color="B8C4C8" w:sz="4"/>
+              <w:bottom w:val="single" w:color="B8C4C8" w:sz="4"/>
+              <w:right w:val="single" w:color="B8C4C8" w:sz="4"/>
+            </w:tcBorders>
+            <w:tcMar>
+              <w:top w:type="dxa" w:w="60"/>
+              <w:left w:type="dxa" w:w="100"/>
+              <w:bottom w:type="dxa" w:w="60"/>
+              <w:right w:type="dxa" w:w="100"/>
+            </w:tcMar>
+          </w:tcPr>
+          <w:p>
+            <w:r>
+              <w:rPr>
+                <w:rFonts w:ascii="Calibri" w:cs="Calibri" w:eastAsia="Calibri" w:hAnsi="Calibri"/>
+              </w:rPr>
+              <w:t xml:space="preserve">Kell hires the party. Marrow-Thane's salvage crew leaves for Cinder ahead of them, while the party is still with Kell.</w:t>
+            </w:r>
+          </w:p>
+        </w:tc>
+      </w:tr>
+      <w:tr>
+        <w:trPr>
+          <w:tblHeader w:val="off"/>
+        </w:trPr>
+        <w:tc>
+          <w:tcPr>
+            <w:tcW w:type="dxa" w:w="3000"/>
+            <w:tcBorders>
+              <w:top w:val="single" w:color="B8C4C8" w:sz="4"/>
+              <w:left w:val="single" w:color="B8C4C8" w:sz="4"/>
+              <w:bottom w:val="single" w:color="B8C4C8" w:sz="4"/>
+              <w:right w:val="single" w:color="B8C4C8" w:sz="4"/>
+            </w:tcBorders>
+            <w:tcMar>
+              <w:top w:type="dxa" w:w="60"/>
+              <w:left w:type="dxa" w:w="100"/>
+              <w:bottom w:type="dxa" w:w="60"/>
+              <w:right w:type="dxa" w:w="100"/>
+            </w:tcMar>
+          </w:tcPr>
+          <w:p>
+            <w:r>
+              <w:rPr>
+                <w:rFonts w:ascii="Calibri" w:cs="Calibri" w:eastAsia="Calibri" w:hAnsi="Calibri"/>
+              </w:rPr>
+              <w:t xml:space="preserve">Briefing + about 6 hours</w:t>
+            </w:r>
+          </w:p>
+        </w:tc>
+        <w:tc>
+          <w:tcPr>
+            <w:tcW w:type="dxa" w:w="6360"/>
+            <w:tcBorders>
+              <w:top w:val="single" w:color="B8C4C8" w:sz="4"/>
+              <w:left w:val="single" w:color="B8C4C8" w:sz="4"/>
+              <w:bottom w:val="single" w:color="B8C4C8" w:sz="4"/>
+              <w:right w:val="single" w:color="B8C4C8" w:sz="4"/>
+            </w:tcBorders>
+            <w:tcMar>
+              <w:top w:type="dxa" w:w="60"/>
+              <w:left w:type="dxa" w:w="100"/>
+              <w:bottom w:type="dxa" w:w="60"/>
+              <w:right w:type="dxa" w:w="100"/>
+            </w:tcMar>
+          </w:tcPr>
+          <w:p>
+            <w:r>
+              <w:rPr>
+                <w:rFonts w:ascii="Calibri" w:cs="Calibri" w:eastAsia="Calibri" w:hAnsi="Calibri"/>
+              </w:rPr>
+              <w:t xml:space="preserve">The party leaves the starport after prep. The Admin or Broker check for Link 1 of the chain can be made before they go.</w:t>
+            </w:r>
+          </w:p>
+        </w:tc>
+      </w:tr>
+      <w:tr>
+        <w:trPr>
+          <w:tblHeader w:val="off"/>
+        </w:trPr>
+        <w:tc>
+          <w:tcPr>
+            <w:tcW w:type="dxa" w:w="3000"/>
+            <w:tcBorders>
+              <w:top w:val="single" w:color="B8C4C8" w:sz="4"/>
+              <w:left w:val="single" w:color="B8C4C8" w:sz="4"/>
+              <w:bottom w:val="single" w:color="B8C4C8" w:sz="4"/>
+              <w:right w:val="single" w:color="B8C4C8" w:sz="4"/>
+            </w:tcBorders>
+            <w:tcMar>
+              <w:top w:type="dxa" w:w="60"/>
+              <w:left w:type="dxa" w:w="100"/>
+              <w:bottom w:type="dxa" w:w="60"/>
+              <w:right w:type="dxa" w:w="100"/>
+            </w:tcMar>
+          </w:tcPr>
+          <w:p>
+            <w:r>
+              <w:rPr>
+                <w:rFonts w:ascii="Calibri" w:cs="Calibri" w:eastAsia="Calibri" w:hAnsi="Calibri"/>
+              </w:rPr>
+              <w:t xml:space="preserve">Briefing + about 73 hours</w:t>
+            </w:r>
+          </w:p>
+        </w:tc>
+        <w:tc>
+          <w:tcPr>
+            <w:tcW w:type="dxa" w:w="6360"/>
+            <w:tcBorders>
+              <w:top w:val="single" w:color="B8C4C8" w:sz="4"/>
+              <w:left w:val="single" w:color="B8C4C8" w:sz="4"/>
+              <w:bottom w:val="single" w:color="B8C4C8" w:sz="4"/>
+              <w:right w:val="single" w:color="B8C4C8" w:sz="4"/>
+            </w:tcBorders>
+            <w:tcMar>
+              <w:top w:type="dxa" w:w="60"/>
+              <w:left w:type="dxa" w:w="100"/>
+              <w:bottom w:type="dxa" w:w="60"/>
+              <w:right w:type="dxa" w:w="100"/>
+            </w:tcMar>
+          </w:tcPr>
+          <w:p>
+            <w:r>
+              <w:rPr>
+                <w:rFonts w:ascii="Calibri" w:cs="Calibri" w:eastAsia="Calibri" w:hAnsi="Calibri"/>
+              </w:rPr>
+              <w:t xml:space="preserve">The party arrives in orbit around Cinder and runs the scan (3 hours by default).</w:t>
+            </w:r>
+          </w:p>
+        </w:tc>
+      </w:tr>
+      <w:tr>
+        <w:trPr>
+          <w:tblHeader w:val="off"/>
+        </w:trPr>
+        <w:tc>
+          <w:tcPr>
+            <w:tcW w:type="dxa" w:w="3000"/>
+            <w:tcBorders>
+              <w:top w:val="single" w:color="B8C4C8" w:sz="4"/>
+              <w:left w:val="single" w:color="B8C4C8" w:sz="4"/>
+              <w:bottom w:val="single" w:color="B8C4C8" w:sz="4"/>
+              <w:right w:val="single" w:color="B8C4C8" w:sz="4"/>
+            </w:tcBorders>
+            <w:tcMar>
+              <w:top w:type="dxa" w:w="60"/>
+              <w:left w:type="dxa" w:w="100"/>
+              <w:bottom w:type="dxa" w:w="60"/>
+              <w:right w:type="dxa" w:w="100"/>
+            </w:tcMar>
+          </w:tcPr>
+          <w:p>
+            <w:r>
+              <w:rPr>
+                <w:rFonts w:ascii="Calibri" w:cs="Calibri" w:eastAsia="Calibri" w:hAnsi="Calibri"/>
+              </w:rPr>
+              <w:t xml:space="preserve">Briefing + about 77 hours</w:t>
+            </w:r>
+          </w:p>
+        </w:tc>
+        <w:tc>
+          <w:tcPr>
+            <w:tcW w:type="dxa" w:w="6360"/>
+            <w:tcBorders>
+              <w:top w:val="single" w:color="B8C4C8" w:sz="4"/>
+              <w:left w:val="single" w:color="B8C4C8" w:sz="4"/>
+              <w:bottom w:val="single" w:color="B8C4C8" w:sz="4"/>
+              <w:right w:val="single" w:color="B8C4C8" w:sz="4"/>
+            </w:tcBorders>
+            <w:tcMar>
+              <w:top w:type="dxa" w:w="60"/>
+              <w:left w:type="dxa" w:w="100"/>
+              <w:bottom w:type="dxa" w:w="60"/>
+              <w:right w:type="dxa" w:w="100"/>
+            </w:tcMar>
+          </w:tcPr>
+          <w:p>
+            <w:r>
+              <w:rPr>
+                <w:rFonts w:ascii="Calibri" w:cs="Calibri" w:eastAsia="Calibri" w:hAnsi="Calibri"/>
+              </w:rPr>
+              <w:t xml:space="preserve">The party lands. This is hour 0 on the clock below. About 4.5 days after the crash, the cells have about 36 hours left. The rivals have been at the wreck for about 6 hours.</w:t>
+            </w:r>
+          </w:p>
+        </w:tc>
+      </w:tr>
+      <w:tr>
+        <w:trPr>
+          <w:tblHeader w:val="off"/>
+        </w:trPr>
+        <w:tc>
+          <w:tcPr>
+            <w:tcW w:type="dxa" w:w="3000"/>
+            <w:tcBorders>
+              <w:top w:val="single" w:color="B8C4C8" w:sz="4"/>
+              <w:left w:val="single" w:color="B8C4C8" w:sz="4"/>
+              <w:bottom w:val="single" w:color="B8C4C8" w:sz="4"/>
+              <w:right w:val="single" w:color="B8C4C8" w:sz="4"/>
+            </w:tcBorders>
+            <w:tcMar>
+              <w:top w:type="dxa" w:w="60"/>
+              <w:left w:type="dxa" w:w="100"/>
+              <w:bottom w:type="dxa" w:w="60"/>
+              <w:right w:type="dxa" w:w="100"/>
+            </w:tcMar>
+          </w:tcPr>
+          <w:p>
+            <w:r>
+              <w:rPr>
+                <w:rFonts w:ascii="Calibri" w:cs="Calibri" w:eastAsia="Calibri" w:hAnsi="Calibri"/>
+              </w:rPr>
+              <w:t xml:space="preserve">Landing + 24 hours</w:t>
+            </w:r>
+          </w:p>
+        </w:tc>
+        <w:tc>
+          <w:tcPr>
+            <w:tcW w:type="dxa" w:w="6360"/>
+            <w:tcBorders>
+              <w:top w:val="single" w:color="B8C4C8" w:sz="4"/>
+              <w:left w:val="single" w:color="B8C4C8" w:sz="4"/>
+              <w:bottom w:val="single" w:color="B8C4C8" w:sz="4"/>
+              <w:right w:val="single" w:color="B8C4C8" w:sz="4"/>
+            </w:tcBorders>
+            <w:tcMar>
+              <w:top w:type="dxa" w:w="60"/>
+              <w:left w:type="dxa" w:w="100"/>
+              <w:bottom w:type="dxa" w:w="60"/>
+              <w:right w:type="dxa" w:w="100"/>
+            </w:tcMar>
+          </w:tcPr>
+          <w:p>
+            <w:r>
+              <w:rPr>
+                <w:rFonts w:ascii="Calibri" w:cs="Calibri" w:eastAsia="Calibri" w:hAnsi="Calibri"/>
+              </w:rPr>
+              <w:t xml:space="preserve">Last chance to lift off and still make the 7-day speed bonus.</w:t>
+            </w:r>
+          </w:p>
+        </w:tc>
+      </w:tr>
+    </w:tbl>
+    <w:p>
+      <w:pPr>
+        <w:spacing w:after="80"/>
+      </w:pPr>
+    </w:p>
+    <w:p>
+      <w:pPr>
+        <w:pStyle w:val="Heading3"/>
+        <w:spacing w:after="80" w:before="160"/>
+      </w:pPr>
+      <w:r>
+        <w:rPr>
+          <w:rFonts w:ascii="Calibri" w:cs="Calibri" w:eastAsia="Calibri" w:hAnsi="Calibri"/>
+        </w:rPr>
         <w:t xml:space="preserve">The clock</w:t>
       </w:r>
     </w:p>
@@ -1320,7 +1756,7 @@
         <w:rPr>
           <w:rFonts w:ascii="Calibri" w:cs="Calibri" w:eastAsia="Calibri" w:hAnsi="Calibri"/>
         </w:rPr>
-        <w:t xml:space="preserve">Track time on a piece of paper that all the players can see. Time starts when the party lands. Each of the following is a deadline, not a suggestion.</w:t>
+        <w:t xml:space="preserve">Track time on a piece of paper that all the players can see. Time starts when the party lands. Each of the following is a deadline, not a suggestion. The rivals' times move with the scan result in Scene 2: for each hour the scan takes over 3 hours, move every rival event one hour earlier (to hour 0 at the earliest); for each hour under 3, move them one hour later.</w:t>
       </w:r>
     </w:p>
     <w:tbl>
@@ -1450,7 +1886,7 @@
               <w:rPr>
                 <w:rFonts w:ascii="Calibri" w:cs="Calibri" w:eastAsia="Calibri" w:hAnsi="Calibri"/>
               </w:rPr>
-              <w:t xml:space="preserve">The party lands (Scene 3). The rival crew has been at the wreck for 6 hours already.</w:t>
+              <w:t xml:space="preserve">The party lands (Scene 3). The rival crew has been at the wreck for 6 hours. Their cutting gear keeps failing.</w:t>
             </w:r>
           </w:p>
         </w:tc>
@@ -1505,7 +1941,7 @@
               <w:rPr>
                 <w:rFonts w:ascii="Calibri" w:cs="Calibri" w:eastAsia="Calibri" w:hAnsi="Calibri"/>
               </w:rPr>
-              <w:t xml:space="preserve">The rival crew breaks through the cargo hatch outer plate. If the party is watching the wreck, they hear the cutting stop.</w:t>
+              <w:t xml:space="preserve">The rivals cut through the outer plate of the east cargo hatch. If the party is watching the wreck, they hear the cutting stop.</w:t>
             </w:r>
           </w:p>
         </w:tc>
@@ -1560,7 +1996,7 @@
               <w:rPr>
                 <w:rFonts w:ascii="Calibri" w:cs="Calibri" w:eastAsia="Calibri" w:hAnsi="Calibri"/>
               </w:rPr>
-              <w:t xml:space="preserve">The rivals finish cutting into the hold and start carrying containers out on their freight sled. (If the party hasn't dealt with them, they lose a container every hour.)</w:t>
+              <w:t xml:space="preserve">The rivals force the airlock's inner door and start carrying containers out on their freight sled. (If the party hasn't dealt with them, they lose a container every hour.)</w:t>
             </w:r>
           </w:p>
         </w:tc>
@@ -1645,7 +2081,7 @@
               <w:rPr>
                 <w:rFonts w:ascii="Calibri" w:cs="Calibri" w:eastAsia="Calibri" w:hAnsi="Calibri"/>
               </w:rPr>
-              <w:t xml:space="preserve">Nightfall (14 hrs)</w:t>
+              <w:t xml:space="preserve">14 hrs</w:t>
             </w:r>
           </w:p>
         </w:tc>
@@ -1670,7 +2106,117 @@
               <w:rPr>
                 <w:rFonts w:ascii="Calibri" w:cs="Calibri" w:eastAsia="Calibri" w:hAnsi="Calibri"/>
               </w:rPr>
-              <w:t xml:space="preserve">Temperature drops to -40 C. Cold damage applies to anyone without proper gear.</w:t>
+              <w:t xml:space="preserve">Nightfall. Temperature drops to -40 C. Cold damage applies to anyone without proper gear.</w:t>
+            </w:r>
+          </w:p>
+        </w:tc>
+      </w:tr>
+      <w:tr>
+        <w:trPr>
+          <w:tblHeader w:val="off"/>
+        </w:trPr>
+        <w:tc>
+          <w:tcPr>
+            <w:tcW w:type="dxa" w:w="2200"/>
+            <w:tcBorders>
+              <w:top w:val="single" w:color="B8C4C8" w:sz="4"/>
+              <w:left w:val="single" w:color="B8C4C8" w:sz="4"/>
+              <w:bottom w:val="single" w:color="B8C4C8" w:sz="4"/>
+              <w:right w:val="single" w:color="B8C4C8" w:sz="4"/>
+            </w:tcBorders>
+            <w:tcMar>
+              <w:top w:type="dxa" w:w="60"/>
+              <w:left w:type="dxa" w:w="100"/>
+              <w:bottom w:type="dxa" w:w="60"/>
+              <w:right w:type="dxa" w:w="100"/>
+            </w:tcMar>
+          </w:tcPr>
+          <w:p>
+            <w:r>
+              <w:rPr>
+                <w:rFonts w:ascii="Calibri" w:cs="Calibri" w:eastAsia="Calibri" w:hAnsi="Calibri"/>
+              </w:rPr>
+              <w:t xml:space="preserve">24 hrs</w:t>
+            </w:r>
+          </w:p>
+        </w:tc>
+        <w:tc>
+          <w:tcPr>
+            <w:tcW w:type="dxa" w:w="7160"/>
+            <w:tcBorders>
+              <w:top w:val="single" w:color="B8C4C8" w:sz="4"/>
+              <w:left w:val="single" w:color="B8C4C8" w:sz="4"/>
+              <w:bottom w:val="single" w:color="B8C4C8" w:sz="4"/>
+              <w:right w:val="single" w:color="B8C4C8" w:sz="4"/>
+            </w:tcBorders>
+            <w:tcMar>
+              <w:top w:type="dxa" w:w="60"/>
+              <w:left w:type="dxa" w:w="100"/>
+              <w:bottom w:type="dxa" w:w="60"/>
+              <w:right w:type="dxa" w:w="100"/>
+            </w:tcMar>
+          </w:tcPr>
+          <w:p>
+            <w:r>
+              <w:rPr>
+                <w:rFonts w:ascii="Calibri" w:cs="Calibri" w:eastAsia="Calibri" w:hAnsi="Calibri"/>
+              </w:rPr>
+              <w:t xml:space="preserve">The speed bonus window closes (lift-off must be by now).</w:t>
+            </w:r>
+          </w:p>
+        </w:tc>
+      </w:tr>
+      <w:tr>
+        <w:trPr>
+          <w:tblHeader w:val="off"/>
+        </w:trPr>
+        <w:tc>
+          <w:tcPr>
+            <w:tcW w:type="dxa" w:w="2200"/>
+            <w:tcBorders>
+              <w:top w:val="single" w:color="B8C4C8" w:sz="4"/>
+              <w:left w:val="single" w:color="B8C4C8" w:sz="4"/>
+              <w:bottom w:val="single" w:color="B8C4C8" w:sz="4"/>
+              <w:right w:val="single" w:color="B8C4C8" w:sz="4"/>
+            </w:tcBorders>
+            <w:tcMar>
+              <w:top w:type="dxa" w:w="60"/>
+              <w:left w:type="dxa" w:w="100"/>
+              <w:bottom w:type="dxa" w:w="60"/>
+              <w:right w:type="dxa" w:w="100"/>
+            </w:tcMar>
+          </w:tcPr>
+          <w:p>
+            <w:r>
+              <w:rPr>
+                <w:rFonts w:ascii="Calibri" w:cs="Calibri" w:eastAsia="Calibri" w:hAnsi="Calibri"/>
+              </w:rPr>
+              <w:t xml:space="preserve">36 hrs</w:t>
+            </w:r>
+          </w:p>
+        </w:tc>
+        <w:tc>
+          <w:tcPr>
+            <w:tcW w:type="dxa" w:w="7160"/>
+            <w:tcBorders>
+              <w:top w:val="single" w:color="B8C4C8" w:sz="4"/>
+              <w:left w:val="single" w:color="B8C4C8" w:sz="4"/>
+              <w:bottom w:val="single" w:color="B8C4C8" w:sz="4"/>
+              <w:right w:val="single" w:color="B8C4C8" w:sz="4"/>
+            </w:tcBorders>
+            <w:tcMar>
+              <w:top w:type="dxa" w:w="60"/>
+              <w:left w:type="dxa" w:w="100"/>
+              <w:bottom w:type="dxa" w:w="60"/>
+              <w:right w:type="dxa" w:w="100"/>
+            </w:tcMar>
+          </w:tcPr>
+          <w:p>
+            <w:r>
+              <w:rPr>
+                <w:rFonts w:ascii="Calibri" w:cs="Calibri" w:eastAsia="Calibri" w:hAnsi="Calibri"/>
+              </w:rPr>
+              <w:t xml:space="preserve">The cold-chain cells fail, unless power has been restored in the wreck (Scene 5). Restoring power stops this timer.</w:t>
             </w:r>
           </w:p>
         </w:tc>
@@ -1701,7 +2247,7 @@
         <w:rPr>
           <w:rFonts w:ascii="Calibri" w:cs="Calibri" w:eastAsia="Calibri" w:hAnsi="Calibri"/>
         </w:rPr>
-        <w:t xml:space="preserve">The party wins this scene by arriving at Cinder safely and learning what they will face. Teaches: jump travel and the 100-diameter limit (Core pp.145-147, 160).</w:t>
+        <w:t xml:space="preserve">The party wins this scene by reaching Cinder's orbit safely and learning what they will face. Teaches: in-system travel, Thrust and flight time, and spotting another ship on sensors.</w:t>
       </w:r>
     </w:p>
     <w:p>
@@ -1737,7 +2283,7 @@
         <w:rPr>
           <w:rFonts w:ascii="Calibri" w:cs="Calibri" w:eastAsia="Calibri" w:hAnsi="Calibri"/>
         </w:rPr>
-        <w:t xml:space="preserve"> Give the players a chance to ask Kell questions and shop. Everything Kell knows is in the table below. The party can also use Broker, Admin, or Streetwise to dig for more (see Link 1 of the chain in Scene 2, which this prep feeds).</w:t>
+        <w:t xml:space="preserve"> Give the players a chance to ask Kell questions and shop. Everything Kell knows is in the table below. The party can make the Admin or Broker check for Link 1 of the Scene 2 chain now, at the starport, or later from the ship.</w:t>
       </w:r>
     </w:p>
     <w:p>
@@ -1755,13 +2301,13 @@
           <w:b/>
           <w:bCs/>
         </w:rPr>
-        <w:t xml:space="preserve">Plotting the jump.</w:t>
-      </w:r>
-      <w:r>
-        <w:rPr>
-          <w:rFonts w:ascii="Calibri" w:cs="Calibri" w:eastAsia="Calibri" w:hAnsi="Calibri"/>
-        </w:rPr>
-        <w:t xml:space="preserve"> The pilot or navigator makes a Routine (6+) Astrogation check for a 1-parsec jump. The engineer checks the J-drive with an Easy (4+) Engineer (j-drive) check before entering jump space. A failure on either is a delay of 1D hours and a nervous crew, not a disaster.</w:t>
+        <w:t xml:space="preserve">The expense advance and the straps.</w:t>
+      </w:r>
+      <w:r>
+        <w:rPr>
+          <w:rFonts w:ascii="Calibri" w:cs="Calibri" w:eastAsia="Calibri" w:hAnsi="Calibri"/>
+        </w:rPr>
+        <w:t xml:space="preserve"> Kell hands over Cr5,000 for expenses. If a player asks how they plan to move twelve containers, he offers to lend them four grav-lev straps (see Scene 6). They go back to him afterwards.</w:t>
       </w:r>
     </w:p>
     <w:p>
@@ -1779,13 +2325,37 @@
           <w:b/>
           <w:bCs/>
         </w:rPr>
-        <w:t xml:space="preserve">Jump space.</w:t>
-      </w:r>
-      <w:r>
-        <w:rPr>
-          <w:rFonts w:ascii="Calibri" w:cs="Calibri" w:eastAsia="Calibri" w:hAnsi="Calibri"/>
-        </w:rPr>
-        <w:t xml:space="preserve"> The jump takes 148 + 6D hours. Use the downtime for a quiet scene: the party can plan, brief, and swap theories. Players who are quiet at this point are usually the ones with a plan; ask them what it is.</w:t>
+        <w:t xml:space="preserve">The flight.</w:t>
+      </w:r>
+      <w:r>
+        <w:rPr>
+          <w:rFonts w:ascii="Calibri" w:cs="Calibri" w:eastAsia="Calibri" w:hAnsi="Calibri"/>
+        </w:rPr>
+        <w:t xml:space="preserve"> Cinder is 2.8 days away at Thrust 1. Use the downtime for a quiet scene: the party can plan, brief and swap theories. Players who are quiet at this point are usually the ones with a plan; ask them what it is.</w:t>
+      </w:r>
+    </w:p>
+    <w:p>
+      <w:pPr>
+        <w:pStyle w:val="ListParagraph"/>
+        <w:numPr>
+          <w:ilvl w:val="0"/>
+          <w:numId w:val="2"/>
+        </w:numPr>
+        <w:spacing w:after="60"/>
+      </w:pPr>
+      <w:r>
+        <w:rPr>
+          <w:rFonts w:ascii="Calibri" w:cs="Calibri" w:eastAsia="Calibri" w:hAnsi="Calibri"/>
+          <w:b/>
+          <w:bCs/>
+        </w:rPr>
+        <w:t xml:space="preserve">Faster ships.</w:t>
+      </w:r>
+      <w:r>
+        <w:rPr>
+          <w:rFonts w:ascii="Calibri" w:cs="Calibri" w:eastAsia="Calibri" w:hAnsi="Calibri"/>
+        </w:rPr>
+        <w:t xml:space="preserve"> Travel time falls with the square root of Thrust: about 2.0 days at Thrust 2 and 1.6 days at Thrust 3. A faster ship has more slack on the 7-day bonus, so you may want to use the slower figure if the party's ship is quick.</w:t>
       </w:r>
     </w:p>
     <w:p>
@@ -1982,7 +2552,7 @@
               <w:rPr>
                 <w:rFonts w:ascii="Calibri" w:cs="Calibri" w:eastAsia="Calibri" w:hAnsi="Calibri"/>
               </w:rPr>
-              <w:t xml:space="preserve">"Anyone who reads the lane reports. Eleven days is long enough for a crew with a fast ship."</w:t>
+              <w:t xml:space="preserve">"Anyone who reads the lane reports. A crew with a fast ship could already be on its way."</w:t>
             </w:r>
           </w:p>
         </w:tc>
@@ -2037,7 +2607,7 @@
               <w:rPr>
                 <w:rFonts w:ascii="Calibri" w:cs="Calibri" w:eastAsia="Calibri" w:hAnsi="Calibri"/>
               </w:rPr>
-              <w:t xml:space="preserve">"To the clinics? A million. To me? A payout I'd rather not make."</w:t>
+              <w:t xml:space="preserve">"To the clinics? A million credits (MCr1). But before you get any ideas: the containers are already flagged as stolen on every registry I can reach. Anyone who tries to sell them will be blacklisted from contracts for good."</w:t>
             </w:r>
           </w:p>
         </w:tc>
@@ -2092,7 +2662,7 @@
               <w:rPr>
                 <w:rFonts w:ascii="Calibri" w:cs="Calibri" w:eastAsia="Calibri" w:hAnsi="Calibri"/>
               </w:rPr>
-              <w:t xml:space="preserve">"The Pride went off the scopes at 40,000 km above the northern hemisphere. After that, nothing. Her beacon never fired."</w:t>
+              <w:t xml:space="preserve">"The Pride lost contact somewhere over the northern hemisphere on her way down. That's all I have, and her beacon never fired. The rest is up to you."</w:t>
             </w:r>
           </w:p>
         </w:tc>
@@ -2147,7 +2717,62 @@
               <w:rPr>
                 <w:rFonts w:ascii="Calibri" w:cs="Calibri" w:eastAsia="Calibri" w:hAnsi="Calibri"/>
               </w:rPr>
-              <w:t xml:space="preserve">"Cargo holds are locked from the bridge. If the bridge is dead, the hold is sealed. There's a manual override on the control panel inside the hold, but you'd need to open it first."</w:t>
+              <w:t xml:space="preserve">"Cargo holds are locked from the bridge. If the bridge is dead, there's a local panel at the hold door, but it'll want power."</w:t>
+            </w:r>
+          </w:p>
+        </w:tc>
+      </w:tr>
+      <w:tr>
+        <w:trPr>
+          <w:tblHeader w:val="off"/>
+        </w:trPr>
+        <w:tc>
+          <w:tcPr>
+            <w:tcW w:type="dxa" w:w="3200"/>
+            <w:tcBorders>
+              <w:top w:val="single" w:color="B8C4C8" w:sz="4"/>
+              <w:left w:val="single" w:color="B8C4C8" w:sz="4"/>
+              <w:bottom w:val="single" w:color="B8C4C8" w:sz="4"/>
+              <w:right w:val="single" w:color="B8C4C8" w:sz="4"/>
+            </w:tcBorders>
+            <w:tcMar>
+              <w:top w:type="dxa" w:w="60"/>
+              <w:left w:type="dxa" w:w="100"/>
+              <w:bottom w:type="dxa" w:w="60"/>
+              <w:right w:type="dxa" w:w="100"/>
+            </w:tcMar>
+          </w:tcPr>
+          <w:p>
+            <w:r>
+              <w:rPr>
+                <w:rFonts w:ascii="Calibri" w:cs="Calibri" w:eastAsia="Calibri" w:hAnsi="Calibri"/>
+              </w:rPr>
+              <w:t xml:space="preserve">Can you lend us anything?</w:t>
+            </w:r>
+          </w:p>
+        </w:tc>
+        <w:tc>
+          <w:tcPr>
+            <w:tcW w:type="dxa" w:w="6160"/>
+            <w:tcBorders>
+              <w:top w:val="single" w:color="B8C4C8" w:sz="4"/>
+              <w:left w:val="single" w:color="B8C4C8" w:sz="4"/>
+              <w:bottom w:val="single" w:color="B8C4C8" w:sz="4"/>
+              <w:right w:val="single" w:color="B8C4C8" w:sz="4"/>
+            </w:tcBorders>
+            <w:tcMar>
+              <w:top w:type="dxa" w:w="60"/>
+              <w:left w:type="dxa" w:w="100"/>
+              <w:bottom w:type="dxa" w:w="60"/>
+              <w:right w:type="dxa" w:w="100"/>
+            </w:tcMar>
+          </w:tcPr>
+          <w:p>
+            <w:r>
+              <w:rPr>
+                <w:rFonts w:ascii="Calibri" w:cs="Calibri" w:eastAsia="Calibri" w:hAnsi="Calibri"/>
+              </w:rPr>
+              <w:t xml:space="preserve">"Four grav-lev straps for moving the containers. They come back to me."</w:t>
             </w:r>
           </w:p>
         </w:tc>
@@ -2168,17 +2793,6 @@
           <w:rFonts w:ascii="Calibri" w:cs="Calibri" w:eastAsia="Calibri" w:hAnsi="Calibri"/>
         </w:rPr>
         <w:t xml:space="preserve">Arriving at Cinder</w:t>
-      </w:r>
-    </w:p>
-    <w:p>
-      <w:pPr>
-        <w:spacing w:after="120"/>
-      </w:pPr>
-      <w:r>
-        <w:rPr>
-          <w:rFonts w:ascii="Calibri" w:cs="Calibri" w:eastAsia="Calibri" w:hAnsi="Calibri"/>
-        </w:rPr>
-        <w:t xml:space="preserve">When the party exits jump, read the arrival description and then ask for a Pilot or Navigation check to bring the ship in toward the planet.</w:t>
       </w:r>
     </w:p>
     <w:p>
@@ -2195,7 +2809,7 @@
           <w:i/>
           <w:iCs/>
         </w:rPr>
-        <w:t xml:space="preserve">The jump flare fades. Cinder hangs in the viewport: a small, dun-coloured sphere, banded with grey streaks of ash that swirl from a ring of old volcanoes in the north. The sensors paint a handful of faint things around it. There's the nav buoy, slowly turning. There's a scatter of dark rocks in a loose ring. And there's a ship, parked in low orbit, running quiet.</w:t>
+        <w:t xml:space="preserve">After two days and nineteen hours of quiet burn, Cinder swells in the viewport: a small, dun-coloured sphere, banded with grey streaks of ash that swirl from a ring of old volcanoes in the north. The sensors paint something else in low orbit, a ship, running quiet.</w:t>
       </w:r>
     </w:p>
     <w:p>
@@ -2213,13 +2827,25 @@
           <w:b/>
           <w:bCs/>
         </w:rPr>
-        <w:t xml:space="preserve">The 100-diameter limit.</w:t>
-      </w:r>
-      <w:r>
-        <w:rPr>
-          <w:rFonts w:ascii="Calibri" w:cs="Calibri" w:eastAsia="Calibri" w:hAnsi="Calibri"/>
-        </w:rPr>
-        <w:t xml:space="preserve"> Jump drives can't activate within 100 planetary diameters of a world, which for Cinder is 800,000 km. The party arrived at the limit. Ask the pilot to estimate flight time. At Thrust 1 it is about 5 hours to orbit; at Thrust 2 it is closer to 3.5 hours; at Thrust 3, about 3 hours. Use this to teach why planets are slow to reach.</w:t>
+        <w:t xml:space="preserve">The other ship.</w:t>
+      </w:r>
+      <w:r>
+        <w:rPr>
+          <w:rFonts w:ascii="Calibri" w:cs="Calibri" w:eastAsia="Calibri" w:hAnsi="Calibri"/>
+        </w:rPr>
+        <w:t xml:space="preserve"> It is the rival crew's freighter, the Hard Bargain, a modified Type-J Seeker with one pulse laser turret. She is in orbit on a quiet profile, not at the landing site. Her landing party is already on the ground and the pilot and gunner are waiting aboard. The party can detect her passively with Electronics (sensors) 8+. Attacking her is a poor trade, and the scenario makes that visible rather than forbidding it (see below).</w:t>
+      </w:r>
+    </w:p>
+    <w:p>
+      <w:pPr>
+        <w:pStyle w:val="Heading3"/>
+        <w:spacing w:after="80" w:before="160"/>
+      </w:pPr>
+      <w:r>
+        <w:rPr>
+          <w:rFonts w:ascii="Calibri" w:cs="Calibri" w:eastAsia="Calibri" w:hAnsi="Calibri"/>
+        </w:rPr>
+        <w:t xml:space="preserve">If the party considers attacking the Hard Bargain</w:t>
       </w:r>
     </w:p>
     <w:p>
@@ -2237,25 +2863,13 @@
           <w:b/>
           <w:bCs/>
         </w:rPr>
-        <w:t xml:space="preserve">The other ship.</w:t>
-      </w:r>
-      <w:r>
-        <w:rPr>
-          <w:rFonts w:ascii="Calibri" w:cs="Calibri" w:eastAsia="Calibri" w:hAnsi="Calibri"/>
-        </w:rPr>
-        <w:t xml:space="preserve"> It is the rival crew's freighter, the Hard Bargain, a modified Type-J Seeker with one pulse laser turret. It is in low orbit on a quiet profile, not at the landing site. The pilot has sent a landing party down and is waiting for the freight sled. The party can passively detect it with Electronics (sensors) 8+. Attacking her is a poor trade, and the scenario makes that visible rather than forbidding it (see below).</w:t>
-      </w:r>
-    </w:p>
-    <w:p>
-      <w:pPr>
-        <w:pStyle w:val="Heading3"/>
-        <w:spacing w:after="80" w:before="160"/>
-      </w:pPr>
-      <w:r>
-        <w:rPr>
-          <w:rFonts w:ascii="Calibri" w:cs="Calibri" w:eastAsia="Calibri" w:hAnsi="Calibri"/>
-        </w:rPr>
-        <w:t xml:space="preserve">If the party considers attacking the Hard Bargain</w:t>
+        <w:t xml:space="preserve">Make it unattractive.</w:t>
+      </w:r>
+      <w:r>
+        <w:rPr>
+          <w:rFonts w:ascii="Calibri" w:cs="Calibri" w:eastAsia="Calibri" w:hAnsi="Calibri"/>
+        </w:rPr>
+        <w:t xml:space="preserve"> Every hour spent chasing her in space is an hour the rivals spend on the wreck. She carries a pulse laser turret, so it is a real fight for a trader with nothing to gain. Her pilot and gunner aren't carrying the cargo.</w:t>
       </w:r>
     </w:p>
     <w:p>
@@ -2273,13 +2887,13 @@
           <w:b/>
           <w:bCs/>
         </w:rPr>
-        <w:t xml:space="preserve">Make it unattractive.</w:t>
-      </w:r>
-      <w:r>
-        <w:rPr>
-          <w:rFonts w:ascii="Calibri" w:cs="Calibri" w:eastAsia="Calibri" w:hAnsi="Calibri"/>
-        </w:rPr>
-        <w:t xml:space="preserve"> She is a long burn away, so every hour spent in space is an hour the rivals spend on the hatch. She carries a pulse laser turret, so it is a real fight for a trader with nothing to gain. Her pilot and gunner aren't carrying the cargo.</w:t>
+        <w:t xml:space="preserve">Make it unnecessary.</w:t>
+      </w:r>
+      <w:r>
+        <w:rPr>
+          <w:rFonts w:ascii="Calibri" w:cs="Calibri" w:eastAsia="Calibri" w:hAnsi="Calibri"/>
+        </w:rPr>
+        <w:t xml:space="preserve"> Sensors show the landing party is already on the ground and the ship is only waiting. The real contest is at the wreck.</w:t>
       </w:r>
     </w:p>
     <w:p>
@@ -2297,30 +2911,6 @@
           <w:b/>
           <w:bCs/>
         </w:rPr>
-        <w:t xml:space="preserve">Make it unnecessary.</w:t>
-      </w:r>
-      <w:r>
-        <w:rPr>
-          <w:rFonts w:ascii="Calibri" w:cs="Calibri" w:eastAsia="Calibri" w:hAnsi="Calibri"/>
-        </w:rPr>
-        <w:t xml:space="preserve"> Sensors show the landing party is already on the ground and the ship is only waiting. The real contest is at the wreck.</w:t>
-      </w:r>
-    </w:p>
-    <w:p>
-      <w:pPr>
-        <w:pStyle w:val="ListParagraph"/>
-        <w:numPr>
-          <w:ilvl w:val="0"/>
-          <w:numId w:val="2"/>
-        </w:numPr>
-        <w:spacing w:after="60"/>
-      </w:pPr>
-      <w:r>
-        <w:rPr>
-          <w:rFonts w:ascii="Calibri" w:cs="Calibri" w:eastAsia="Calibri" w:hAnsi="Calibri"/>
-          <w:b/>
-          <w:bCs/>
-        </w:rPr>
         <w:t xml:space="preserve">If they do it anyway.</w:t>
       </w:r>
       <w:r>
@@ -2328,30 +2918,6 @@
           <w:rFonts w:ascii="Calibri" w:cs="Calibri" w:eastAsia="Calibri" w:hAnsi="Calibri"/>
         </w:rPr>
         <w:t xml:space="preserve"> Run it short: the Bargain's pilot breaks off and runs for the far side of the planet, or surrenders and calls Rourke to say they have lost. Rourke is then alerted, so the wreck site in Scene 4 is on guard (DM-2 to Stealth). Or make it a trap: her gunner holds fire until the party is committed, and the Scene 6 return strike arrives early.</w:t>
-      </w:r>
-    </w:p>
-    <w:p>
-      <w:pPr>
-        <w:pStyle w:val="ListParagraph"/>
-        <w:numPr>
-          <w:ilvl w:val="0"/>
-          <w:numId w:val="2"/>
-        </w:numPr>
-        <w:spacing w:after="60"/>
-      </w:pPr>
-      <w:r>
-        <w:rPr>
-          <w:rFonts w:ascii="Calibri" w:cs="Calibri" w:eastAsia="Calibri" w:hAnsi="Calibri"/>
-          <w:b/>
-          <w:bCs/>
-        </w:rPr>
-        <w:t xml:space="preserve">Optional: debris belt.</w:t>
-      </w:r>
-      <w:r>
-        <w:rPr>
-          <w:rFonts w:ascii="Calibri" w:cs="Calibri" w:eastAsia="Calibri" w:hAnsi="Calibri"/>
-        </w:rPr>
-        <w:t xml:space="preserve"> If your table wants a short action beat, the ring of dark rocks is the broken-up remnants of a minor moon. A Pilot (Average, 8+) check avoids a glancing hit that does 1D damage to the ship's hull. This is an opportunity to show a hazard that isn't a person.</w:t>
       </w:r>
     </w:p>
     <w:p>
@@ -2374,7 +2940,7 @@
         <w:rPr>
           <w:rFonts w:ascii="Calibri" w:cs="Calibri" w:eastAsia="Calibri" w:hAnsi="Calibri"/>
         </w:rPr>
-        <w:t xml:space="preserve">The party wins this scene by pinpointing the wreck's location to within a few kilometres. Teaches: skill chains and hacking (Core pp.58-62, 90-92, Companion hacking rules).</w:t>
+        <w:t xml:space="preserve">The party wins this scene by finding the wreck. The wreck is always found. The chain decides how long it takes. Teaches: skill chains, sensors and comms.</w:t>
       </w:r>
     </w:p>
     <w:p>
@@ -2397,7 +2963,7 @@
         <w:rPr>
           <w:rFonts w:ascii="Calibri" w:cs="Calibri" w:eastAsia="Calibri" w:hAnsi="Calibri"/>
         </w:rPr>
-        <w:t xml:space="preserve">A skill chain is a short series of related checks, each handled by a different Traveller (or by the same one). Each link is a normal task check. Success with Effect 2 or more gives the next link in the chain DM+1. A failure doesn't end the chain, but it gives the next link a DM-1 Bane and adds one hour to the clock. The chain is complete when the party has attempted every link. The total of Boons and Banes gives the final precision.</w:t>
+        <w:t xml:space="preserve">A skill chain is a short series of related checks, each made by a different Traveller (or the same one). Each link narrows the search. Each is an Average (8+) task check. The Effect of one check, good or bad, becomes a DM on the next, and only on the next. Cap the carried DM at +3 or -3. The Effect of the last check sets how long the final scan takes.</w:t>
       </w:r>
     </w:p>
     <w:p>
@@ -2425,10 +2991,9 @@
         </w:tblBorders>
       </w:tblPr>
       <w:tblGrid>
-        <w:gridCol w:w="1500"/>
-        <w:gridCol w:w="3000"/>
-        <w:gridCol w:w="1300"/>
-        <w:gridCol w:w="3560"/>
+        <w:gridCol w:w="1700"/>
+        <w:gridCol w:w="3500"/>
+        <w:gridCol w:w="4160"/>
       </w:tblGrid>
       <w:tr>
         <w:trPr>
@@ -2436,7 +3001,7 @@
         </w:trPr>
         <w:tc>
           <w:tcPr>
-            <w:tcW w:type="dxa" w:w="1500"/>
+            <w:tcW w:type="dxa" w:w="1700"/>
             <w:tcBorders>
               <w:top w:val="single" w:color="B8C4C8" w:sz="4"/>
               <w:left w:val="single" w:color="B8C4C8" w:sz="4"/>
@@ -2464,7 +3029,7 @@
         </w:tc>
         <w:tc>
           <w:tcPr>
-            <w:tcW w:type="dxa" w:w="3000"/>
+            <w:tcW w:type="dxa" w:w="3500"/>
             <w:tcBorders>
               <w:top w:val="single" w:color="B8C4C8" w:sz="4"/>
               <w:left w:val="single" w:color="B8C4C8" w:sz="4"/>
@@ -2486,13 +3051,13 @@
                 <w:b/>
                 <w:bCs/>
               </w:rPr>
-              <w:t xml:space="preserve">Task</w:t>
-            </w:r>
-          </w:p>
-        </w:tc>
-        <w:tc>
-          <w:tcPr>
-            <w:tcW w:type="dxa" w:w="1300"/>
+              <w:t xml:space="preserve">Task (all Average, 8+)</w:t>
+            </w:r>
+          </w:p>
+        </w:tc>
+        <w:tc>
+          <w:tcPr>
+            <w:tcW w:type="dxa" w:w="4160"/>
             <w:tcBorders>
               <w:top w:val="single" w:color="B8C4C8" w:sz="4"/>
               <w:left w:val="single" w:color="B8C4C8" w:sz="4"/>
@@ -2514,35 +3079,7 @@
                 <w:b/>
                 <w:bCs/>
               </w:rPr>
-              <w:t xml:space="preserve">Difficulty</w:t>
-            </w:r>
-          </w:p>
-        </w:tc>
-        <w:tc>
-          <w:tcPr>
-            <w:tcW w:type="dxa" w:w="3560"/>
-            <w:tcBorders>
-              <w:top w:val="single" w:color="B8C4C8" w:sz="4"/>
-              <w:left w:val="single" w:color="B8C4C8" w:sz="4"/>
-              <w:bottom w:val="single" w:color="B8C4C8" w:sz="4"/>
-              <w:right w:val="single" w:color="B8C4C8" w:sz="4"/>
-            </w:tcBorders>
-            <w:shd w:fill="D5E8EC" w:val="clear"/>
-            <w:tcMar>
-              <w:top w:type="dxa" w:w="60"/>
-              <w:left w:type="dxa" w:w="100"/>
-              <w:bottom w:type="dxa" w:w="60"/>
-              <w:right w:type="dxa" w:w="100"/>
-            </w:tcMar>
-          </w:tcPr>
-          <w:p>
-            <w:r>
-              <w:rPr>
-                <w:rFonts w:ascii="Calibri" w:cs="Calibri" w:eastAsia="Calibri" w:hAnsi="Calibri"/>
-                <w:b/>
-                <w:bCs/>
-              </w:rPr>
-              <w:t xml:space="preserve">What a success gives</w:t>
+              <w:t xml:space="preserve">What it narrows</w:t>
             </w:r>
           </w:p>
         </w:tc>
@@ -2553,7 +3090,7 @@
         </w:trPr>
         <w:tc>
           <w:tcPr>
-            <w:tcW w:type="dxa" w:w="1500"/>
+            <w:tcW w:type="dxa" w:w="1700"/>
             <w:tcBorders>
               <w:top w:val="single" w:color="B8C4C8" w:sz="4"/>
               <w:left w:val="single" w:color="B8C4C8" w:sz="4"/>
@@ -2578,76 +3115,51 @@
         </w:tc>
         <w:tc>
           <w:tcPr>
-            <w:tcW w:type="dxa" w:w="3000"/>
-            <w:tcBorders>
-              <w:top w:val="single" w:color="B8C4C8" w:sz="4"/>
-              <w:left w:val="single" w:color="B8C4C8" w:sz="4"/>
-              <w:bottom w:val="single" w:color="B8C4C8" w:sz="4"/>
-              <w:right w:val="single" w:color="B8C4C8" w:sz="4"/>
-            </w:tcBorders>
-            <w:tcMar>
-              <w:top w:type="dxa" w:w="60"/>
-              <w:left w:type="dxa" w:w="100"/>
-              <w:bottom w:type="dxa" w:w="60"/>
-              <w:right w:type="dxa" w:w="100"/>
-            </w:tcMar>
-          </w:tcPr>
-          <w:p>
-            <w:r>
-              <w:rPr>
-                <w:rFonts w:ascii="Calibri" w:cs="Calibri" w:eastAsia="Calibri" w:hAnsi="Calibri"/>
-              </w:rPr>
-              <w:t xml:space="preserve">Admin or Streetwise: get the Pride's filed flight plan and her crew's last port of call. Broker works if the party has spent time with Kell.</w:t>
-            </w:r>
-          </w:p>
-        </w:tc>
-        <w:tc>
-          <w:tcPr>
-            <w:tcW w:type="dxa" w:w="1300"/>
-            <w:tcBorders>
-              <w:top w:val="single" w:color="B8C4C8" w:sz="4"/>
-              <w:left w:val="single" w:color="B8C4C8" w:sz="4"/>
-              <w:bottom w:val="single" w:color="B8C4C8" w:sz="4"/>
-              <w:right w:val="single" w:color="B8C4C8" w:sz="4"/>
-            </w:tcBorders>
-            <w:tcMar>
-              <w:top w:type="dxa" w:w="60"/>
-              <w:left w:type="dxa" w:w="100"/>
-              <w:bottom w:type="dxa" w:w="60"/>
-              <w:right w:type="dxa" w:w="100"/>
-            </w:tcMar>
-          </w:tcPr>
-          <w:p>
-            <w:r>
-              <w:rPr>
-                <w:rFonts w:ascii="Calibri" w:cs="Calibri" w:eastAsia="Calibri" w:hAnsi="Calibri"/>
-              </w:rPr>
-              <w:t xml:space="preserve">Average (8+)</w:t>
-            </w:r>
-          </w:p>
-        </w:tc>
-        <w:tc>
-          <w:tcPr>
-            <w:tcW w:type="dxa" w:w="3560"/>
-            <w:tcBorders>
-              <w:top w:val="single" w:color="B8C4C8" w:sz="4"/>
-              <w:left w:val="single" w:color="B8C4C8" w:sz="4"/>
-              <w:bottom w:val="single" w:color="B8C4C8" w:sz="4"/>
-              <w:right w:val="single" w:color="B8C4C8" w:sz="4"/>
-            </w:tcBorders>
-            <w:tcMar>
-              <w:top w:type="dxa" w:w="60"/>
-              <w:left w:type="dxa" w:w="100"/>
-              <w:bottom w:type="dxa" w:w="60"/>
-              <w:right w:type="dxa" w:w="100"/>
-            </w:tcMar>
-          </w:tcPr>
-          <w:p>
-            <w:r>
-              <w:rPr>
-                <w:rFonts w:ascii="Calibri" w:cs="Calibri" w:eastAsia="Calibri" w:hAnsi="Calibri"/>
-              </w:rPr>
-              <w:t xml:space="preserve">The Pride's intended approach vector, which narrows the search to the northern hemisphere. A failure means the approach is a guess.</w:t>
+            <w:tcW w:type="dxa" w:w="3500"/>
+            <w:tcBorders>
+              <w:top w:val="single" w:color="B8C4C8" w:sz="4"/>
+              <w:left w:val="single" w:color="B8C4C8" w:sz="4"/>
+              <w:bottom w:val="single" w:color="B8C4C8" w:sz="4"/>
+              <w:right w:val="single" w:color="B8C4C8" w:sz="4"/>
+            </w:tcBorders>
+            <w:tcMar>
+              <w:top w:type="dxa" w:w="60"/>
+              <w:left w:type="dxa" w:w="100"/>
+              <w:bottom w:type="dxa" w:w="60"/>
+              <w:right w:type="dxa" w:w="100"/>
+            </w:tcMar>
+          </w:tcPr>
+          <w:p>
+            <w:r>
+              <w:rPr>
+                <w:rFonts w:ascii="Calibri" w:cs="Calibri" w:eastAsia="Calibri" w:hAnsi="Calibri"/>
+              </w:rPr>
+              <w:t xml:space="preserve">Admin or Broker: get the Pride's filed flight plan, her last port of call and her last known track. Can be made at the starport or from the ship.</w:t>
+            </w:r>
+          </w:p>
+        </w:tc>
+        <w:tc>
+          <w:tcPr>
+            <w:tcW w:type="dxa" w:w="4160"/>
+            <w:tcBorders>
+              <w:top w:val="single" w:color="B8C4C8" w:sz="4"/>
+              <w:left w:val="single" w:color="B8C4C8" w:sz="4"/>
+              <w:bottom w:val="single" w:color="B8C4C8" w:sz="4"/>
+              <w:right w:val="single" w:color="B8C4C8" w:sz="4"/>
+            </w:tcBorders>
+            <w:tcMar>
+              <w:top w:type="dxa" w:w="60"/>
+              <w:left w:type="dxa" w:w="100"/>
+              <w:bottom w:type="dxa" w:w="60"/>
+              <w:right w:type="dxa" w:w="100"/>
+            </w:tcMar>
+          </w:tcPr>
+          <w:p>
+            <w:r>
+              <w:rPr>
+                <w:rFonts w:ascii="Calibri" w:cs="Calibri" w:eastAsia="Calibri" w:hAnsi="Calibri"/>
+              </w:rPr>
+              <w:t xml:space="preserve">From the whole planet down to the northern hemisphere.</w:t>
             </w:r>
           </w:p>
         </w:tc>
@@ -2658,101 +3170,76 @@
         </w:trPr>
         <w:tc>
           <w:tcPr>
-            <w:tcW w:type="dxa" w:w="1500"/>
-            <w:tcBorders>
-              <w:top w:val="single" w:color="B8C4C8" w:sz="4"/>
-              <w:left w:val="single" w:color="B8C4C8" w:sz="4"/>
-              <w:bottom w:val="single" w:color="B8C4C8" w:sz="4"/>
-              <w:right w:val="single" w:color="B8C4C8" w:sz="4"/>
-            </w:tcBorders>
-            <w:tcMar>
-              <w:top w:type="dxa" w:w="60"/>
-              <w:left w:type="dxa" w:w="100"/>
-              <w:bottom w:type="dxa" w:w="60"/>
-              <w:right w:type="dxa" w:w="100"/>
-            </w:tcMar>
-          </w:tcPr>
-          <w:p>
-            <w:r>
-              <w:rPr>
-                <w:rFonts w:ascii="Calibri" w:cs="Calibri" w:eastAsia="Calibri" w:hAnsi="Calibri"/>
-              </w:rPr>
-              <w:t xml:space="preserve">2. Listen in</w:t>
-            </w:r>
-          </w:p>
-        </w:tc>
-        <w:tc>
-          <w:tcPr>
-            <w:tcW w:type="dxa" w:w="3000"/>
-            <w:tcBorders>
-              <w:top w:val="single" w:color="B8C4C8" w:sz="4"/>
-              <w:left w:val="single" w:color="B8C4C8" w:sz="4"/>
-              <w:bottom w:val="single" w:color="B8C4C8" w:sz="4"/>
-              <w:right w:val="single" w:color="B8C4C8" w:sz="4"/>
-            </w:tcBorders>
-            <w:tcMar>
-              <w:top w:type="dxa" w:w="60"/>
-              <w:left w:type="dxa" w:w="100"/>
-              <w:bottom w:type="dxa" w:w="60"/>
-              <w:right w:type="dxa" w:w="100"/>
-            </w:tcMar>
-          </w:tcPr>
-          <w:p>
-            <w:r>
-              <w:rPr>
-                <w:rFonts w:ascii="Calibri" w:cs="Calibri" w:eastAsia="Calibri" w:hAnsi="Calibri"/>
-              </w:rPr>
-              <w:t xml:space="preserve">Electronics (comms): sweep for any trace of a transponder or distress burst on common emergency frequencies.</w:t>
-            </w:r>
-          </w:p>
-        </w:tc>
-        <w:tc>
-          <w:tcPr>
-            <w:tcW w:type="dxa" w:w="1300"/>
-            <w:tcBorders>
-              <w:top w:val="single" w:color="B8C4C8" w:sz="4"/>
-              <w:left w:val="single" w:color="B8C4C8" w:sz="4"/>
-              <w:bottom w:val="single" w:color="B8C4C8" w:sz="4"/>
-              <w:right w:val="single" w:color="B8C4C8" w:sz="4"/>
-            </w:tcBorders>
-            <w:tcMar>
-              <w:top w:type="dxa" w:w="60"/>
-              <w:left w:type="dxa" w:w="100"/>
-              <w:bottom w:type="dxa" w:w="60"/>
-              <w:right w:type="dxa" w:w="100"/>
-            </w:tcMar>
-          </w:tcPr>
-          <w:p>
-            <w:r>
-              <w:rPr>
-                <w:rFonts w:ascii="Calibri" w:cs="Calibri" w:eastAsia="Calibri" w:hAnsi="Calibri"/>
-              </w:rPr>
-              <w:t xml:space="preserve">Average (8+)</w:t>
-            </w:r>
-          </w:p>
-        </w:tc>
-        <w:tc>
-          <w:tcPr>
-            <w:tcW w:type="dxa" w:w="3560"/>
-            <w:tcBorders>
-              <w:top w:val="single" w:color="B8C4C8" w:sz="4"/>
-              <w:left w:val="single" w:color="B8C4C8" w:sz="4"/>
-              <w:bottom w:val="single" w:color="B8C4C8" w:sz="4"/>
-              <w:right w:val="single" w:color="B8C4C8" w:sz="4"/>
-            </w:tcBorders>
-            <w:tcMar>
-              <w:top w:type="dxa" w:w="60"/>
-              <w:left w:type="dxa" w:w="100"/>
-              <w:bottom w:type="dxa" w:w="60"/>
-              <w:right w:type="dxa" w:w="100"/>
-            </w:tcMar>
-          </w:tcPr>
-          <w:p>
-            <w:r>
-              <w:rPr>
-                <w:rFonts w:ascii="Calibri" w:cs="Calibri" w:eastAsia="Calibri" w:hAnsi="Calibri"/>
-              </w:rPr>
-              <w:t xml:space="preserve">A faint, intermittent ping bearing roughly 30 degrees east of north. Also detects that the rival crew's ship is jamming a narrow band.</w:t>
+            <w:tcW w:type="dxa" w:w="1700"/>
+            <w:tcBorders>
+              <w:top w:val="single" w:color="B8C4C8" w:sz="4"/>
+              <w:left w:val="single" w:color="B8C4C8" w:sz="4"/>
+              <w:bottom w:val="single" w:color="B8C4C8" w:sz="4"/>
+              <w:right w:val="single" w:color="B8C4C8" w:sz="4"/>
+            </w:tcBorders>
+            <w:tcMar>
+              <w:top w:type="dxa" w:w="60"/>
+              <w:left w:type="dxa" w:w="100"/>
+              <w:bottom w:type="dxa" w:w="60"/>
+              <w:right w:type="dxa" w:w="100"/>
+            </w:tcMar>
+          </w:tcPr>
+          <w:p>
+            <w:r>
+              <w:rPr>
+                <w:rFonts w:ascii="Calibri" w:cs="Calibri" w:eastAsia="Calibri" w:hAnsi="Calibri"/>
+              </w:rPr>
+              <w:t xml:space="preserve">2. Triangulation</w:t>
+            </w:r>
+          </w:p>
+        </w:tc>
+        <w:tc>
+          <w:tcPr>
+            <w:tcW w:type="dxa" w:w="3500"/>
+            <w:tcBorders>
+              <w:top w:val="single" w:color="B8C4C8" w:sz="4"/>
+              <w:left w:val="single" w:color="B8C4C8" w:sz="4"/>
+              <w:bottom w:val="single" w:color="B8C4C8" w:sz="4"/>
+              <w:right w:val="single" w:color="B8C4C8" w:sz="4"/>
+            </w:tcBorders>
+            <w:tcMar>
+              <w:top w:type="dxa" w:w="60"/>
+              <w:left w:type="dxa" w:w="100"/>
+              <w:bottom w:type="dxa" w:w="60"/>
+              <w:right w:type="dxa" w:w="100"/>
+            </w:tcMar>
+          </w:tcPr>
+          <w:p>
+            <w:r>
+              <w:rPr>
+                <w:rFonts w:ascii="Calibri" w:cs="Calibri" w:eastAsia="Calibri" w:hAnsi="Calibri"/>
+              </w:rPr>
+              <w:t xml:space="preserve">Navigation: triangulate from the flight plan and the last known track. DM from Link 1's Effect.</w:t>
+            </w:r>
+          </w:p>
+        </w:tc>
+        <w:tc>
+          <w:tcPr>
+            <w:tcW w:type="dxa" w:w="4160"/>
+            <w:tcBorders>
+              <w:top w:val="single" w:color="B8C4C8" w:sz="4"/>
+              <w:left w:val="single" w:color="B8C4C8" w:sz="4"/>
+              <w:bottom w:val="single" w:color="B8C4C8" w:sz="4"/>
+              <w:right w:val="single" w:color="B8C4C8" w:sz="4"/>
+            </w:tcBorders>
+            <w:tcMar>
+              <w:top w:type="dxa" w:w="60"/>
+              <w:left w:type="dxa" w:w="100"/>
+              <w:bottom w:type="dxa" w:w="60"/>
+              <w:right w:type="dxa" w:w="100"/>
+            </w:tcMar>
+          </w:tcPr>
+          <w:p>
+            <w:r>
+              <w:rPr>
+                <w:rFonts w:ascii="Calibri" w:cs="Calibri" w:eastAsia="Calibri" w:hAnsi="Calibri"/>
+              </w:rPr>
+              <w:t xml:space="preserve">From a hemisphere down to a region a few hundred kilometres across.</w:t>
             </w:r>
           </w:p>
         </w:tc>
@@ -2763,101 +3250,76 @@
         </w:trPr>
         <w:tc>
           <w:tcPr>
-            <w:tcW w:type="dxa" w:w="1500"/>
-            <w:tcBorders>
-              <w:top w:val="single" w:color="B8C4C8" w:sz="4"/>
-              <w:left w:val="single" w:color="B8C4C8" w:sz="4"/>
-              <w:bottom w:val="single" w:color="B8C4C8" w:sz="4"/>
-              <w:right w:val="single" w:color="B8C4C8" w:sz="4"/>
-            </w:tcBorders>
-            <w:tcMar>
-              <w:top w:type="dxa" w:w="60"/>
-              <w:left w:type="dxa" w:w="100"/>
-              <w:bottom w:type="dxa" w:w="60"/>
-              <w:right w:type="dxa" w:w="100"/>
-            </w:tcMar>
-          </w:tcPr>
-          <w:p>
-            <w:r>
-              <w:rPr>
-                <w:rFonts w:ascii="Calibri" w:cs="Calibri" w:eastAsia="Calibri" w:hAnsi="Calibri"/>
-              </w:rPr>
-              <w:t xml:space="preserve">3. The buoy</w:t>
-            </w:r>
-          </w:p>
-        </w:tc>
-        <w:tc>
-          <w:tcPr>
-            <w:tcW w:type="dxa" w:w="3000"/>
-            <w:tcBorders>
-              <w:top w:val="single" w:color="B8C4C8" w:sz="4"/>
-              <w:left w:val="single" w:color="B8C4C8" w:sz="4"/>
-              <w:bottom w:val="single" w:color="B8C4C8" w:sz="4"/>
-              <w:right w:val="single" w:color="B8C4C8" w:sz="4"/>
-            </w:tcBorders>
-            <w:tcMar>
-              <w:top w:type="dxa" w:w="60"/>
-              <w:left w:type="dxa" w:w="100"/>
-              <w:bottom w:type="dxa" w:w="60"/>
-              <w:right w:type="dxa" w:w="100"/>
-            </w:tcMar>
-          </w:tcPr>
-          <w:p>
-            <w:r>
-              <w:rPr>
-                <w:rFonts w:ascii="Calibri" w:cs="Calibri" w:eastAsia="Calibri" w:hAnsi="Calibri"/>
-              </w:rPr>
-              <w:t xml:space="preserve">Electronics (computers): hack the log of Cinder Beacon-2 (see below) to recover the Pride's last telemetry.</w:t>
-            </w:r>
-          </w:p>
-        </w:tc>
-        <w:tc>
-          <w:tcPr>
-            <w:tcW w:type="dxa" w:w="1300"/>
-            <w:tcBorders>
-              <w:top w:val="single" w:color="B8C4C8" w:sz="4"/>
-              <w:left w:val="single" w:color="B8C4C8" w:sz="4"/>
-              <w:bottom w:val="single" w:color="B8C4C8" w:sz="4"/>
-              <w:right w:val="single" w:color="B8C4C8" w:sz="4"/>
-            </w:tcBorders>
-            <w:tcMar>
-              <w:top w:type="dxa" w:w="60"/>
-              <w:left w:type="dxa" w:w="100"/>
-              <w:bottom w:type="dxa" w:w="60"/>
-              <w:right w:type="dxa" w:w="100"/>
-            </w:tcMar>
-          </w:tcPr>
-          <w:p>
-            <w:r>
-              <w:rPr>
-                <w:rFonts w:ascii="Calibri" w:cs="Calibri" w:eastAsia="Calibri" w:hAnsi="Calibri"/>
-              </w:rPr>
-              <w:t xml:space="preserve">Difficult (10+)</w:t>
-            </w:r>
-          </w:p>
-        </w:tc>
-        <w:tc>
-          <w:tcPr>
-            <w:tcW w:type="dxa" w:w="3560"/>
-            <w:tcBorders>
-              <w:top w:val="single" w:color="B8C4C8" w:sz="4"/>
-              <w:left w:val="single" w:color="B8C4C8" w:sz="4"/>
-              <w:bottom w:val="single" w:color="B8C4C8" w:sz="4"/>
-              <w:right w:val="single" w:color="B8C4C8" w:sz="4"/>
-            </w:tcBorders>
-            <w:tcMar>
-              <w:top w:type="dxa" w:w="60"/>
-              <w:left w:type="dxa" w:w="100"/>
-              <w:bottom w:type="dxa" w:w="60"/>
-              <w:right w:type="dxa" w:w="100"/>
-            </w:tcMar>
-          </w:tcPr>
-          <w:p>
-            <w:r>
-              <w:rPr>
-                <w:rFonts w:ascii="Calibri" w:cs="Calibri" w:eastAsia="Calibri" w:hAnsi="Calibri"/>
-              </w:rPr>
-              <w:t xml:space="preserve">The exact altitude, heading and speed of the Pride at the moment her tracking cut out.</w:t>
+            <w:tcW w:type="dxa" w:w="1700"/>
+            <w:tcBorders>
+              <w:top w:val="single" w:color="B8C4C8" w:sz="4"/>
+              <w:left w:val="single" w:color="B8C4C8" w:sz="4"/>
+              <w:bottom w:val="single" w:color="B8C4C8" w:sz="4"/>
+              <w:right w:val="single" w:color="B8C4C8" w:sz="4"/>
+            </w:tcBorders>
+            <w:tcMar>
+              <w:top w:type="dxa" w:w="60"/>
+              <w:left w:type="dxa" w:w="100"/>
+              <w:bottom w:type="dxa" w:w="60"/>
+              <w:right w:type="dxa" w:w="100"/>
+            </w:tcMar>
+          </w:tcPr>
+          <w:p>
+            <w:r>
+              <w:rPr>
+                <w:rFonts w:ascii="Calibri" w:cs="Calibri" w:eastAsia="Calibri" w:hAnsi="Calibri"/>
+              </w:rPr>
+              <w:t xml:space="preserve">3. Communications scan</w:t>
+            </w:r>
+          </w:p>
+        </w:tc>
+        <w:tc>
+          <w:tcPr>
+            <w:tcW w:type="dxa" w:w="3500"/>
+            <w:tcBorders>
+              <w:top w:val="single" w:color="B8C4C8" w:sz="4"/>
+              <w:left w:val="single" w:color="B8C4C8" w:sz="4"/>
+              <w:bottom w:val="single" w:color="B8C4C8" w:sz="4"/>
+              <w:right w:val="single" w:color="B8C4C8" w:sz="4"/>
+            </w:tcBorders>
+            <w:tcMar>
+              <w:top w:type="dxa" w:w="60"/>
+              <w:left w:type="dxa" w:w="100"/>
+              <w:bottom w:type="dxa" w:w="60"/>
+              <w:right w:type="dxa" w:w="100"/>
+            </w:tcMar>
+          </w:tcPr>
+          <w:p>
+            <w:r>
+              <w:rPr>
+                <w:rFonts w:ascii="Calibri" w:cs="Calibri" w:eastAsia="Calibri" w:hAnsi="Calibri"/>
+              </w:rPr>
+              <w:t xml:space="preserve">Electronics (comms): sweep the region for any residual transponder or emergency burst. DM from Link 2's Effect.</w:t>
+            </w:r>
+          </w:p>
+        </w:tc>
+        <w:tc>
+          <w:tcPr>
+            <w:tcW w:type="dxa" w:w="4160"/>
+            <w:tcBorders>
+              <w:top w:val="single" w:color="B8C4C8" w:sz="4"/>
+              <w:left w:val="single" w:color="B8C4C8" w:sz="4"/>
+              <w:bottom w:val="single" w:color="B8C4C8" w:sz="4"/>
+              <w:right w:val="single" w:color="B8C4C8" w:sz="4"/>
+            </w:tcBorders>
+            <w:tcMar>
+              <w:top w:type="dxa" w:w="60"/>
+              <w:left w:type="dxa" w:w="100"/>
+              <w:bottom w:type="dxa" w:w="60"/>
+              <w:right w:type="dxa" w:w="100"/>
+            </w:tcMar>
+          </w:tcPr>
+          <w:p>
+            <w:r>
+              <w:rPr>
+                <w:rFonts w:ascii="Calibri" w:cs="Calibri" w:eastAsia="Calibri" w:hAnsi="Calibri"/>
+              </w:rPr>
+              <w:t xml:space="preserve">From a region down to a single basin.</w:t>
             </w:r>
           </w:p>
         </w:tc>
@@ -2868,29 +3330,140 @@
         </w:trPr>
         <w:tc>
           <w:tcPr>
-            <w:tcW w:type="dxa" w:w="1500"/>
-            <w:tcBorders>
-              <w:top w:val="single" w:color="B8C4C8" w:sz="4"/>
-              <w:left w:val="single" w:color="B8C4C8" w:sz="4"/>
-              <w:bottom w:val="single" w:color="B8C4C8" w:sz="4"/>
-              <w:right w:val="single" w:color="B8C4C8" w:sz="4"/>
-            </w:tcBorders>
-            <w:tcMar>
-              <w:top w:type="dxa" w:w="60"/>
-              <w:left w:type="dxa" w:w="100"/>
-              <w:bottom w:type="dxa" w:w="60"/>
-              <w:right w:type="dxa" w:w="100"/>
-            </w:tcMar>
-          </w:tcPr>
-          <w:p>
-            <w:r>
-              <w:rPr>
-                <w:rFonts w:ascii="Calibri" w:cs="Calibri" w:eastAsia="Calibri" w:hAnsi="Calibri"/>
-              </w:rPr>
-              <w:t xml:space="preserve">4. The track</w:t>
-            </w:r>
-          </w:p>
-        </w:tc>
+            <w:tcW w:type="dxa" w:w="1700"/>
+            <w:tcBorders>
+              <w:top w:val="single" w:color="B8C4C8" w:sz="4"/>
+              <w:left w:val="single" w:color="B8C4C8" w:sz="4"/>
+              <w:bottom w:val="single" w:color="B8C4C8" w:sz="4"/>
+              <w:right w:val="single" w:color="B8C4C8" w:sz="4"/>
+            </w:tcBorders>
+            <w:tcMar>
+              <w:top w:type="dxa" w:w="60"/>
+              <w:left w:type="dxa" w:w="100"/>
+              <w:bottom w:type="dxa" w:w="60"/>
+              <w:right w:type="dxa" w:w="100"/>
+            </w:tcMar>
+          </w:tcPr>
+          <w:p>
+            <w:r>
+              <w:rPr>
+                <w:rFonts w:ascii="Calibri" w:cs="Calibri" w:eastAsia="Calibri" w:hAnsi="Calibri"/>
+              </w:rPr>
+              <w:t xml:space="preserve">4. The manual scan</w:t>
+            </w:r>
+          </w:p>
+        </w:tc>
+        <w:tc>
+          <w:tcPr>
+            <w:tcW w:type="dxa" w:w="3500"/>
+            <w:tcBorders>
+              <w:top w:val="single" w:color="B8C4C8" w:sz="4"/>
+              <w:left w:val="single" w:color="B8C4C8" w:sz="4"/>
+              <w:bottom w:val="single" w:color="B8C4C8" w:sz="4"/>
+              <w:right w:val="single" w:color="B8C4C8" w:sz="4"/>
+            </w:tcBorders>
+            <w:tcMar>
+              <w:top w:type="dxa" w:w="60"/>
+              <w:left w:type="dxa" w:w="100"/>
+              <w:bottom w:type="dxa" w:w="60"/>
+              <w:right w:type="dxa" w:w="100"/>
+            </w:tcMar>
+          </w:tcPr>
+          <w:p>
+            <w:r>
+              <w:rPr>
+                <w:rFonts w:ascii="Calibri" w:cs="Calibri" w:eastAsia="Calibri" w:hAnsi="Calibri"/>
+              </w:rPr>
+              <w:t xml:space="preserve">Electronics (sensors): scan the basin for the ship's signature, residual heat and a debris scar. DM from Link 3's Effect. This must be made from orbit.</w:t>
+            </w:r>
+          </w:p>
+        </w:tc>
+        <w:tc>
+          <w:tcPr>
+            <w:tcW w:type="dxa" w:w="4160"/>
+            <w:tcBorders>
+              <w:top w:val="single" w:color="B8C4C8" w:sz="4"/>
+              <w:left w:val="single" w:color="B8C4C8" w:sz="4"/>
+              <w:bottom w:val="single" w:color="B8C4C8" w:sz="4"/>
+              <w:right w:val="single" w:color="B8C4C8" w:sz="4"/>
+            </w:tcBorders>
+            <w:tcMar>
+              <w:top w:type="dxa" w:w="60"/>
+              <w:left w:type="dxa" w:w="100"/>
+              <w:bottom w:type="dxa" w:w="60"/>
+              <w:right w:type="dxa" w:w="100"/>
+            </w:tcMar>
+          </w:tcPr>
+          <w:p>
+            <w:r>
+              <w:rPr>
+                <w:rFonts w:ascii="Calibri" w:cs="Calibri" w:eastAsia="Calibri" w:hAnsi="Calibri"/>
+              </w:rPr>
+              <w:t xml:space="preserve">The wreck's exact position. The Effect sets the time (see below).</w:t>
+            </w:r>
+          </w:p>
+        </w:tc>
+      </w:tr>
+    </w:tbl>
+    <w:p>
+      <w:pPr>
+        <w:spacing w:after="80"/>
+      </w:pPr>
+    </w:p>
+    <w:p>
+      <w:pPr>
+        <w:spacing w:after="120"/>
+      </w:pPr>
+      <w:r>
+        <w:rPr>
+          <w:rFonts w:ascii="Calibri" w:cs="Calibri" w:eastAsia="Calibri" w:hAnsi="Calibri"/>
+        </w:rPr>
+        <w:t xml:space="preserve">Links 1 to 3 are made during the flight and cost no time. Only the final scan costs time.</w:t>
+      </w:r>
+    </w:p>
+    <w:p>
+      <w:pPr>
+        <w:pStyle w:val="Heading3"/>
+        <w:spacing w:after="80" w:before="160"/>
+      </w:pPr>
+      <w:r>
+        <w:rPr>
+          <w:rFonts w:ascii="Calibri" w:cs="Calibri" w:eastAsia="Calibri" w:hAnsi="Calibri"/>
+        </w:rPr>
+        <w:t xml:space="preserve">How long the scan takes</w:t>
+      </w:r>
+    </w:p>
+    <w:p>
+      <w:pPr>
+        <w:spacing w:after="120"/>
+      </w:pPr>
+      <w:r>
+        <w:rPr>
+          <w:rFonts w:ascii="Calibri" w:cs="Calibri" w:eastAsia="Calibri" w:hAnsi="Calibri"/>
+        </w:rPr>
+        <w:t xml:space="preserve">The default is 3 hours. Subtract the final Effect from 3 hours, with a floor of 30 minutes and a cap of 8 hours.</w:t>
+      </w:r>
+    </w:p>
+    <w:tbl>
+      <w:tblPr>
+        <w:tblW w:type="dxa" w:w="9360"/>
+        <w:tblBorders>
+          <w:top w:val="single" w:color="auto" w:sz="4"/>
+          <w:left w:val="single" w:color="auto" w:sz="4"/>
+          <w:bottom w:val="single" w:color="auto" w:sz="4"/>
+          <w:right w:val="single" w:color="auto" w:sz="4"/>
+          <w:insideH w:val="single" w:color="auto" w:sz="4"/>
+          <w:insideV w:val="single" w:color="auto" w:sz="4"/>
+        </w:tblBorders>
+      </w:tblPr>
+      <w:tblGrid>
+        <w:gridCol w:w="3000"/>
+        <w:gridCol w:w="6360"/>
+      </w:tblGrid>
+      <w:tr>
+        <w:trPr>
+          <w:tblHeader/>
+        </w:trPr>
         <w:tc>
           <w:tcPr>
             <w:tcW w:type="dxa" w:w="3000"/>
@@ -2900,69 +3473,50 @@
               <w:bottom w:val="single" w:color="B8C4C8" w:sz="4"/>
               <w:right w:val="single" w:color="B8C4C8" w:sz="4"/>
             </w:tcBorders>
-            <w:tcMar>
-              <w:top w:type="dxa" w:w="60"/>
-              <w:left w:type="dxa" w:w="100"/>
-              <w:bottom w:type="dxa" w:w="60"/>
-              <w:right w:type="dxa" w:w="100"/>
-            </w:tcMar>
-          </w:tcPr>
-          <w:p>
-            <w:r>
-              <w:rPr>
-                <w:rFonts w:ascii="Calibri" w:cs="Calibri" w:eastAsia="Calibri" w:hAnsi="Calibri"/>
-              </w:rPr>
-              <w:t xml:space="preserve">Astrogation or Navigation: project the ballistic track from telemetry to a point on the surface.</w:t>
-            </w:r>
-          </w:p>
-        </w:tc>
-        <w:tc>
-          <w:tcPr>
-            <w:tcW w:type="dxa" w:w="1300"/>
-            <w:tcBorders>
-              <w:top w:val="single" w:color="B8C4C8" w:sz="4"/>
-              <w:left w:val="single" w:color="B8C4C8" w:sz="4"/>
-              <w:bottom w:val="single" w:color="B8C4C8" w:sz="4"/>
-              <w:right w:val="single" w:color="B8C4C8" w:sz="4"/>
-            </w:tcBorders>
-            <w:tcMar>
-              <w:top w:type="dxa" w:w="60"/>
-              <w:left w:type="dxa" w:w="100"/>
-              <w:bottom w:type="dxa" w:w="60"/>
-              <w:right w:type="dxa" w:w="100"/>
-            </w:tcMar>
-          </w:tcPr>
-          <w:p>
-            <w:r>
-              <w:rPr>
-                <w:rFonts w:ascii="Calibri" w:cs="Calibri" w:eastAsia="Calibri" w:hAnsi="Calibri"/>
-              </w:rPr>
-              <w:t xml:space="preserve">Average (8+)</w:t>
-            </w:r>
-          </w:p>
-        </w:tc>
-        <w:tc>
-          <w:tcPr>
-            <w:tcW w:type="dxa" w:w="3560"/>
-            <w:tcBorders>
-              <w:top w:val="single" w:color="B8C4C8" w:sz="4"/>
-              <w:left w:val="single" w:color="B8C4C8" w:sz="4"/>
-              <w:bottom w:val="single" w:color="B8C4C8" w:sz="4"/>
-              <w:right w:val="single" w:color="B8C4C8" w:sz="4"/>
-            </w:tcBorders>
-            <w:tcMar>
-              <w:top w:type="dxa" w:w="60"/>
-              <w:left w:type="dxa" w:w="100"/>
-              <w:bottom w:type="dxa" w:w="60"/>
-              <w:right w:type="dxa" w:w="100"/>
-            </w:tcMar>
-          </w:tcPr>
-          <w:p>
-            <w:r>
-              <w:rPr>
-                <w:rFonts w:ascii="Calibri" w:cs="Calibri" w:eastAsia="Calibri" w:hAnsi="Calibri"/>
-              </w:rPr>
-              <w:t xml:space="preserve">A landing ellipse about 6 km across, instead of 60 km.</w:t>
+            <w:shd w:fill="D5E8EC" w:val="clear"/>
+            <w:tcMar>
+              <w:top w:type="dxa" w:w="60"/>
+              <w:left w:type="dxa" w:w="100"/>
+              <w:bottom w:type="dxa" w:w="60"/>
+              <w:right w:type="dxa" w:w="100"/>
+            </w:tcMar>
+          </w:tcPr>
+          <w:p>
+            <w:r>
+              <w:rPr>
+                <w:rFonts w:ascii="Calibri" w:cs="Calibri" w:eastAsia="Calibri" w:hAnsi="Calibri"/>
+                <w:b/>
+                <w:bCs/>
+              </w:rPr>
+              <w:t xml:space="preserve">Final Sensors Effect</w:t>
+            </w:r>
+          </w:p>
+        </w:tc>
+        <w:tc>
+          <w:tcPr>
+            <w:tcW w:type="dxa" w:w="6360"/>
+            <w:tcBorders>
+              <w:top w:val="single" w:color="B8C4C8" w:sz="4"/>
+              <w:left w:val="single" w:color="B8C4C8" w:sz="4"/>
+              <w:bottom w:val="single" w:color="B8C4C8" w:sz="4"/>
+              <w:right w:val="single" w:color="B8C4C8" w:sz="4"/>
+            </w:tcBorders>
+            <w:shd w:fill="D5E8EC" w:val="clear"/>
+            <w:tcMar>
+              <w:top w:type="dxa" w:w="60"/>
+              <w:left w:type="dxa" w:w="100"/>
+              <w:bottom w:type="dxa" w:w="60"/>
+              <w:right w:type="dxa" w:w="100"/>
+            </w:tcMar>
+          </w:tcPr>
+          <w:p>
+            <w:r>
+              <w:rPr>
+                <w:rFonts w:ascii="Calibri" w:cs="Calibri" w:eastAsia="Calibri" w:hAnsi="Calibri"/>
+                <w:b/>
+                <w:bCs/>
+              </w:rPr>
+              <w:t xml:space="preserve">Scan time</w:t>
             </w:r>
           </w:p>
         </w:tc>
@@ -2973,31 +3527,6 @@
         </w:trPr>
         <w:tc>
           <w:tcPr>
-            <w:tcW w:type="dxa" w:w="1500"/>
-            <w:tcBorders>
-              <w:top w:val="single" w:color="B8C4C8" w:sz="4"/>
-              <w:left w:val="single" w:color="B8C4C8" w:sz="4"/>
-              <w:bottom w:val="single" w:color="B8C4C8" w:sz="4"/>
-              <w:right w:val="single" w:color="B8C4C8" w:sz="4"/>
-            </w:tcBorders>
-            <w:tcMar>
-              <w:top w:type="dxa" w:w="60"/>
-              <w:left w:type="dxa" w:w="100"/>
-              <w:bottom w:type="dxa" w:w="60"/>
-              <w:right w:type="dxa" w:w="100"/>
-            </w:tcMar>
-          </w:tcPr>
-          <w:p>
-            <w:r>
-              <w:rPr>
-                <w:rFonts w:ascii="Calibri" w:cs="Calibri" w:eastAsia="Calibri" w:hAnsi="Calibri"/>
-              </w:rPr>
-              <w:t xml:space="preserve">5. Confirm</w:t>
-            </w:r>
-          </w:p>
-        </w:tc>
-        <w:tc>
-          <w:tcPr>
             <w:tcW w:type="dxa" w:w="3000"/>
             <w:tcBorders>
               <w:top w:val="single" w:color="B8C4C8" w:sz="4"/>
@@ -3017,57 +3546,472 @@
               <w:rPr>
                 <w:rFonts w:ascii="Calibri" w:cs="Calibri" w:eastAsia="Calibri" w:hAnsi="Calibri"/>
               </w:rPr>
-              <w:t xml:space="preserve">Electronics (sensors): scan the surface for the wreck: a hull signature, residual heat, a debris scar.</w:t>
-            </w:r>
-          </w:p>
-        </w:tc>
-        <w:tc>
-          <w:tcPr>
-            <w:tcW w:type="dxa" w:w="1300"/>
-            <w:tcBorders>
-              <w:top w:val="single" w:color="B8C4C8" w:sz="4"/>
-              <w:left w:val="single" w:color="B8C4C8" w:sz="4"/>
-              <w:bottom w:val="single" w:color="B8C4C8" w:sz="4"/>
-              <w:right w:val="single" w:color="B8C4C8" w:sz="4"/>
-            </w:tcBorders>
-            <w:tcMar>
-              <w:top w:type="dxa" w:w="60"/>
-              <w:left w:type="dxa" w:w="100"/>
-              <w:bottom w:type="dxa" w:w="60"/>
-              <w:right w:type="dxa" w:w="100"/>
-            </w:tcMar>
-          </w:tcPr>
-          <w:p>
-            <w:r>
-              <w:rPr>
-                <w:rFonts w:ascii="Calibri" w:cs="Calibri" w:eastAsia="Calibri" w:hAnsi="Calibri"/>
-              </w:rPr>
-              <w:t xml:space="preserve">Routine (6+)</w:t>
-            </w:r>
-          </w:p>
-        </w:tc>
-        <w:tc>
-          <w:tcPr>
-            <w:tcW w:type="dxa" w:w="3560"/>
-            <w:tcBorders>
-              <w:top w:val="single" w:color="B8C4C8" w:sz="4"/>
-              <w:left w:val="single" w:color="B8C4C8" w:sz="4"/>
-              <w:bottom w:val="single" w:color="B8C4C8" w:sz="4"/>
-              <w:right w:val="single" w:color="B8C4C8" w:sz="4"/>
-            </w:tcBorders>
-            <w:tcMar>
-              <w:top w:type="dxa" w:w="60"/>
-              <w:left w:type="dxa" w:w="100"/>
-              <w:bottom w:type="dxa" w:w="60"/>
-              <w:right w:type="dxa" w:w="100"/>
-            </w:tcMar>
-          </w:tcPr>
-          <w:p>
-            <w:r>
-              <w:rPr>
-                <w:rFonts w:ascii="Calibri" w:cs="Calibri" w:eastAsia="Calibri" w:hAnsi="Calibri"/>
-              </w:rPr>
-              <w:t xml:space="preserve">The wreck's precise position and a rough picture of its condition.</w:t>
+              <w:t xml:space="preserve">+3 or better</w:t>
+            </w:r>
+          </w:p>
+        </w:tc>
+        <w:tc>
+          <w:tcPr>
+            <w:tcW w:type="dxa" w:w="6360"/>
+            <w:tcBorders>
+              <w:top w:val="single" w:color="B8C4C8" w:sz="4"/>
+              <w:left w:val="single" w:color="B8C4C8" w:sz="4"/>
+              <w:bottom w:val="single" w:color="B8C4C8" w:sz="4"/>
+              <w:right w:val="single" w:color="B8C4C8" w:sz="4"/>
+            </w:tcBorders>
+            <w:tcMar>
+              <w:top w:type="dxa" w:w="60"/>
+              <w:left w:type="dxa" w:w="100"/>
+              <w:bottom w:type="dxa" w:w="60"/>
+              <w:right w:type="dxa" w:w="100"/>
+            </w:tcMar>
+          </w:tcPr>
+          <w:p>
+            <w:r>
+              <w:rPr>
+                <w:rFonts w:ascii="Calibri" w:cs="Calibri" w:eastAsia="Calibri" w:hAnsi="Calibri"/>
+              </w:rPr>
+              <w:t xml:space="preserve">30 minutes</w:t>
+            </w:r>
+          </w:p>
+        </w:tc>
+      </w:tr>
+      <w:tr>
+        <w:trPr>
+          <w:tblHeader w:val="off"/>
+        </w:trPr>
+        <w:tc>
+          <w:tcPr>
+            <w:tcW w:type="dxa" w:w="3000"/>
+            <w:tcBorders>
+              <w:top w:val="single" w:color="B8C4C8" w:sz="4"/>
+              <w:left w:val="single" w:color="B8C4C8" w:sz="4"/>
+              <w:bottom w:val="single" w:color="B8C4C8" w:sz="4"/>
+              <w:right w:val="single" w:color="B8C4C8" w:sz="4"/>
+            </w:tcBorders>
+            <w:tcMar>
+              <w:top w:type="dxa" w:w="60"/>
+              <w:left w:type="dxa" w:w="100"/>
+              <w:bottom w:type="dxa" w:w="60"/>
+              <w:right w:type="dxa" w:w="100"/>
+            </w:tcMar>
+          </w:tcPr>
+          <w:p>
+            <w:r>
+              <w:rPr>
+                <w:rFonts w:ascii="Calibri" w:cs="Calibri" w:eastAsia="Calibri" w:hAnsi="Calibri"/>
+              </w:rPr>
+              <w:t xml:space="preserve">+2</w:t>
+            </w:r>
+          </w:p>
+        </w:tc>
+        <w:tc>
+          <w:tcPr>
+            <w:tcW w:type="dxa" w:w="6360"/>
+            <w:tcBorders>
+              <w:top w:val="single" w:color="B8C4C8" w:sz="4"/>
+              <w:left w:val="single" w:color="B8C4C8" w:sz="4"/>
+              <w:bottom w:val="single" w:color="B8C4C8" w:sz="4"/>
+              <w:right w:val="single" w:color="B8C4C8" w:sz="4"/>
+            </w:tcBorders>
+            <w:tcMar>
+              <w:top w:type="dxa" w:w="60"/>
+              <w:left w:type="dxa" w:w="100"/>
+              <w:bottom w:type="dxa" w:w="60"/>
+              <w:right w:type="dxa" w:w="100"/>
+            </w:tcMar>
+          </w:tcPr>
+          <w:p>
+            <w:r>
+              <w:rPr>
+                <w:rFonts w:ascii="Calibri" w:cs="Calibri" w:eastAsia="Calibri" w:hAnsi="Calibri"/>
+              </w:rPr>
+              <w:t xml:space="preserve">1 hour</w:t>
+            </w:r>
+          </w:p>
+        </w:tc>
+      </w:tr>
+      <w:tr>
+        <w:trPr>
+          <w:tblHeader w:val="off"/>
+        </w:trPr>
+        <w:tc>
+          <w:tcPr>
+            <w:tcW w:type="dxa" w:w="3000"/>
+            <w:tcBorders>
+              <w:top w:val="single" w:color="B8C4C8" w:sz="4"/>
+              <w:left w:val="single" w:color="B8C4C8" w:sz="4"/>
+              <w:bottom w:val="single" w:color="B8C4C8" w:sz="4"/>
+              <w:right w:val="single" w:color="B8C4C8" w:sz="4"/>
+            </w:tcBorders>
+            <w:tcMar>
+              <w:top w:type="dxa" w:w="60"/>
+              <w:left w:type="dxa" w:w="100"/>
+              <w:bottom w:type="dxa" w:w="60"/>
+              <w:right w:type="dxa" w:w="100"/>
+            </w:tcMar>
+          </w:tcPr>
+          <w:p>
+            <w:r>
+              <w:rPr>
+                <w:rFonts w:ascii="Calibri" w:cs="Calibri" w:eastAsia="Calibri" w:hAnsi="Calibri"/>
+              </w:rPr>
+              <w:t xml:space="preserve">+1</w:t>
+            </w:r>
+          </w:p>
+        </w:tc>
+        <w:tc>
+          <w:tcPr>
+            <w:tcW w:type="dxa" w:w="6360"/>
+            <w:tcBorders>
+              <w:top w:val="single" w:color="B8C4C8" w:sz="4"/>
+              <w:left w:val="single" w:color="B8C4C8" w:sz="4"/>
+              <w:bottom w:val="single" w:color="B8C4C8" w:sz="4"/>
+              <w:right w:val="single" w:color="B8C4C8" w:sz="4"/>
+            </w:tcBorders>
+            <w:tcMar>
+              <w:top w:type="dxa" w:w="60"/>
+              <w:left w:type="dxa" w:w="100"/>
+              <w:bottom w:type="dxa" w:w="60"/>
+              <w:right w:type="dxa" w:w="100"/>
+            </w:tcMar>
+          </w:tcPr>
+          <w:p>
+            <w:r>
+              <w:rPr>
+                <w:rFonts w:ascii="Calibri" w:cs="Calibri" w:eastAsia="Calibri" w:hAnsi="Calibri"/>
+              </w:rPr>
+              <w:t xml:space="preserve">2 hours</w:t>
+            </w:r>
+          </w:p>
+        </w:tc>
+      </w:tr>
+      <w:tr>
+        <w:trPr>
+          <w:tblHeader w:val="off"/>
+        </w:trPr>
+        <w:tc>
+          <w:tcPr>
+            <w:tcW w:type="dxa" w:w="3000"/>
+            <w:tcBorders>
+              <w:top w:val="single" w:color="B8C4C8" w:sz="4"/>
+              <w:left w:val="single" w:color="B8C4C8" w:sz="4"/>
+              <w:bottom w:val="single" w:color="B8C4C8" w:sz="4"/>
+              <w:right w:val="single" w:color="B8C4C8" w:sz="4"/>
+            </w:tcBorders>
+            <w:tcMar>
+              <w:top w:type="dxa" w:w="60"/>
+              <w:left w:type="dxa" w:w="100"/>
+              <w:bottom w:type="dxa" w:w="60"/>
+              <w:right w:type="dxa" w:w="100"/>
+            </w:tcMar>
+          </w:tcPr>
+          <w:p>
+            <w:r>
+              <w:rPr>
+                <w:rFonts w:ascii="Calibri" w:cs="Calibri" w:eastAsia="Calibri" w:hAnsi="Calibri"/>
+              </w:rPr>
+              <w:t xml:space="preserve">0</w:t>
+            </w:r>
+          </w:p>
+        </w:tc>
+        <w:tc>
+          <w:tcPr>
+            <w:tcW w:type="dxa" w:w="6360"/>
+            <w:tcBorders>
+              <w:top w:val="single" w:color="B8C4C8" w:sz="4"/>
+              <w:left w:val="single" w:color="B8C4C8" w:sz="4"/>
+              <w:bottom w:val="single" w:color="B8C4C8" w:sz="4"/>
+              <w:right w:val="single" w:color="B8C4C8" w:sz="4"/>
+            </w:tcBorders>
+            <w:tcMar>
+              <w:top w:type="dxa" w:w="60"/>
+              <w:left w:type="dxa" w:w="100"/>
+              <w:bottom w:type="dxa" w:w="60"/>
+              <w:right w:type="dxa" w:w="100"/>
+            </w:tcMar>
+          </w:tcPr>
+          <w:p>
+            <w:r>
+              <w:rPr>
+                <w:rFonts w:ascii="Calibri" w:cs="Calibri" w:eastAsia="Calibri" w:hAnsi="Calibri"/>
+              </w:rPr>
+              <w:t xml:space="preserve">3 hours (the default)</w:t>
+            </w:r>
+          </w:p>
+        </w:tc>
+      </w:tr>
+      <w:tr>
+        <w:trPr>
+          <w:tblHeader w:val="off"/>
+        </w:trPr>
+        <w:tc>
+          <w:tcPr>
+            <w:tcW w:type="dxa" w:w="3000"/>
+            <w:tcBorders>
+              <w:top w:val="single" w:color="B8C4C8" w:sz="4"/>
+              <w:left w:val="single" w:color="B8C4C8" w:sz="4"/>
+              <w:bottom w:val="single" w:color="B8C4C8" w:sz="4"/>
+              <w:right w:val="single" w:color="B8C4C8" w:sz="4"/>
+            </w:tcBorders>
+            <w:tcMar>
+              <w:top w:type="dxa" w:w="60"/>
+              <w:left w:type="dxa" w:w="100"/>
+              <w:bottom w:type="dxa" w:w="60"/>
+              <w:right w:type="dxa" w:w="100"/>
+            </w:tcMar>
+          </w:tcPr>
+          <w:p>
+            <w:r>
+              <w:rPr>
+                <w:rFonts w:ascii="Calibri" w:cs="Calibri" w:eastAsia="Calibri" w:hAnsi="Calibri"/>
+              </w:rPr>
+              <w:t xml:space="preserve">-1</w:t>
+            </w:r>
+          </w:p>
+        </w:tc>
+        <w:tc>
+          <w:tcPr>
+            <w:tcW w:type="dxa" w:w="6360"/>
+            <w:tcBorders>
+              <w:top w:val="single" w:color="B8C4C8" w:sz="4"/>
+              <w:left w:val="single" w:color="B8C4C8" w:sz="4"/>
+              <w:bottom w:val="single" w:color="B8C4C8" w:sz="4"/>
+              <w:right w:val="single" w:color="B8C4C8" w:sz="4"/>
+            </w:tcBorders>
+            <w:tcMar>
+              <w:top w:type="dxa" w:w="60"/>
+              <w:left w:type="dxa" w:w="100"/>
+              <w:bottom w:type="dxa" w:w="60"/>
+              <w:right w:type="dxa" w:w="100"/>
+            </w:tcMar>
+          </w:tcPr>
+          <w:p>
+            <w:r>
+              <w:rPr>
+                <w:rFonts w:ascii="Calibri" w:cs="Calibri" w:eastAsia="Calibri" w:hAnsi="Calibri"/>
+              </w:rPr>
+              <w:t xml:space="preserve">4 hours</w:t>
+            </w:r>
+          </w:p>
+        </w:tc>
+      </w:tr>
+      <w:tr>
+        <w:trPr>
+          <w:tblHeader w:val="off"/>
+        </w:trPr>
+        <w:tc>
+          <w:tcPr>
+            <w:tcW w:type="dxa" w:w="3000"/>
+            <w:tcBorders>
+              <w:top w:val="single" w:color="B8C4C8" w:sz="4"/>
+              <w:left w:val="single" w:color="B8C4C8" w:sz="4"/>
+              <w:bottom w:val="single" w:color="B8C4C8" w:sz="4"/>
+              <w:right w:val="single" w:color="B8C4C8" w:sz="4"/>
+            </w:tcBorders>
+            <w:tcMar>
+              <w:top w:type="dxa" w:w="60"/>
+              <w:left w:type="dxa" w:w="100"/>
+              <w:bottom w:type="dxa" w:w="60"/>
+              <w:right w:type="dxa" w:w="100"/>
+            </w:tcMar>
+          </w:tcPr>
+          <w:p>
+            <w:r>
+              <w:rPr>
+                <w:rFonts w:ascii="Calibri" w:cs="Calibri" w:eastAsia="Calibri" w:hAnsi="Calibri"/>
+              </w:rPr>
+              <w:t xml:space="preserve">-2</w:t>
+            </w:r>
+          </w:p>
+        </w:tc>
+        <w:tc>
+          <w:tcPr>
+            <w:tcW w:type="dxa" w:w="6360"/>
+            <w:tcBorders>
+              <w:top w:val="single" w:color="B8C4C8" w:sz="4"/>
+              <w:left w:val="single" w:color="B8C4C8" w:sz="4"/>
+              <w:bottom w:val="single" w:color="B8C4C8" w:sz="4"/>
+              <w:right w:val="single" w:color="B8C4C8" w:sz="4"/>
+            </w:tcBorders>
+            <w:tcMar>
+              <w:top w:type="dxa" w:w="60"/>
+              <w:left w:type="dxa" w:w="100"/>
+              <w:bottom w:type="dxa" w:w="60"/>
+              <w:right w:type="dxa" w:w="100"/>
+            </w:tcMar>
+          </w:tcPr>
+          <w:p>
+            <w:r>
+              <w:rPr>
+                <w:rFonts w:ascii="Calibri" w:cs="Calibri" w:eastAsia="Calibri" w:hAnsi="Calibri"/>
+              </w:rPr>
+              <w:t xml:space="preserve">5 hours</w:t>
+            </w:r>
+          </w:p>
+        </w:tc>
+      </w:tr>
+      <w:tr>
+        <w:trPr>
+          <w:tblHeader w:val="off"/>
+        </w:trPr>
+        <w:tc>
+          <w:tcPr>
+            <w:tcW w:type="dxa" w:w="3000"/>
+            <w:tcBorders>
+              <w:top w:val="single" w:color="B8C4C8" w:sz="4"/>
+              <w:left w:val="single" w:color="B8C4C8" w:sz="4"/>
+              <w:bottom w:val="single" w:color="B8C4C8" w:sz="4"/>
+              <w:right w:val="single" w:color="B8C4C8" w:sz="4"/>
+            </w:tcBorders>
+            <w:tcMar>
+              <w:top w:type="dxa" w:w="60"/>
+              <w:left w:type="dxa" w:w="100"/>
+              <w:bottom w:type="dxa" w:w="60"/>
+              <w:right w:type="dxa" w:w="100"/>
+            </w:tcMar>
+          </w:tcPr>
+          <w:p>
+            <w:r>
+              <w:rPr>
+                <w:rFonts w:ascii="Calibri" w:cs="Calibri" w:eastAsia="Calibri" w:hAnsi="Calibri"/>
+              </w:rPr>
+              <w:t xml:space="preserve">-3</w:t>
+            </w:r>
+          </w:p>
+        </w:tc>
+        <w:tc>
+          <w:tcPr>
+            <w:tcW w:type="dxa" w:w="6360"/>
+            <w:tcBorders>
+              <w:top w:val="single" w:color="B8C4C8" w:sz="4"/>
+              <w:left w:val="single" w:color="B8C4C8" w:sz="4"/>
+              <w:bottom w:val="single" w:color="B8C4C8" w:sz="4"/>
+              <w:right w:val="single" w:color="B8C4C8" w:sz="4"/>
+            </w:tcBorders>
+            <w:tcMar>
+              <w:top w:type="dxa" w:w="60"/>
+              <w:left w:type="dxa" w:w="100"/>
+              <w:bottom w:type="dxa" w:w="60"/>
+              <w:right w:type="dxa" w:w="100"/>
+            </w:tcMar>
+          </w:tcPr>
+          <w:p>
+            <w:r>
+              <w:rPr>
+                <w:rFonts w:ascii="Calibri" w:cs="Calibri" w:eastAsia="Calibri" w:hAnsi="Calibri"/>
+              </w:rPr>
+              <w:t xml:space="preserve">6 hours</w:t>
+            </w:r>
+          </w:p>
+        </w:tc>
+      </w:tr>
+      <w:tr>
+        <w:trPr>
+          <w:tblHeader w:val="off"/>
+        </w:trPr>
+        <w:tc>
+          <w:tcPr>
+            <w:tcW w:type="dxa" w:w="3000"/>
+            <w:tcBorders>
+              <w:top w:val="single" w:color="B8C4C8" w:sz="4"/>
+              <w:left w:val="single" w:color="B8C4C8" w:sz="4"/>
+              <w:bottom w:val="single" w:color="B8C4C8" w:sz="4"/>
+              <w:right w:val="single" w:color="B8C4C8" w:sz="4"/>
+            </w:tcBorders>
+            <w:tcMar>
+              <w:top w:type="dxa" w:w="60"/>
+              <w:left w:type="dxa" w:w="100"/>
+              <w:bottom w:type="dxa" w:w="60"/>
+              <w:right w:type="dxa" w:w="100"/>
+            </w:tcMar>
+          </w:tcPr>
+          <w:p>
+            <w:r>
+              <w:rPr>
+                <w:rFonts w:ascii="Calibri" w:cs="Calibri" w:eastAsia="Calibri" w:hAnsi="Calibri"/>
+              </w:rPr>
+              <w:t xml:space="preserve">-4</w:t>
+            </w:r>
+          </w:p>
+        </w:tc>
+        <w:tc>
+          <w:tcPr>
+            <w:tcW w:type="dxa" w:w="6360"/>
+            <w:tcBorders>
+              <w:top w:val="single" w:color="B8C4C8" w:sz="4"/>
+              <w:left w:val="single" w:color="B8C4C8" w:sz="4"/>
+              <w:bottom w:val="single" w:color="B8C4C8" w:sz="4"/>
+              <w:right w:val="single" w:color="B8C4C8" w:sz="4"/>
+            </w:tcBorders>
+            <w:tcMar>
+              <w:top w:type="dxa" w:w="60"/>
+              <w:left w:type="dxa" w:w="100"/>
+              <w:bottom w:type="dxa" w:w="60"/>
+              <w:right w:type="dxa" w:w="100"/>
+            </w:tcMar>
+          </w:tcPr>
+          <w:p>
+            <w:r>
+              <w:rPr>
+                <w:rFonts w:ascii="Calibri" w:cs="Calibri" w:eastAsia="Calibri" w:hAnsi="Calibri"/>
+              </w:rPr>
+              <w:t xml:space="preserve">7 hours</w:t>
+            </w:r>
+          </w:p>
+        </w:tc>
+      </w:tr>
+      <w:tr>
+        <w:trPr>
+          <w:tblHeader w:val="off"/>
+        </w:trPr>
+        <w:tc>
+          <w:tcPr>
+            <w:tcW w:type="dxa" w:w="3000"/>
+            <w:tcBorders>
+              <w:top w:val="single" w:color="B8C4C8" w:sz="4"/>
+              <w:left w:val="single" w:color="B8C4C8" w:sz="4"/>
+              <w:bottom w:val="single" w:color="B8C4C8" w:sz="4"/>
+              <w:right w:val="single" w:color="B8C4C8" w:sz="4"/>
+            </w:tcBorders>
+            <w:tcMar>
+              <w:top w:type="dxa" w:w="60"/>
+              <w:left w:type="dxa" w:w="100"/>
+              <w:bottom w:type="dxa" w:w="60"/>
+              <w:right w:type="dxa" w:w="100"/>
+            </w:tcMar>
+          </w:tcPr>
+          <w:p>
+            <w:r>
+              <w:rPr>
+                <w:rFonts w:ascii="Calibri" w:cs="Calibri" w:eastAsia="Calibri" w:hAnsi="Calibri"/>
+              </w:rPr>
+              <w:t xml:space="preserve">-5 or worse</w:t>
+            </w:r>
+          </w:p>
+        </w:tc>
+        <w:tc>
+          <w:tcPr>
+            <w:tcW w:type="dxa" w:w="6360"/>
+            <w:tcBorders>
+              <w:top w:val="single" w:color="B8C4C8" w:sz="4"/>
+              <w:left w:val="single" w:color="B8C4C8" w:sz="4"/>
+              <w:bottom w:val="single" w:color="B8C4C8" w:sz="4"/>
+              <w:right w:val="single" w:color="B8C4C8" w:sz="4"/>
+            </w:tcBorders>
+            <w:tcMar>
+              <w:top w:type="dxa" w:w="60"/>
+              <w:left w:type="dxa" w:w="100"/>
+              <w:bottom w:type="dxa" w:w="60"/>
+              <w:right w:type="dxa" w:w="100"/>
+            </w:tcMar>
+          </w:tcPr>
+          <w:p>
+            <w:r>
+              <w:rPr>
+                <w:rFonts w:ascii="Calibri" w:cs="Calibri" w:eastAsia="Calibri" w:hAnsi="Calibri"/>
+              </w:rPr>
+              <w:t xml:space="preserve">8 hours</w:t>
             </w:r>
           </w:p>
         </w:tc>
@@ -3077,48 +4021,6 @@
       <w:pPr>
         <w:spacing w:after="80"/>
       </w:pPr>
-    </w:p>
-    <w:p>
-      <w:pPr>
-        <w:spacing w:after="120"/>
-      </w:pPr>
-      <w:r>
-        <w:rPr>
-          <w:rFonts w:ascii="Calibri" w:cs="Calibri" w:eastAsia="Calibri" w:hAnsi="Calibri"/>
-          <w:b/>
-          <w:bCs/>
-        </w:rPr>
-        <w:t xml:space="preserve">If the chain goes badly.</w:t>
-      </w:r>
-      <w:r>
-        <w:rPr>
-          <w:rFonts w:ascii="Calibri" w:cs="Calibri" w:eastAsia="Calibri" w:hAnsi="Calibri"/>
-        </w:rPr>
-        <w:t xml:space="preserve"> Any link that fails gives Bane to the next and puts an hour on the clock, as above. If two or more links fail, the landing ellipse is 20 km wide and the party must add a Recon or Survival check in Scene 3 to find the wreck on the ground. A complete failure of the chain (every link fails) is possible but unlikely; the party can still find the wreck by flying search patterns, but that costs 4 hours.</w:t>
-      </w:r>
-    </w:p>
-    <w:p>
-      <w:pPr>
-        <w:pStyle w:val="Heading2"/>
-        <w:spacing w:after="100" w:before="240"/>
-      </w:pPr>
-      <w:r>
-        <w:rPr>
-          <w:rFonts w:ascii="Calibri" w:cs="Calibri" w:eastAsia="Calibri" w:hAnsi="Calibri"/>
-        </w:rPr>
-        <w:t xml:space="preserve">Hacking Cinder Beacon-2</w:t>
-      </w:r>
-    </w:p>
-    <w:p>
-      <w:pPr>
-        <w:spacing w:after="120"/>
-      </w:pPr>
-      <w:r>
-        <w:rPr>
-          <w:rFonts w:ascii="Calibri" w:cs="Calibri" w:eastAsia="Calibri" w:hAnsi="Calibri"/>
-        </w:rPr>
-        <w:t xml:space="preserve">This is the scenario's first hacking encounter. The buoy is an old, unmanned navigation transponder, but it holds logs of everything that passed within range, including the Pride. Explain the steps before anyone rolls.</w:t>
-      </w:r>
     </w:p>
     <w:p>
       <w:pPr>
@@ -3135,13 +4037,13 @@
           <w:b/>
           <w:bCs/>
         </w:rPr>
-        <w:t xml:space="preserve">Reach it.</w:t>
-      </w:r>
-      <w:r>
-        <w:rPr>
-          <w:rFonts w:ascii="Calibri" w:cs="Calibri" w:eastAsia="Calibri" w:hAnsi="Calibri"/>
-        </w:rPr>
-        <w:t xml:space="preserve"> The ship must come within 5,000 km of the buoy to open a link. That is a short burn (a Routine Pilot check) and costs about 30 minutes.</w:t>
+        <w:t xml:space="preserve">Lost time goes to the rivals.</w:t>
+      </w:r>
+      <w:r>
+        <w:rPr>
+          <w:rFonts w:ascii="Calibri" w:cs="Calibri" w:eastAsia="Calibri" w:hAnsi="Calibri"/>
+        </w:rPr>
+        <w:t xml:space="preserve"> For each hour the scan takes over 3 hours, every rival event on the clock moves one hour earlier. For each hour under 3, they move one hour later.</w:t>
       </w:r>
     </w:p>
     <w:p>
@@ -3159,13 +4061,13 @@
           <w:b/>
           <w:bCs/>
         </w:rPr>
-        <w:t xml:space="preserve">Break the lock.</w:t>
-      </w:r>
-      <w:r>
-        <w:rPr>
-          <w:rFonts w:ascii="Calibri" w:cs="Calibri" w:eastAsia="Calibri" w:hAnsi="Calibri"/>
-        </w:rPr>
-        <w:t xml:space="preserve"> Electronics (computers) Difficult (10+) takes 1D x 10 minutes. This is the hack. A hacker with proper intrusion software has DM+2. Without it, no penalty, but the check takes twice as long.</w:t>
+        <w:t xml:space="preserve">A long scan is a warning.</w:t>
+      </w:r>
+      <w:r>
+        <w:rPr>
+          <w:rFonts w:ascii="Calibri" w:cs="Calibri" w:eastAsia="Calibri" w:hAnsi="Calibri"/>
+        </w:rPr>
+        <w:t xml:space="preserve"> If the scan takes more than 3 hours, the rivals notice a ship lingering overhead and are alerted: DM-2 to Stealth when the party approaches in Scene 4, and the Hard Bargain's gunner is ready.</w:t>
       </w:r>
     </w:p>
     <w:p>
@@ -3183,13 +4085,48 @@
           <w:b/>
           <w:bCs/>
         </w:rPr>
-        <w:t xml:space="preserve">On failure.</w:t>
-      </w:r>
-      <w:r>
-        <w:rPr>
-          <w:rFonts w:ascii="Calibri" w:cs="Calibri" w:eastAsia="Calibri" w:hAnsi="Calibri"/>
-        </w:rPr>
-        <w:t xml:space="preserve"> The buoy's sentinel routine sends a handshake challenge. The hacker has one more attempt at DM-2 before the buoy locks them out for an hour. A lockout also sends a ping to the rival crew's ship, which then knows someone has arrived (advance the rival's plans in Scene 4; they are expecting company).</w:t>
+        <w:t xml:space="preserve">A great result is a head start.</w:t>
+      </w:r>
+      <w:r>
+        <w:rPr>
+          <w:rFonts w:ascii="Calibri" w:cs="Calibri" w:eastAsia="Calibri" w:hAnsi="Calibri"/>
+        </w:rPr>
+        <w:t xml:space="preserve"> A scan of an hour or less also gives the party a clean look at the wreck's surroundings: tell them where the rivals' sled and camp are before they land.</w:t>
+      </w:r>
+    </w:p>
+    <w:p>
+      <w:pPr>
+        <w:pStyle w:val="Heading1"/>
+        <w:spacing w:after="140" w:before="360"/>
+      </w:pPr>
+      <w:r>
+        <w:rPr>
+          <w:rFonts w:ascii="Calibri" w:cs="Calibri" w:eastAsia="Calibri" w:hAnsi="Calibri"/>
+        </w:rPr>
+        <w:t xml:space="preserve">Scene 3: Fly Down to the Surface</w:t>
+      </w:r>
+    </w:p>
+    <w:p>
+      <w:pPr>
+        <w:spacing w:after="120"/>
+      </w:pPr>
+      <w:r>
+        <w:rPr>
+          <w:rFonts w:ascii="Calibri" w:cs="Calibri" w:eastAsia="Calibri" w:hAnsi="Calibri"/>
+        </w:rPr>
+        <w:t xml:space="preserve">The party wins this scene by landing safely near the wreck without alerting the rival crew. Teaches: atmospheric entry, weather, and choosing a landing site.</w:t>
+      </w:r>
+    </w:p>
+    <w:p>
+      <w:pPr>
+        <w:pStyle w:val="Heading2"/>
+        <w:spacing w:after="100" w:before="240"/>
+      </w:pPr>
+      <w:r>
+        <w:rPr>
+          <w:rFonts w:ascii="Calibri" w:cs="Calibri" w:eastAsia="Calibri" w:hAnsi="Calibri"/>
+        </w:rPr>
+        <w:t xml:space="preserve">Entry and approach</w:t>
       </w:r>
     </w:p>
     <w:p>
@@ -3207,13 +4144,13 @@
           <w:b/>
           <w:bCs/>
         </w:rPr>
-        <w:t xml:space="preserve">Oops factor.</w:t>
-      </w:r>
-      <w:r>
-        <w:rPr>
-          <w:rFonts w:ascii="Calibri" w:cs="Calibri" w:eastAsia="Calibri" w:hAnsi="Calibri"/>
-        </w:rPr>
-        <w:t xml:space="preserve"> On an Effect of -6 or worse the buoy dumps its logs and starts a loud, fast-repeating signal. This is the one way to ruin the whole chain. The party now has to chase down the data from the fragments on their own sensors, which cuts the chain by one link.</w:t>
+        <w:t xml:space="preserve">Atmospheric entry.</w:t>
+      </w:r>
+      <w:r>
+        <w:rPr>
+          <w:rFonts w:ascii="Calibri" w:cs="Calibri" w:eastAsia="Calibri" w:hAnsi="Calibri"/>
+        </w:rPr>
+        <w:t xml:space="preserve"> The very thin atmosphere makes entry easy. A Routine (6+) Pilot check; a failure means a bumpy ride and 1D damage to the ship's hull, not a crash. A ship that isn't streamlined takes DM-2.</w:t>
       </w:r>
     </w:p>
     <w:p>
@@ -3231,71 +4168,13 @@
           <w:b/>
           <w:bCs/>
         </w:rPr>
-        <w:t xml:space="preserve">A neat alternative.</w:t>
-      </w:r>
-      <w:r>
-        <w:rPr>
-          <w:rFonts w:ascii="Calibri" w:cs="Calibri" w:eastAsia="Calibri" w:hAnsi="Calibri"/>
-        </w:rPr>
-        <w:t xml:space="preserve"> A character with Persuade or Deception can use the open-link protocol to ask the buoy politely for its logs, as the buoy has an unsecured emergency-access mode intended for rescue crews. That is a Difficult (10+) Deception check and a good way to reward lateral thinking.</w:t>
-      </w:r>
-    </w:p>
-    <w:p>
-      <w:pPr>
-        <w:pStyle w:val="Heading3"/>
-        <w:spacing w:after="80" w:before="160"/>
-      </w:pPr>
-      <w:r>
-        <w:rPr>
-          <w:rFonts w:ascii="Calibri" w:cs="Calibri" w:eastAsia="Calibri" w:hAnsi="Calibri"/>
-        </w:rPr>
-        <w:t xml:space="preserve">What the logs show</w:t>
-      </w:r>
-    </w:p>
-    <w:p>
-      <w:pPr>
-        <w:spacing w:after="120"/>
-      </w:pPr>
-      <w:r>
-        <w:rPr>
-          <w:rFonts w:ascii="Calibri" w:cs="Calibri" w:eastAsia="Calibri" w:hAnsi="Calibri"/>
-        </w:rPr>
-        <w:t xml:space="preserve">Beyond the telemetry, the buoy's logs show one extra thing that the party can find if they ask: the Pride's drive output dropped to zero 90 seconds before she lost control. There was no explosion and no fire. The drive was shut down from inside. This is the first clue that the crash was not an accident, and it is the hook for Scene 7. Do not volunteer it; reward a player who asks "what happened to her engines?" with an Investigate (Average, 8+) check.</w:t>
-      </w:r>
-    </w:p>
-    <w:p>
-      <w:pPr>
-        <w:pStyle w:val="Heading1"/>
-        <w:spacing w:after="140" w:before="360"/>
-      </w:pPr>
-      <w:r>
-        <w:rPr>
-          <w:rFonts w:ascii="Calibri" w:cs="Calibri" w:eastAsia="Calibri" w:hAnsi="Calibri"/>
-        </w:rPr>
-        <w:t xml:space="preserve">Scene 3: Fly Down to the Surface</w:t>
-      </w:r>
-    </w:p>
-    <w:p>
-      <w:pPr>
-        <w:spacing w:after="120"/>
-      </w:pPr>
-      <w:r>
-        <w:rPr>
-          <w:rFonts w:ascii="Calibri" w:cs="Calibri" w:eastAsia="Calibri" w:hAnsi="Calibri"/>
-        </w:rPr>
-        <w:t xml:space="preserve">The party wins this scene by landing safely near the wreck without alerting the rival crew. Teaches: atmospheric entry, weather, and choosing a landing site (Core pp.168-170).</w:t>
-      </w:r>
-    </w:p>
-    <w:p>
-      <w:pPr>
-        <w:pStyle w:val="Heading2"/>
-        <w:spacing w:after="100" w:before="240"/>
-      </w:pPr>
-      <w:r>
-        <w:rPr>
-          <w:rFonts w:ascii="Calibri" w:cs="Calibri" w:eastAsia="Calibri" w:hAnsi="Calibri"/>
-        </w:rPr>
-        <w:t xml:space="preserve">Entry and approach</w:t>
+        <w:t xml:space="preserve">Weather.</w:t>
+      </w:r>
+      <w:r>
+        <w:rPr>
+          <w:rFonts w:ascii="Calibri" w:cs="Calibri" w:eastAsia="Calibri" w:hAnsi="Calibri"/>
+        </w:rPr>
+        <w:t xml:space="preserve"> The ash front is still far to the north. If the scan ran long and the clock is already ticking toward the storm, tell the players the sky to the north is darkening.</w:t>
       </w:r>
     </w:p>
     <w:p>
@@ -3313,61 +4192,13 @@
           <w:b/>
           <w:bCs/>
         </w:rPr>
-        <w:t xml:space="preserve">Atmospheric entry.</w:t>
-      </w:r>
-      <w:r>
-        <w:rPr>
-          <w:rFonts w:ascii="Calibri" w:cs="Calibri" w:eastAsia="Calibri" w:hAnsi="Calibri"/>
-        </w:rPr>
-        <w:t xml:space="preserve"> The very thin atmosphere makes entry easy. A Routine (6+) Pilot check; a failure means a bumpy ride and 1D damage to the ship's hull, not a crash. If the party is carrying a landing-capable hull (streamlined or distributed), say so; otherwise it is a controlled descent using thrusters and the party's ship is not streamlined for this, which is a DM-2.</w:t>
-      </w:r>
-    </w:p>
-    <w:p>
-      <w:pPr>
-        <w:pStyle w:val="ListParagraph"/>
-        <w:numPr>
-          <w:ilvl w:val="0"/>
-          <w:numId w:val="2"/>
-        </w:numPr>
-        <w:spacing w:after="60"/>
-      </w:pPr>
-      <w:r>
-        <w:rPr>
-          <w:rFonts w:ascii="Calibri" w:cs="Calibri" w:eastAsia="Calibri" w:hAnsi="Calibri"/>
-          <w:b/>
-          <w:bCs/>
-        </w:rPr>
-        <w:t xml:space="preserve">Weather.</w:t>
-      </w:r>
-      <w:r>
-        <w:rPr>
-          <w:rFonts w:ascii="Calibri" w:cs="Calibri" w:eastAsia="Calibri" w:hAnsi="Calibri"/>
-        </w:rPr>
-        <w:t xml:space="preserve"> The ash front is still far to the north. If the clock has already run past 8 hours (because the chain went badly), apply DM-2 to all flying checks: grit in the thrusters.</w:t>
-      </w:r>
-    </w:p>
-    <w:p>
-      <w:pPr>
-        <w:pStyle w:val="ListParagraph"/>
-        <w:numPr>
-          <w:ilvl w:val="0"/>
-          <w:numId w:val="2"/>
-        </w:numPr>
-        <w:spacing w:after="60"/>
-      </w:pPr>
-      <w:r>
-        <w:rPr>
-          <w:rFonts w:ascii="Calibri" w:cs="Calibri" w:eastAsia="Calibri" w:hAnsi="Calibri"/>
-          <w:b/>
-          <w:bCs/>
-        </w:rPr>
         <w:t xml:space="preserve">Choosing a landing site.</w:t>
       </w:r>
       <w:r>
         <w:rPr>
           <w:rFonts w:ascii="Calibri" w:cs="Calibri" w:eastAsia="Calibri" w:hAnsi="Calibri"/>
         </w:rPr>
-        <w:t xml:space="preserve"> The wreck lies on the floor of a long basin, with a ridge on the north and a dry riverbed on the east. The rival crew has set up beside the wreck itself, with their sled and gear against the hull. Give the players a rough map (see the sketch below) and let them choose. A good player will look at what each choice costs.</w:t>
+        <w:t xml:space="preserve"> The wreck lies on the floor of a long basin, with a ridge on the north and a dry riverbed on the east. The rival crew has set up beside the wreck itself, with their sled and gear against the hull. Show the players the wreck-site map and let them choose. A good player will look at what each choice costs.</w:t>
       </w:r>
     </w:p>
     <w:tbl>
@@ -3843,7 +4674,7 @@
         <w:rPr>
           <w:rFonts w:ascii="Calibri" w:cs="Calibri" w:eastAsia="Calibri" w:hAnsi="Calibri"/>
         </w:rPr>
-        <w:t xml:space="preserve">The party wins this scene by neutralising or removing the salvagers: killing them, driving them off, or persuading them to leave. Teaches: environmental hazards in combat, stealth and approach, and negotiation (Core pp.69-72, 74, 76-78).</w:t>
+        <w:t xml:space="preserve">The party wins this scene by neutralising or removing the salvagers: killing them, driving them off, or persuading them to leave. Teaches: environmental hazards in combat, stealth and approach, and negotiation.</w:t>
       </w:r>
     </w:p>
     <w:p>
@@ -3867,6 +4698,17 @@
           <w:rFonts w:ascii="Calibri" w:cs="Calibri" w:eastAsia="Calibri" w:hAnsi="Calibri"/>
         </w:rPr>
         <w:t xml:space="preserve">The rival crew is led by Captain Dessa Rourke, a tough, practical salvager who has done this a hundred times. She has five crew with her at the wreck. Two are working on the cargo hatch with cutting gear. Two are on guard. One stays with the freight sled and the camp gear parked against the hull. The ship's pilot and gunner remain in orbit aboard the Hard Bargain.</w:t>
+      </w:r>
+    </w:p>
+    <w:p>
+      <w:pPr>
+        <w:spacing w:after="120"/>
+      </w:pPr>
+      <w:r>
+        <w:rPr>
+          <w:rFonts w:ascii="Calibri" w:cs="Calibri" w:eastAsia="Calibri" w:hAnsi="Calibri"/>
+        </w:rPr>
+        <w:t xml:space="preserve">Rourke left the starport while the party was still talking to Kell, so she has a head start of about 6 hours at the wreck, adjusted by the scan result in Scene 2. Her cutting gear keeps failing. If the scan ran long, she is alerted and her guards are watching the approach.</w:t>
       </w:r>
     </w:p>
     <w:p>
@@ -4059,7 +4901,7 @@
               <w:rPr>
                 <w:rFonts w:ascii="Calibri" w:cs="Calibri" w:eastAsia="Calibri" w:hAnsi="Calibri"/>
               </w:rPr>
-              <w:t xml:space="preserve">Stealth (Average, 8+) for each Traveller crossing the open ground, DM+2 if they come over the ridge, DM-2 if the basin is open and flat. Recon (Average) first reveals the guard positions.</w:t>
+              <w:t xml:space="preserve">Stealth (Average, 8+) for each Traveller crossing the open ground, DM+2 if they come over the ridge, DM-2 if the basin is open and flat or if the rivals are alerted. Recon (Average) first reveals the guard positions.</w:t>
             </w:r>
           </w:p>
         </w:tc>
@@ -4084,7 +4926,7 @@
               <w:rPr>
                 <w:rFonts w:ascii="Calibri" w:cs="Calibri" w:eastAsia="Calibri" w:hAnsi="Calibri"/>
               </w:rPr>
-              <w:t xml:space="preserve">On success, the party gets to the wreck before the rivals know they are there, and gains a surprise round if a fight follows.</w:t>
+              <w:t xml:space="preserve">On success, the party gets to the wreck before the rivals know they are there, and gains a surprise round if a fight follows. The bridge breach is on the side of the ship away from the camp.</w:t>
             </w:r>
           </w:p>
         </w:tc>
@@ -4245,86 +5087,6 @@
                 <w:rFonts w:ascii="Calibri" w:cs="Calibri" w:eastAsia="Calibri" w:hAnsi="Calibri"/>
               </w:rPr>
               <w:t xml:space="preserve">Straight fight; see stats below.</w:t>
-            </w:r>
-          </w:p>
-        </w:tc>
-      </w:tr>
-      <w:tr>
-        <w:trPr>
-          <w:tblHeader w:val="off"/>
-        </w:trPr>
-        <w:tc>
-          <w:tcPr>
-            <w:tcW w:type="dxa" w:w="2000"/>
-            <w:tcBorders>
-              <w:top w:val="single" w:color="B8C4C8" w:sz="4"/>
-              <w:left w:val="single" w:color="B8C4C8" w:sz="4"/>
-              <w:bottom w:val="single" w:color="B8C4C8" w:sz="4"/>
-              <w:right w:val="single" w:color="B8C4C8" w:sz="4"/>
-            </w:tcBorders>
-            <w:tcMar>
-              <w:top w:type="dxa" w:w="60"/>
-              <w:left w:type="dxa" w:w="100"/>
-              <w:bottom w:type="dxa" w:w="60"/>
-              <w:right w:type="dxa" w:w="100"/>
-            </w:tcMar>
-          </w:tcPr>
-          <w:p>
-            <w:r>
-              <w:rPr>
-                <w:rFonts w:ascii="Calibri" w:cs="Calibri" w:eastAsia="Calibri" w:hAnsi="Calibri"/>
-              </w:rPr>
-              <w:t xml:space="preserve">Divert</w:t>
-            </w:r>
-          </w:p>
-        </w:tc>
-        <w:tc>
-          <w:tcPr>
-            <w:tcW w:type="dxa" w:w="4200"/>
-            <w:tcBorders>
-              <w:top w:val="single" w:color="B8C4C8" w:sz="4"/>
-              <w:left w:val="single" w:color="B8C4C8" w:sz="4"/>
-              <w:bottom w:val="single" w:color="B8C4C8" w:sz="4"/>
-              <w:right w:val="single" w:color="B8C4C8" w:sz="4"/>
-            </w:tcBorders>
-            <w:tcMar>
-              <w:top w:type="dxa" w:w="60"/>
-              <w:left w:type="dxa" w:w="100"/>
-              <w:bottom w:type="dxa" w:w="60"/>
-              <w:right w:type="dxa" w:w="100"/>
-            </w:tcMar>
-          </w:tcPr>
-          <w:p>
-            <w:r>
-              <w:rPr>
-                <w:rFonts w:ascii="Calibri" w:cs="Calibri" w:eastAsia="Calibri" w:hAnsi="Calibri"/>
-              </w:rPr>
-              <w:t xml:space="preserve">Use the nav buoy hack, the ship's comms, or a staged engine flare to pull guards away from the hatch.</w:t>
-            </w:r>
-          </w:p>
-        </w:tc>
-        <w:tc>
-          <w:tcPr>
-            <w:tcW w:type="dxa" w:w="3160"/>
-            <w:tcBorders>
-              <w:top w:val="single" w:color="B8C4C8" w:sz="4"/>
-              <w:left w:val="single" w:color="B8C4C8" w:sz="4"/>
-              <w:bottom w:val="single" w:color="B8C4C8" w:sz="4"/>
-              <w:right w:val="single" w:color="B8C4C8" w:sz="4"/>
-            </w:tcBorders>
-            <w:tcMar>
-              <w:top w:type="dxa" w:w="60"/>
-              <w:left w:type="dxa" w:w="100"/>
-              <w:bottom w:type="dxa" w:w="60"/>
-              <w:right w:type="dxa" w:w="100"/>
-            </w:tcMar>
-          </w:tcPr>
-          <w:p>
-            <w:r>
-              <w:rPr>
-                <w:rFonts w:ascii="Calibri" w:cs="Calibri" w:eastAsia="Calibri" w:hAnsi="Calibri"/>
-              </w:rPr>
-              <w:t xml:space="preserve">A clever plan can remove half the opposition before anyone is shot.</w:t>
             </w:r>
           </w:p>
         </w:tc>
@@ -4440,7 +5202,7 @@
         <w:rPr>
           <w:rFonts w:ascii="Calibri" w:cs="Calibri" w:eastAsia="Calibri" w:hAnsi="Calibri"/>
         </w:rPr>
-        <w:t xml:space="preserve"> Several fuel canisters are stacked near the wreck. A hit that fails to penetrate cover has a 1 in 6 chance of hitting one. It vents, then ignites. Anyone within 3 m takes 3D damage, DM+2 to Initiative for the next round to anyone who moves clear.</w:t>
+        <w:t xml:space="preserve"> A stack of fuel canisters sits beside the sled. Rule on it at the table: the damage and the blast radius depend on what struck them and how.</w:t>
       </w:r>
     </w:p>
     <w:p>
@@ -5689,7 +6451,7 @@
         <w:rPr>
           <w:rFonts w:ascii="Calibri" w:cs="Calibri" w:eastAsia="Calibri" w:hAnsi="Calibri"/>
         </w:rPr>
-        <w:t xml:space="preserve"> The rivals carry cutting gear, a freight sled (Scene 6) and a handheld scanner. Rourke carries a data slate with her contract. This is the proof Kell needs in Scene 7.</w:t>
+        <w:t xml:space="preserve"> The rivals carry cutting gear, a freight sled (Scene 6) and a handheld scanner. Rourke carries a data slate with her contract. This is part of the proof Kell needs in Scene 7.</w:t>
       </w:r>
     </w:p>
     <w:p>
@@ -5712,7 +6474,7 @@
         <w:rPr>
           <w:rFonts w:ascii="Calibri" w:cs="Calibri" w:eastAsia="Calibri" w:hAnsi="Calibri"/>
         </w:rPr>
-        <w:t xml:space="preserve">The party wins this scene by getting through the wreck to the cargo hold and opening it. Teaches: hazardous structures, forcing a sealed door, and a hacking skill chain (Core pp.58-62, 90-92).</w:t>
+        <w:t xml:space="preserve">The party wins this scene by getting into the wreck, restoring power and opening the cargo hold. Teaches: hazardous structures, restoring power, and a hacking skill chain.</w:t>
       </w:r>
     </w:p>
     <w:p>
@@ -5735,7 +6497,7 @@
         <w:rPr>
           <w:rFonts w:ascii="Calibri" w:cs="Calibri" w:eastAsia="Calibri" w:hAnsi="Calibri"/>
         </w:rPr>
-        <w:t xml:space="preserve">A Type-A2 Far Trader, 200 tons, lying belly-down where she slid to a stop, her crumpled bow against the foot of the ridge. The west engine pod is torn open and the hull is a tangle of buckled plates. Every compartment is dark and cold. The air inside has leaked away, so a respirator is not enough: anyone entering needs a vacc suit or a sealed environment suit, or must hold their breath. Use this to prompt the question "how long can we stay inside?".</w:t>
+        <w:t xml:space="preserve">A Type-A2 Far Trader, 200 tons, sitting on her belly where she slid to a stop, her crumpled bow against the foot of the ridge. The bridge is completely destroyed and torn open, on the side of the ship away from the rivals' camp. The hull is a tangle of buckled plates and every compartment is dark and cold. The breach means the air inside is the same as outside: very thin and freezing, so respirators are enough.</w:t>
       </w:r>
     </w:p>
     <w:tbl>
@@ -5840,7 +6602,7 @@
               <w:rPr>
                 <w:rFonts w:ascii="Calibri" w:cs="Calibri" w:eastAsia="Calibri" w:hAnsi="Calibri"/>
               </w:rPr>
-              <w:t xml:space="preserve">The west pod breach (engineering)</w:t>
+              <w:t xml:space="preserve">The bridge breach (the quiet way in)</w:t>
             </w:r>
           </w:p>
         </w:tc>
@@ -5865,7 +6627,7 @@
               <w:rPr>
                 <w:rFonts w:ascii="Calibri" w:cs="Calibri" w:eastAsia="Calibri" w:hAnsi="Calibri"/>
               </w:rPr>
-              <w:t xml:space="preserve">The easiest way in, and hidden from the rivals' camp. A torn hull plate leaves a 2 m gap into the power plant and drive compartment, which has a door into the hold. Sharp edges: Athletics (dexterity) Routine (6+) to enter without damage, or 1D damage. Fuel residue coats the floor; any spark has a 1 in 6 chance of igniting it (2D damage in a 3 m radius).</w:t>
+              <w:t xml:space="preserve">The bridge is gone: a torn-open hole in the hull on the side away from the camp. Sharp edges: Athletics (dexterity) Routine (6+) to enter without damage, or 1D damage. Fuel residue coats the floor; any spark has a 1 in 6 chance of igniting it (2D damage in a 3 m radius).</w:t>
             </w:r>
           </w:p>
         </w:tc>
@@ -5895,7 +6657,7 @@
               <w:rPr>
                 <w:rFonts w:ascii="Calibri" w:cs="Calibri" w:eastAsia="Calibri" w:hAnsi="Calibri"/>
               </w:rPr>
-              <w:t xml:space="preserve">The staterooms and corridor</w:t>
+              <w:t xml:space="preserve">The wrecked bridge</w:t>
             </w:r>
           </w:p>
         </w:tc>
@@ -5920,7 +6682,7 @@
               <w:rPr>
                 <w:rFonts w:ascii="Calibri" w:cs="Calibri" w:eastAsia="Calibri" w:hAnsi="Calibri"/>
               </w:rPr>
-              <w:t xml:space="preserve">Wrecked but passable. Buckled bulkheads and jammed stateroom doors run across the ship between the hold and the bridge. Pushing through the debris is an Athletics (dexterity) Routine (6+) check; a failure is 1D damage from sharp edges.</w:t>
+              <w:t xml:space="preserve">Consoles smashed and torn from their mounts. Two crew bodies, long dead and frozen. The captain's data slate and the black box are in the wreckage: Investigate (Average, 8+) to find both. The black box shows the drive output dropping to zero 90 seconds before the crash, with no fault. The drive was shut down from inside. This is the first clue that the crash was no accident.</w:t>
             </w:r>
           </w:p>
         </w:tc>
@@ -5950,7 +6712,7 @@
               <w:rPr>
                 <w:rFonts w:ascii="Calibri" w:cs="Calibri" w:eastAsia="Calibri" w:hAnsi="Calibri"/>
               </w:rPr>
-              <w:t xml:space="preserve">The bridge</w:t>
+              <w:t xml:space="preserve">The corridor and staterooms</w:t>
             </w:r>
           </w:p>
         </w:tc>
@@ -5975,7 +6737,7 @@
               <w:rPr>
                 <w:rFonts w:ascii="Calibri" w:cs="Calibri" w:eastAsia="Calibri" w:hAnsi="Calibri"/>
               </w:rPr>
-              <w:t xml:space="preserve">Smashed. Two crew bodies, long dead and frozen. The captain's data slate and the black box are here. The bridge console is dead, which is why the cargo hold is locked.</w:t>
+              <w:t xml:space="preserve">Wrecked but passable. Buckled bulkheads and jammed stateroom doors run across the ship between the bridge and the hold. Pushing through the debris is an Athletics (dexterity) Routine (6+) check; a failure is 1D damage from sharp edges.</w:t>
             </w:r>
           </w:p>
         </w:tc>
@@ -6005,6 +6767,61 @@
               <w:rPr>
                 <w:rFonts w:ascii="Calibri" w:cs="Calibri" w:eastAsia="Calibri" w:hAnsi="Calibri"/>
               </w:rPr>
+              <w:t xml:space="preserve">Engineering</w:t>
+            </w:r>
+          </w:p>
+        </w:tc>
+        <w:tc>
+          <w:tcPr>
+            <w:tcW w:type="dxa" w:w="7160"/>
+            <w:tcBorders>
+              <w:top w:val="single" w:color="B8C4C8" w:sz="4"/>
+              <w:left w:val="single" w:color="B8C4C8" w:sz="4"/>
+              <w:bottom w:val="single" w:color="B8C4C8" w:sz="4"/>
+              <w:right w:val="single" w:color="B8C4C8" w:sz="4"/>
+            </w:tcBorders>
+            <w:tcMar>
+              <w:top w:type="dxa" w:w="60"/>
+              <w:left w:type="dxa" w:w="100"/>
+              <w:bottom w:type="dxa" w:w="60"/>
+              <w:right w:type="dxa" w:w="100"/>
+            </w:tcMar>
+          </w:tcPr>
+          <w:p>
+            <w:r>
+              <w:rPr>
+                <w:rFonts w:ascii="Calibri" w:cs="Calibri" w:eastAsia="Calibri" w:hAnsi="Calibri"/>
+              </w:rPr>
+              <w:t xml:space="preserve">The forward lobe on the opposite side of the ship from the bridge, on the camp side. The auxiliary power console is here. Restoring power stops the cold-chain timer and gives the hold door panel power (Link 1 below).</w:t>
+            </w:r>
+          </w:p>
+        </w:tc>
+      </w:tr>
+      <w:tr>
+        <w:trPr>
+          <w:tblHeader w:val="off"/>
+        </w:trPr>
+        <w:tc>
+          <w:tcPr>
+            <w:tcW w:type="dxa" w:w="2200"/>
+            <w:tcBorders>
+              <w:top w:val="single" w:color="B8C4C8" w:sz="4"/>
+              <w:left w:val="single" w:color="B8C4C8" w:sz="4"/>
+              <w:bottom w:val="single" w:color="B8C4C8" w:sz="4"/>
+              <w:right w:val="single" w:color="B8C4C8" w:sz="4"/>
+            </w:tcBorders>
+            <w:tcMar>
+              <w:top w:type="dxa" w:w="60"/>
+              <w:left w:type="dxa" w:w="100"/>
+              <w:bottom w:type="dxa" w:w="60"/>
+              <w:right w:type="dxa" w:w="100"/>
+            </w:tcMar>
+          </w:tcPr>
+          <w:p>
+            <w:r>
+              <w:rPr>
+                <w:rFonts w:ascii="Calibri" w:cs="Calibri" w:eastAsia="Calibri" w:hAnsi="Calibri"/>
+              </w:rPr>
               <w:t xml:space="preserve">The cargo hold (amidships)</w:t>
             </w:r>
           </w:p>
@@ -6030,7 +6847,7 @@
               <w:rPr>
                 <w:rFonts w:ascii="Calibri" w:cs="Calibri" w:eastAsia="Calibri" w:hAnsi="Calibri"/>
               </w:rPr>
-              <w:t xml:space="preserve">The hold fills the middle of the ship. Every way into it ends at a sealed door: the inner doors of the two cargo airlocks, the corridor bulkhead and the power plant door. The rivals have cut halfway through the outer plate of the east cargo hatch and stopped when the torch failed, so the east airlock's inner door is the one the party will most likely face. See below.</w:t>
+              <w:t xml:space="preserve">The hold fills the middle of the ship. Every door into it (the corridor bulkhead door, the two cargo airlock inner doors, and the door from the power plant) runs off one controller, with its local panel beside the corridor bulkhead door. The rivals have cut halfway through the outer plate of the east cargo hatch and stopped when the torch failed, so the east airlock's inner door is the one they face. See below.</w:t>
             </w:r>
           </w:p>
         </w:tc>
@@ -6040,6 +6857,25 @@
       <w:pPr>
         <w:spacing w:after="80"/>
       </w:pPr>
+    </w:p>
+    <w:p>
+      <w:pPr>
+        <w:spacing w:after="120"/>
+      </w:pPr>
+      <w:r>
+        <w:rPr>
+          <w:rFonts w:ascii="Calibri" w:cs="Calibri" w:eastAsia="Calibri" w:hAnsi="Calibri"/>
+          <w:b/>
+          <w:bCs/>
+        </w:rPr>
+        <w:t xml:space="preserve">Two ways in.</w:t>
+      </w:r>
+      <w:r>
+        <w:rPr>
+          <w:rFonts w:ascii="Calibri" w:cs="Calibri" w:eastAsia="Calibri" w:hAnsi="Calibri"/>
+        </w:rPr>
+        <w:t xml:space="preserve"> The party can enter through the bridge breach on the quiet side, or through the east cargo hatch the rivals are cutting. The second means going through the rivals.</w:t>
+      </w:r>
     </w:p>
     <w:p>
       <w:pPr>
@@ -6092,37 +6928,13 @@
           <w:b/>
           <w:bCs/>
         </w:rPr>
-        <w:t xml:space="preserve">Cold.</w:t>
-      </w:r>
-      <w:r>
-        <w:rPr>
-          <w:rFonts w:ascii="Calibri" w:cs="Calibri" w:eastAsia="Calibri" w:hAnsi="Calibri"/>
-        </w:rPr>
-        <w:t xml:space="preserve"> Inside the wreck it is the same as outside. Without gear, the night rules apply, day or night, because the sun never reaches the interior.</w:t>
-      </w:r>
-    </w:p>
-    <w:p>
-      <w:pPr>
-        <w:pStyle w:val="ListParagraph"/>
-        <w:numPr>
-          <w:ilvl w:val="0"/>
-          <w:numId w:val="2"/>
-        </w:numPr>
-        <w:spacing w:after="60"/>
-      </w:pPr>
-      <w:r>
-        <w:rPr>
-          <w:rFonts w:ascii="Calibri" w:cs="Calibri" w:eastAsia="Calibri" w:hAnsi="Calibri"/>
-          <w:b/>
-          <w:bCs/>
-        </w:rPr>
-        <w:t xml:space="preserve">Time.</w:t>
-      </w:r>
-      <w:r>
-        <w:rPr>
-          <w:rFonts w:ascii="Calibri" w:cs="Calibri" w:eastAsia="Calibri" w:hAnsi="Calibri"/>
-        </w:rPr>
-        <w:t xml:space="preserve"> Any suit with an air supply of limited duration is a ticking clock. A standard vacc suit gives six hours. Count them.</w:t>
+        <w:t xml:space="preserve">Atmosphere and cold.</w:t>
+      </w:r>
+      <w:r>
+        <w:rPr>
+          <w:rFonts w:ascii="Calibri" w:cs="Calibri" w:eastAsia="Calibri" w:hAnsi="Calibri"/>
+        </w:rPr>
+        <w:t xml:space="preserve"> The air is the same as outside, so a respirator is enough, and the cold is the same too. Without gear, the night rules apply, day or night, because the sun never reaches the interior.</w:t>
       </w:r>
     </w:p>
     <w:p>
@@ -6168,7 +6980,7 @@
         <w:rPr>
           <w:rFonts w:ascii="Calibri" w:cs="Calibri" w:eastAsia="Calibri" w:hAnsi="Calibri"/>
         </w:rPr>
-        <w:t xml:space="preserve">The hold's lock is an electronic bolt that normally takes a command from the bridge. With the bridge dead, the controller has fallen back to a local passcode panel with a self-destruct on the data core if it detects tampering. It is cheap hardware but it is hard to do quickly.</w:t>
+        <w:t xml:space="preserve">The hold's lock is an electronic bolt that normally takes a command from the bridge. With the bridge destroyed, the controller has fallen back to a local passcode panel with a self-destruct on the data core if it detects tampering. It is cheap hardware but it is hard to do quickly. Unlocking it opens every door into the hold, the airlocks included.</w:t>
       </w:r>
     </w:p>
     <w:tbl>
@@ -6331,7 +7143,7 @@
               <w:rPr>
                 <w:rFonts w:ascii="Calibri" w:cs="Calibri" w:eastAsia="Calibri" w:hAnsi="Calibri"/>
               </w:rPr>
-              <w:t xml:space="preserve">1. Power</w:t>
+              <w:t xml:space="preserve">1. Power (engineering)</w:t>
             </w:r>
           </w:p>
         </w:tc>
@@ -6356,7 +7168,7 @@
               <w:rPr>
                 <w:rFonts w:ascii="Calibri" w:cs="Calibri" w:eastAsia="Calibri" w:hAnsi="Calibri"/>
               </w:rPr>
-              <w:t xml:space="preserve">Mechanic or Engineer: restore auxiliary power. The captain's data slate has a schematic, and with it the check is Routine (6+). Without it, Average (8+).</w:t>
+              <w:t xml:space="preserve">Engineer or Electronics (computers): restore auxiliary power at the engineering console. The captain's data slate has a schematic, and with it the check is Routine (6+). Without it, Average (8+).</w:t>
             </w:r>
           </w:p>
         </w:tc>
@@ -6406,7 +7218,7 @@
               <w:rPr>
                 <w:rFonts w:ascii="Calibri" w:cs="Calibri" w:eastAsia="Calibri" w:hAnsi="Calibri"/>
               </w:rPr>
-              <w:t xml:space="preserve">Lights and a live panel. Without power the panel can't be hacked, so a failure costs 1D x 10 minutes while the party finds another way to power it.</w:t>
+              <w:t xml:space="preserve">Lights, a live panel and an end to the cold-chain timer. A failure costs 1D x 10 minutes while the party tries again.</w:t>
             </w:r>
           </w:p>
         </w:tc>
@@ -6461,7 +7273,7 @@
               <w:rPr>
                 <w:rFonts w:ascii="Calibri" w:cs="Calibri" w:eastAsia="Calibri" w:hAnsi="Calibri"/>
               </w:rPr>
-              <w:t xml:space="preserve">Mechanic: remove the cover without triggering the tamper switch.</w:t>
+              <w:t xml:space="preserve">Mechanic: remove the cover of the hold door panel without triggering the tamper switch.</w:t>
             </w:r>
           </w:p>
         </w:tc>
@@ -6748,7 +7560,7 @@
         <w:rPr>
           <w:rFonts w:ascii="Calibri" w:cs="Calibri" w:eastAsia="Calibri" w:hAnsi="Calibri"/>
         </w:rPr>
-        <w:t xml:space="preserve"> The black box recovered from the bridge contains the Pride's passcode as part of the captain's log. A character with Investigate (Average, 8+) can find it. If they have done so, Link 4 drops to Routine (6+). This rewards exploring the bridge.</w:t>
+        <w:t xml:space="preserve"> The black box recovered from the bridge contains the Pride's passcode as part of the captain's log. If the party has it, Link 4 drops to Routine (6+). This rewards exploring the bridge.</w:t>
       </w:r>
     </w:p>
     <w:p>
@@ -6767,53 +7579,7 @@
         <w:rPr>
           <w:rFonts w:ascii="Calibri" w:cs="Calibri" w:eastAsia="Calibri" w:hAnsi="Calibri"/>
         </w:rPr>
-        <w:t xml:space="preserve"> The controller counts down 10 minutes. The party can still force the door (Route B or C), or race the countdown with one more Electronics (computers) attempt at DM-3.</w:t>
-      </w:r>
-    </w:p>
-    <w:p>
-      <w:pPr>
-        <w:pStyle w:val="Heading3"/>
-        <w:spacing w:after="80" w:before="160"/>
-      </w:pPr>
-      <w:r>
-        <w:rPr>
-          <w:rFonts w:ascii="Calibri" w:cs="Calibri" w:eastAsia="Calibri" w:hAnsi="Calibri"/>
-        </w:rPr>
-        <w:t xml:space="preserve">Route B: Cut it</w:t>
-      </w:r>
-    </w:p>
-    <w:p>
-      <w:pPr>
-        <w:spacing w:after="120"/>
-      </w:pPr>
-      <w:r>
-        <w:rPr>
-          <w:rFonts w:ascii="Calibri" w:cs="Calibri" w:eastAsia="Calibri" w:hAnsi="Calibri"/>
-        </w:rPr>
-        <w:t xml:space="preserve">A cutting torch (the rivals' torch, or the party's) can burn through the door. This is a Difficult (10+) Mechanic or Engineer check taking 1D x 10 minutes, with DM+2 if the rival cut is used. The cut sets off the tamper alarm and the data-core wipe, so the cargo log is lost. The heat also threatens the cargo: if the check fails by 4 or more, the heat damages the nearest container (Kell's fee drops by 5,000 credits for each damaged container).</w:t>
-      </w:r>
-    </w:p>
-    <w:p>
-      <w:pPr>
-        <w:pStyle w:val="Heading3"/>
-        <w:spacing w:after="80" w:before="160"/>
-      </w:pPr>
-      <w:r>
-        <w:rPr>
-          <w:rFonts w:ascii="Calibri" w:cs="Calibri" w:eastAsia="Calibri" w:hAnsi="Calibri"/>
-        </w:rPr>
-        <w:t xml:space="preserve">Route C: Force it</w:t>
-      </w:r>
-    </w:p>
-    <w:p>
-      <w:pPr>
-        <w:spacing w:after="120"/>
-      </w:pPr>
-      <w:r>
-        <w:rPr>
-          <w:rFonts w:ascii="Calibri" w:cs="Calibri" w:eastAsia="Calibri" w:hAnsi="Calibri"/>
-        </w:rPr>
-        <w:t xml:space="preserve">A pry bar and a hydraulic jack. This is an Athletics (strength) check at Very Difficult (12+), which in 0.4 G is DM+2, so effectively Difficult (10+). Two or more characters can combine: each adds +1 for each extra helper. It is noisy, so make the unstable-structure roll twice for each attempt. The wipe still triggers.</w:t>
+        <w:t xml:space="preserve"> The controller counts down 10 minutes. The party can still force a door (Route B or C), or race the countdown with one more Electronics (computers) attempt at DM-3.</w:t>
       </w:r>
     </w:p>
     <w:p>
@@ -6831,6 +7597,76 @@
           <w:b/>
           <w:bCs/>
         </w:rPr>
+        <w:t xml:space="preserve">Power is worth doing anyway.</w:t>
+      </w:r>
+      <w:r>
+        <w:rPr>
+          <w:rFonts w:ascii="Calibri" w:cs="Calibri" w:eastAsia="Calibri" w:hAnsi="Calibri"/>
+        </w:rPr>
+        <w:t xml:space="preserve"> Routes B and C don't need power, but only Link 1 stops the cold-chain timer. A party that cuts or forces its way in without restoring power still has to beat the 36-hour cell deadline.</w:t>
+      </w:r>
+    </w:p>
+    <w:p>
+      <w:pPr>
+        <w:pStyle w:val="Heading3"/>
+        <w:spacing w:after="80" w:before="160"/>
+      </w:pPr>
+      <w:r>
+        <w:rPr>
+          <w:rFonts w:ascii="Calibri" w:cs="Calibri" w:eastAsia="Calibri" w:hAnsi="Calibri"/>
+        </w:rPr>
+        <w:t xml:space="preserve">Route B: Cut it</w:t>
+      </w:r>
+    </w:p>
+    <w:p>
+      <w:pPr>
+        <w:spacing w:after="120"/>
+      </w:pPr>
+      <w:r>
+        <w:rPr>
+          <w:rFonts w:ascii="Calibri" w:cs="Calibri" w:eastAsia="Calibri" w:hAnsi="Calibri"/>
+        </w:rPr>
+        <w:t xml:space="preserve">A cutting torch (the rivals' torch, or the party's) can burn through any one of the doors into the hold. This is a Difficult (10+) Mechanic or Engineer check taking 1D x 10 minutes, with DM+2 if the rival cut is used. The cut sets off the tamper alarm and the data-core wipe, so the cargo log is lost. The heat also threatens the cargo: if the check fails by 4 or more, the heat damages the nearest container (Kell's fee drops by 5,000 credits for each damaged container).</w:t>
+      </w:r>
+    </w:p>
+    <w:p>
+      <w:pPr>
+        <w:pStyle w:val="Heading3"/>
+        <w:spacing w:after="80" w:before="160"/>
+      </w:pPr>
+      <w:r>
+        <w:rPr>
+          <w:rFonts w:ascii="Calibri" w:cs="Calibri" w:eastAsia="Calibri" w:hAnsi="Calibri"/>
+        </w:rPr>
+        <w:t xml:space="preserve">Route C: Force it</w:t>
+      </w:r>
+    </w:p>
+    <w:p>
+      <w:pPr>
+        <w:spacing w:after="120"/>
+      </w:pPr>
+      <w:r>
+        <w:rPr>
+          <w:rFonts w:ascii="Calibri" w:cs="Calibri" w:eastAsia="Calibri" w:hAnsi="Calibri"/>
+        </w:rPr>
+        <w:t xml:space="preserve">A pry bar and a hydraulic jack on any one door. This is an Athletics (strength) check at Difficult (10+); the low gravity is already allowed for in the target. Two or more characters can combine: each adds +1 for each extra helper. It is noisy, so make the unstable-structure roll twice for each attempt. The wipe still triggers.</w:t>
+      </w:r>
+    </w:p>
+    <w:p>
+      <w:pPr>
+        <w:pBdr>
+          <w:left w:val="single" w:color="2A7F8E" w:sz="18" w:space="8"/>
+        </w:pBdr>
+        <w:shd w:fill="E8F4F6" w:val="clear"/>
+        <w:spacing w:after="160" w:before="80"/>
+        <w:ind w:left="200"/>
+      </w:pPr>
+      <w:r>
+        <w:rPr>
+          <w:rFonts w:ascii="Calibri" w:cs="Calibri" w:eastAsia="Calibri" w:hAnsi="Calibri"/>
+          <w:b/>
+          <w:bCs/>
+        </w:rPr>
         <w:t xml:space="preserve">Design note.</w:t>
       </w:r>
       <w:r>
@@ -6877,7 +7713,7 @@
         <w:rPr>
           <w:rFonts w:ascii="Calibri" w:cs="Calibri" w:eastAsia="Calibri" w:hAnsi="Calibri"/>
         </w:rPr>
-        <w:t xml:space="preserve">If any of the three routes were noisy, or the clock has run past 8 hours, the rival freight sled arrives right now. This is the cue to move to Scene 6 at speed.</w:t>
+        <w:t xml:space="preserve">If the rivals are still active when the hold opens, or the clock has passed their 8-hour mark, they come for the hold. This is the cue to move to Scene 6 at speed.</w:t>
       </w:r>
     </w:p>
     <w:p>
@@ -6900,7 +7736,7 @@
         <w:rPr>
           <w:rFonts w:ascii="Calibri" w:cs="Calibri" w:eastAsia="Calibri" w:hAnsi="Calibri"/>
         </w:rPr>
-        <w:t xml:space="preserve">The party wins this scene by loading all twelve containers aboard their own ship. Teaches: extended tasks, working against a clock, and leadership (Core pp.60, 76).</w:t>
+        <w:t xml:space="preserve">The party wins this scene by loading all twelve containers aboard their own ship. Teaches: time-based tasks, working against a clock, and leadership.</w:t>
       </w:r>
     </w:p>
     <w:p>
@@ -6923,7 +7759,19 @@
         <w:rPr>
           <w:rFonts w:ascii="Calibri" w:cs="Calibri" w:eastAsia="Calibri" w:hAnsi="Calibri"/>
         </w:rPr>
-        <w:t xml:space="preserve">Each container weighs 2 tons on a planet with 0.4 G, which means 0.8 tons of effective weight. That is still too heavy for a Traveller to carry, but a freight sled or a cargo loader moves them easily. Use the rival crew's sled if the party took it, or the party's own cargo loader, or improvise with Mechanic and rope and a lot of effort.</w:t>
+        <w:t xml:space="preserve">Each container weighs 2 tons. Getting one out of the hold and onto a vehicle takes time, and how long depends on how the party does it. Then the vehicle has to take it to the party's ship.</w:t>
+      </w:r>
+    </w:p>
+    <w:p>
+      <w:pPr>
+        <w:pStyle w:val="Heading3"/>
+        <w:spacing w:after="80" w:before="160"/>
+      </w:pPr>
+      <w:r>
+        <w:rPr>
+          <w:rFonts w:ascii="Calibri" w:cs="Calibri" w:eastAsia="Calibri" w:hAnsi="Calibri"/>
+        </w:rPr>
+        <w:t xml:space="preserve">Getting a container out of the hold</w:t>
       </w:r>
     </w:p>
     <w:tbl>
@@ -7028,7 +7876,7 @@
               <w:rPr>
                 <w:rFonts w:ascii="Calibri" w:cs="Calibri" w:eastAsia="Calibri" w:hAnsi="Calibri"/>
               </w:rPr>
-              <w:t xml:space="preserve">Rival freight sled (if captured)</w:t>
+              <w:t xml:space="preserve">Kell's grav-lev straps</w:t>
             </w:r>
           </w:p>
         </w:tc>
@@ -7053,7 +7901,7 @@
               <w:rPr>
                 <w:rFonts w:ascii="Calibri" w:cs="Calibri" w:eastAsia="Calibri" w:hAnsi="Calibri"/>
               </w:rPr>
-              <w:t xml:space="preserve">Carries 4 containers per trip. Trip time: 15 minutes if the landing site is the basin floor, 30 if it is the riverbed, 45 if it is behind the ridge. Needs a driver (Drive, Routine 6+; DM+0).</w:t>
+              <w:t xml:space="preserve">The party can borrow four. Each strap moves one container from the hold onto the sled or loader. It takes 15 minutes, with a Mechanic check (8+): subtract 5 minutes for each point of Effect, and add 5 minutes for each point below zero. For example, a roll of 9 is Effect +1, so 10 minutes. The minimum is 5 minutes. Up to four containers move at once, and a batch is done when its slowest strap is done.</w:t>
             </w:r>
           </w:p>
         </w:tc>
@@ -7083,7 +7931,7 @@
               <w:rPr>
                 <w:rFonts w:ascii="Calibri" w:cs="Calibri" w:eastAsia="Calibri" w:hAnsi="Calibri"/>
               </w:rPr>
-              <w:t xml:space="preserve">Party's cargo loader</w:t>
+              <w:t xml:space="preserve">Muscle and ropes</w:t>
             </w:r>
           </w:p>
         </w:tc>
@@ -7108,7 +7956,113 @@
               <w:rPr>
                 <w:rFonts w:ascii="Calibri" w:cs="Calibri" w:eastAsia="Calibri" w:hAnsi="Calibri"/>
               </w:rPr>
-              <w:t xml:space="preserve">Carries 2 containers per trip, same trip times.</w:t>
+              <w:t xml:space="preserve">Three people to a container, with an Athletics (strength) check (8+). The gravity is already allowed for in the check. The base time is 30 minutes, adjusted by 5 minutes for each point of Effect in the same way, with a minimum of 5 minutes. A good emergency fallback.</w:t>
+            </w:r>
+          </w:p>
+        </w:tc>
+      </w:tr>
+    </w:tbl>
+    <w:p>
+      <w:pPr>
+        <w:spacing w:after="80"/>
+      </w:pPr>
+    </w:p>
+    <w:p>
+      <w:pPr>
+        <w:spacing w:after="120"/>
+      </w:pPr>
+      <w:r>
+        <w:rPr>
+          <w:rFonts w:ascii="Calibri" w:cs="Calibri" w:eastAsia="Calibri" w:hAnsi="Calibri"/>
+        </w:rPr>
+        <w:t xml:space="preserve">With straps, twelve containers are three batches, about 45 minutes in all. By muscle, one crew of three takes about six hours; each extra crew of three halves that.</w:t>
+      </w:r>
+    </w:p>
+    <w:p>
+      <w:pPr>
+        <w:pStyle w:val="Heading3"/>
+        <w:spacing w:after="80" w:before="160"/>
+      </w:pPr>
+      <w:r>
+        <w:rPr>
+          <w:rFonts w:ascii="Calibri" w:cs="Calibri" w:eastAsia="Calibri" w:hAnsi="Calibri"/>
+        </w:rPr>
+        <w:t xml:space="preserve">Getting a container to the party's ship</w:t>
+      </w:r>
+    </w:p>
+    <w:tbl>
+      <w:tblPr>
+        <w:tblW w:type="dxa" w:w="9360"/>
+        <w:tblBorders>
+          <w:top w:val="single" w:color="auto" w:sz="4"/>
+          <w:left w:val="single" w:color="auto" w:sz="4"/>
+          <w:bottom w:val="single" w:color="auto" w:sz="4"/>
+          <w:right w:val="single" w:color="auto" w:sz="4"/>
+          <w:insideH w:val="single" w:color="auto" w:sz="4"/>
+          <w:insideV w:val="single" w:color="auto" w:sz="4"/>
+        </w:tblBorders>
+      </w:tblPr>
+      <w:tblGrid>
+        <w:gridCol w:w="2600"/>
+        <w:gridCol w:w="6760"/>
+      </w:tblGrid>
+      <w:tr>
+        <w:trPr>
+          <w:tblHeader/>
+        </w:trPr>
+        <w:tc>
+          <w:tcPr>
+            <w:tcW w:type="dxa" w:w="2600"/>
+            <w:tcBorders>
+              <w:top w:val="single" w:color="B8C4C8" w:sz="4"/>
+              <w:left w:val="single" w:color="B8C4C8" w:sz="4"/>
+              <w:bottom w:val="single" w:color="B8C4C8" w:sz="4"/>
+              <w:right w:val="single" w:color="B8C4C8" w:sz="4"/>
+            </w:tcBorders>
+            <w:shd w:fill="D5E8EC" w:val="clear"/>
+            <w:tcMar>
+              <w:top w:type="dxa" w:w="60"/>
+              <w:left w:type="dxa" w:w="100"/>
+              <w:bottom w:type="dxa" w:w="60"/>
+              <w:right w:type="dxa" w:w="100"/>
+            </w:tcMar>
+          </w:tcPr>
+          <w:p>
+            <w:r>
+              <w:rPr>
+                <w:rFonts w:ascii="Calibri" w:cs="Calibri" w:eastAsia="Calibri" w:hAnsi="Calibri"/>
+                <w:b/>
+                <w:bCs/>
+              </w:rPr>
+              <w:t xml:space="preserve">Vehicle</w:t>
+            </w:r>
+          </w:p>
+        </w:tc>
+        <w:tc>
+          <w:tcPr>
+            <w:tcW w:type="dxa" w:w="6760"/>
+            <w:tcBorders>
+              <w:top w:val="single" w:color="B8C4C8" w:sz="4"/>
+              <w:left w:val="single" w:color="B8C4C8" w:sz="4"/>
+              <w:bottom w:val="single" w:color="B8C4C8" w:sz="4"/>
+              <w:right w:val="single" w:color="B8C4C8" w:sz="4"/>
+            </w:tcBorders>
+            <w:shd w:fill="D5E8EC" w:val="clear"/>
+            <w:tcMar>
+              <w:top w:type="dxa" w:w="60"/>
+              <w:left w:type="dxa" w:w="100"/>
+              <w:bottom w:type="dxa" w:w="60"/>
+              <w:right w:type="dxa" w:w="100"/>
+            </w:tcMar>
+          </w:tcPr>
+          <w:p>
+            <w:r>
+              <w:rPr>
+                <w:rFonts w:ascii="Calibri" w:cs="Calibri" w:eastAsia="Calibri" w:hAnsi="Calibri"/>
+                <w:b/>
+                <w:bCs/>
+              </w:rPr>
+              <w:t xml:space="preserve">Details</w:t>
             </w:r>
           </w:p>
         </w:tc>
@@ -7138,7 +8092,7 @@
               <w:rPr>
                 <w:rFonts w:ascii="Calibri" w:cs="Calibri" w:eastAsia="Calibri" w:hAnsi="Calibri"/>
               </w:rPr>
-              <w:t xml:space="preserve">Muscle and ropes</w:t>
+              <w:t xml:space="preserve">Rival freight sled (if captured)</w:t>
             </w:r>
           </w:p>
         </w:tc>
@@ -7163,7 +8117,62 @@
               <w:rPr>
                 <w:rFonts w:ascii="Calibri" w:cs="Calibri" w:eastAsia="Calibri" w:hAnsi="Calibri"/>
               </w:rPr>
-              <w:t xml:space="preserve">Each container needs three people and a Difficult (10+) Athletics (strength) group check; DM+2 for the low gravity. One container takes 30 minutes. A good emergency fallback.</w:t>
+              <w:t xml:space="preserve">Carries 4 containers per trip. Trip time: 15 minutes if the landing site is the basin floor, 30 if it is the riverbed, 45 if it is behind the ridge. Unloading into the party's ship is part of the trip. Needs a driver (Drive, Routine 6+).</w:t>
+            </w:r>
+          </w:p>
+        </w:tc>
+      </w:tr>
+      <w:tr>
+        <w:trPr>
+          <w:tblHeader w:val="off"/>
+        </w:trPr>
+        <w:tc>
+          <w:tcPr>
+            <w:tcW w:type="dxa" w:w="2600"/>
+            <w:tcBorders>
+              <w:top w:val="single" w:color="B8C4C8" w:sz="4"/>
+              <w:left w:val="single" w:color="B8C4C8" w:sz="4"/>
+              <w:bottom w:val="single" w:color="B8C4C8" w:sz="4"/>
+              <w:right w:val="single" w:color="B8C4C8" w:sz="4"/>
+            </w:tcBorders>
+            <w:tcMar>
+              <w:top w:type="dxa" w:w="60"/>
+              <w:left w:type="dxa" w:w="100"/>
+              <w:bottom w:type="dxa" w:w="60"/>
+              <w:right w:type="dxa" w:w="100"/>
+            </w:tcMar>
+          </w:tcPr>
+          <w:p>
+            <w:r>
+              <w:rPr>
+                <w:rFonts w:ascii="Calibri" w:cs="Calibri" w:eastAsia="Calibri" w:hAnsi="Calibri"/>
+              </w:rPr>
+              <w:t xml:space="preserve">Party's cargo loader</w:t>
+            </w:r>
+          </w:p>
+        </w:tc>
+        <w:tc>
+          <w:tcPr>
+            <w:tcW w:type="dxa" w:w="6760"/>
+            <w:tcBorders>
+              <w:top w:val="single" w:color="B8C4C8" w:sz="4"/>
+              <w:left w:val="single" w:color="B8C4C8" w:sz="4"/>
+              <w:bottom w:val="single" w:color="B8C4C8" w:sz="4"/>
+              <w:right w:val="single" w:color="B8C4C8" w:sz="4"/>
+            </w:tcBorders>
+            <w:tcMar>
+              <w:top w:type="dxa" w:w="60"/>
+              <w:left w:type="dxa" w:w="100"/>
+              <w:bottom w:type="dxa" w:w="60"/>
+              <w:right w:type="dxa" w:w="100"/>
+            </w:tcMar>
+          </w:tcPr>
+          <w:p>
+            <w:r>
+              <w:rPr>
+                <w:rFonts w:ascii="Calibri" w:cs="Calibri" w:eastAsia="Calibri" w:hAnsi="Calibri"/>
+              </w:rPr>
+              <w:t xml:space="preserve">Carries 2 containers per trip, same trip times.</w:t>
             </w:r>
           </w:p>
         </w:tc>
@@ -7176,36 +8185,13 @@
     </w:p>
     <w:p>
       <w:pPr>
-        <w:pStyle w:val="Heading3"/>
-        <w:spacing w:after="80" w:before="160"/>
-      </w:pPr>
-      <w:r>
-        <w:rPr>
-          <w:rFonts w:ascii="Calibri" w:cs="Calibri" w:eastAsia="Calibri" w:hAnsi="Calibri"/>
-        </w:rPr>
-        <w:t xml:space="preserve">As an extended task</w:t>
-      </w:r>
-    </w:p>
-    <w:p>
-      <w:pPr>
         <w:spacing w:after="120"/>
       </w:pPr>
       <w:r>
         <w:rPr>
           <w:rFonts w:ascii="Calibri" w:cs="Calibri" w:eastAsia="Calibri" w:hAnsi="Calibri"/>
         </w:rPr>
-        <w:t xml:space="preserve">Treat the loading as an extended task. The party needs a total of 12 successes (one per container). Each hour, the party rolls once and gets a success on an Average (8+) check using Mechanic, Athletics (strength), Leadership or Drive, whichever the Traveller in charge of the work has. Effect adds extra containers: Effect 0 gives one, Effect 4+ gives two. A second Traveller can add a Boon by helping. A leader can roll Leadership first (Average, 8+) to give the whole team DM+1.</w:t>
-      </w:r>
-    </w:p>
-    <w:p>
-      <w:pPr>
-        <w:spacing w:after="120"/>
-      </w:pPr>
-      <w:r>
-        <w:rPr>
-          <w:rFonts w:ascii="Calibri" w:cs="Calibri" w:eastAsia="Calibri" w:hAnsi="Calibri"/>
-        </w:rPr>
-        <w:t xml:space="preserve">The clock runs the whole time. Let the players see it. The pressure comes from three places.</w:t>
+        <w:t xml:space="preserve">The clock runs the whole time. Let the players see it. The pressure comes from four places.</w:t>
       </w:r>
     </w:p>
     <w:p>
@@ -7223,13 +8209,13 @@
           <w:b/>
           <w:bCs/>
         </w:rPr>
-        <w:t xml:space="preserve">The reagent cold chain.</w:t>
-      </w:r>
-      <w:r>
-        <w:rPr>
-          <w:rFonts w:ascii="Calibri" w:cs="Calibri" w:eastAsia="Calibri" w:hAnsi="Calibri"/>
-        </w:rPr>
-        <w:t xml:space="preserve"> Each container must be on the ship's power within 4 hours of leaving the hold, or its cell begins to fail. A container left in the open at day temperature loses one hour of cold for every hour out. At night, the cold chain is fine, but the people are not.</w:t>
+        <w:t xml:space="preserve">The cold chain.</w:t>
+      </w:r>
+      <w:r>
+        <w:rPr>
+          <w:rFonts w:ascii="Calibri" w:cs="Calibri" w:eastAsia="Calibri" w:hAnsi="Calibri"/>
+        </w:rPr>
+        <w:t xml:space="preserve"> If power was restored in Scene 5, containers can sit in the hold safely. If not, the cells fail at hour 36 and every container still unpowered is spoiled (Kell's fee drops by 5,000 credits each). Once a container leaves the hold, it must be on the party's ship power within 4 hours, or its cell starts to fail.</w:t>
       </w:r>
     </w:p>
     <w:p>
@@ -7253,7 +8239,7 @@
         <w:rPr>
           <w:rFonts w:ascii="Calibri" w:cs="Calibri" w:eastAsia="Calibri" w:hAnsi="Calibri"/>
         </w:rPr>
-        <w:t xml:space="preserve"> If any of the crew escaped, or if Rourke has been told the cargo is moving, a return strike arrives after about 4 hours of loading: three fresh salvagers from the Hard Bargain, using the Bargain's landing craft. Use Hask's stat block for each.</w:t>
+        <w:t xml:space="preserve"> If any of the crew escaped, or if Rourke has been told the cargo is moving, a return strike arrives after about 4 hours of loading: three more crew from the Hard Bargain, using her landing craft. Use Hask's stat block for each.</w:t>
       </w:r>
     </w:p>
     <w:p>
@@ -7277,19 +8263,7 @@
         <w:rPr>
           <w:rFonts w:ascii="Calibri" w:cs="Calibri" w:eastAsia="Calibri" w:hAnsi="Calibri"/>
         </w:rPr>
-        <w:t xml:space="preserve"> At 12 hours, the ash front arrives. Anything not loaded must wait for the storm to pass, about 10 hours. By then the rival's second team has arrived. Each container not loaded by the storm is lost to the party (Kell's fee drops by 5,000 credits per missing container, and the cargo is stolen).</w:t>
-      </w:r>
-    </w:p>
-    <w:p>
-      <w:pPr>
-        <w:pStyle w:val="Heading3"/>
-        <w:spacing w:after="80" w:before="160"/>
-      </w:pPr>
-      <w:r>
-        <w:rPr>
-          <w:rFonts w:ascii="Calibri" w:cs="Calibri" w:eastAsia="Calibri" w:hAnsi="Calibri"/>
-        </w:rPr>
-        <w:t xml:space="preserve">Complications (use one or two)</w:t>
+        <w:t xml:space="preserve"> At 12 hours, the ash front arrives. Anything not loaded must wait for the storm to pass, about 10 hours. By then the rivals' second team may have arrived. Each container not loaded by the storm is a container the party may lose (Kell's fee drops by 5,000 credits per missing container). Sitting out the storm leaves only about 2 hours of the 24-hour speed-bonus window.</w:t>
       </w:r>
     </w:p>
     <w:p>
@@ -7307,13 +8281,25 @@
           <w:b/>
           <w:bCs/>
         </w:rPr>
-        <w:t xml:space="preserve">Fuel leak ignites.</w:t>
-      </w:r>
-      <w:r>
-        <w:rPr>
-          <w:rFonts w:ascii="Calibri" w:cs="Calibri" w:eastAsia="Calibri" w:hAnsi="Calibri"/>
-        </w:rPr>
-        <w:t xml:space="preserve"> A spark from the loader ignites the hold's fuel residue. Athletics (dexterity) 8+ to dive clear or take 2D damage.</w:t>
+        <w:t xml:space="preserve">The bonus.</w:t>
+      </w:r>
+      <w:r>
+        <w:rPr>
+          <w:rFonts w:ascii="Calibri" w:cs="Calibri" w:eastAsia="Calibri" w:hAnsi="Calibri"/>
+        </w:rPr>
+        <w:t xml:space="preserve"> The party must lift off within 24 hours of landing to make the 7-day bonus. Remind them of this if they start to dawdle.</w:t>
+      </w:r>
+    </w:p>
+    <w:p>
+      <w:pPr>
+        <w:pStyle w:val="Heading3"/>
+        <w:spacing w:after="80" w:before="160"/>
+      </w:pPr>
+      <w:r>
+        <w:rPr>
+          <w:rFonts w:ascii="Calibri" w:cs="Calibri" w:eastAsia="Calibri" w:hAnsi="Calibri"/>
+        </w:rPr>
+        <w:t xml:space="preserve">Complications (use one or two)</w:t>
       </w:r>
     </w:p>
     <w:p>
@@ -7331,13 +8317,13 @@
           <w:b/>
           <w:bCs/>
         </w:rPr>
-        <w:t xml:space="preserve">Sled breakdown.</w:t>
-      </w:r>
-      <w:r>
-        <w:rPr>
-          <w:rFonts w:ascii="Calibri" w:cs="Calibri" w:eastAsia="Calibri" w:hAnsi="Calibri"/>
-        </w:rPr>
-        <w:t xml:space="preserve"> The sled throws a runner. Mechanic (Average, 8+), 1D x 10 minutes to fix.</w:t>
+        <w:t xml:space="preserve">Fuel leak ignites.</w:t>
+      </w:r>
+      <w:r>
+        <w:rPr>
+          <w:rFonts w:ascii="Calibri" w:cs="Calibri" w:eastAsia="Calibri" w:hAnsi="Calibri"/>
+        </w:rPr>
+        <w:t xml:space="preserve"> A spark from the loader ignites the hold's fuel residue. Athletics (dexterity) 8+ to dive clear or take 2D damage.</w:t>
       </w:r>
     </w:p>
     <w:p>
@@ -7355,13 +8341,13 @@
           <w:b/>
           <w:bCs/>
         </w:rPr>
-        <w:t xml:space="preserve">Hostages.</w:t>
-      </w:r>
-      <w:r>
-        <w:rPr>
-          <w:rFonts w:ascii="Calibri" w:cs="Calibri" w:eastAsia="Calibri" w:hAnsi="Calibri"/>
-        </w:rPr>
-        <w:t xml:space="preserve"> If the party left rival crew alive and unguarded, one of them may free the others and sabotage the sled or the party's ship ramp.</w:t>
+        <w:t xml:space="preserve">Sled breakdown.</w:t>
+      </w:r>
+      <w:r>
+        <w:rPr>
+          <w:rFonts w:ascii="Calibri" w:cs="Calibri" w:eastAsia="Calibri" w:hAnsi="Calibri"/>
+        </w:rPr>
+        <w:t xml:space="preserve"> The sled throws a runner. Mechanic (Average, 8+), 1D x 10 minutes to fix.</w:t>
       </w:r>
     </w:p>
     <w:p>
@@ -7379,13 +8365,13 @@
           <w:b/>
           <w:bCs/>
         </w:rPr>
-        <w:t xml:space="preserve">Sudden dust.</w:t>
-      </w:r>
-      <w:r>
-        <w:rPr>
-          <w:rFonts w:ascii="Calibri" w:cs="Calibri" w:eastAsia="Calibri" w:hAnsi="Calibri"/>
-        </w:rPr>
-        <w:t xml:space="preserve"> A gust kicks up fine ash. Everyone outside must pass an Average (8+) Survival check or suffer DM-1 on all checks for an hour (grit in the respirator).</w:t>
+        <w:t xml:space="preserve">Hostages.</w:t>
+      </w:r>
+      <w:r>
+        <w:rPr>
+          <w:rFonts w:ascii="Calibri" w:cs="Calibri" w:eastAsia="Calibri" w:hAnsi="Calibri"/>
+        </w:rPr>
+        <w:t xml:space="preserve"> If the party left rival crew alive and unguarded, one of them may free the others and sabotage the sled or the party's ship ramp.</w:t>
       </w:r>
     </w:p>
     <w:p>
@@ -7403,6 +8389,30 @@
           <w:b/>
           <w:bCs/>
         </w:rPr>
+        <w:t xml:space="preserve">Sudden dust.</w:t>
+      </w:r>
+      <w:r>
+        <w:rPr>
+          <w:rFonts w:ascii="Calibri" w:cs="Calibri" w:eastAsia="Calibri" w:hAnsi="Calibri"/>
+        </w:rPr>
+        <w:t xml:space="preserve"> A gust kicks up fine ash. Everyone outside must pass an Average (8+) Survival check or suffer DM-1 on all checks for an hour (grit in the respirator).</w:t>
+      </w:r>
+    </w:p>
+    <w:p>
+      <w:pPr>
+        <w:pStyle w:val="ListParagraph"/>
+        <w:numPr>
+          <w:ilvl w:val="0"/>
+          <w:numId w:val="2"/>
+        </w:numPr>
+        <w:spacing w:after="60"/>
+      </w:pPr>
+      <w:r>
+        <w:rPr>
+          <w:rFonts w:ascii="Calibri" w:cs="Calibri" w:eastAsia="Calibri" w:hAnsi="Calibri"/>
+          <w:b/>
+          <w:bCs/>
+        </w:rPr>
         <w:t xml:space="preserve">The Hard Bargain.</w:t>
       </w:r>
       <w:r>
@@ -7432,7 +8442,7 @@
         <w:rPr>
           <w:rFonts w:ascii="Calibri" w:cs="Calibri" w:eastAsia="Calibri" w:hAnsi="Calibri"/>
         </w:rPr>
-        <w:t xml:space="preserve">The party wins this scene by delivering the cargo to Kell and getting paid. Teaches: negotiation and consequences (Core pp.62, 76).</w:t>
+        <w:t xml:space="preserve">The party wins this scene by delivering the cargo to Kell and getting paid. Teaches: negotiation and consequences.</w:t>
       </w:r>
     </w:p>
     <w:p>
@@ -7455,7 +8465,7 @@
         <w:rPr>
           <w:rFonts w:ascii="Calibri" w:cs="Calibri" w:eastAsia="Calibri" w:hAnsi="Calibri"/>
         </w:rPr>
-        <w:t xml:space="preserve">The trip home is quiet, unless the GM wants a short coda. Jump back to the starport, and the cargo, now in good order, goes to Kell's warehouse under armed guard. Kell checks each container with a scanner. If the cold chain held, he is relieved. If not, he is professional about it, and docks the fee.</w:t>
+        <w:t xml:space="preserve">The trip home is quiet, unless the GM wants a short coda. It takes another 2.8 days at Thrust 1. The cargo, now in good order, goes to Kell's warehouse under armed guard. Kell checks each container with a scanner. If the cold chain held, he is relieved. If not, he is professional about it, and docks the fee. He also collects his four straps.</w:t>
       </w:r>
     </w:p>
     <w:p>
@@ -7597,7 +8607,7 @@
               <w:rPr>
                 <w:rFonts w:ascii="Calibri" w:cs="Calibri" w:eastAsia="Calibri" w:hAnsi="Calibri"/>
               </w:rPr>
-              <w:t xml:space="preserve">Cr80,000 on delivery (Cr20,000 was advanced for fuel).</w:t>
+              <w:t xml:space="preserve">Cr80,000 on delivery (the Cr5,000 expense advance was paid up front).</w:t>
             </w:r>
           </w:p>
         </w:tc>
@@ -7707,7 +8717,7 @@
               <w:rPr>
                 <w:rFonts w:ascii="Calibri" w:cs="Calibri" w:eastAsia="Calibri" w:hAnsi="Calibri"/>
               </w:rPr>
-              <w:t xml:space="preserve">Cr10,000 if delivered within 10 days of the briefing.</w:t>
+              <w:t xml:space="preserve">Cr10,000 if the cargo is on Kell's dock within 7 days of the briefing.</w:t>
             </w:r>
           </w:p>
         </w:tc>
@@ -7848,7 +8858,7 @@
         <w:rPr>
           <w:rFonts w:ascii="Calibri" w:cs="Calibri" w:eastAsia="Calibri" w:hAnsi="Calibri"/>
         </w:rPr>
-        <w:t xml:space="preserve">If the party has found the black box, Rourke's contract slate, or the buoy log showing the Pride's drive shutting down, they have evidence that the crash was sabotage by Marrow-Thane. Kell already suspected it, and he doesn't pretend otherwise. He says nothing about it up front because he needed the cargo recovered without a legal fight. Now he has the proof he needs to challenge the claim and force Marrow-Thane to pay.</w:t>
+        <w:t xml:space="preserve">If the party has found the black box or Rourke's contract slate, they have evidence that the crash was sabotage by Marrow-Thane. Kell already suspected it, and he doesn't pretend otherwise. He says nothing about it up front because he needed the cargo recovered without a legal fight. Now he has the proof he needs to challenge the claim and force Marrow-Thane to pay.</w:t>
       </w:r>
     </w:p>
     <w:p>
@@ -8371,7 +9381,7 @@
         <w:rPr>
           <w:rFonts w:ascii="Calibri" w:cs="Calibri" w:eastAsia="Calibri" w:hAnsi="Calibri"/>
         </w:rPr>
-        <w:t xml:space="preserve">Jump: 148 + 6D hours. No jumping within 100 planetary diameters.</w:t>
+        <w:t xml:space="preserve">Travel: Cinder is 2.8 days from the starport at Thrust 1.</w:t>
       </w:r>
     </w:p>
     <w:p>
@@ -8432,22 +9442,6 @@
           <w:rFonts w:ascii="Calibri" w:cs="Calibri" w:eastAsia="Calibri" w:hAnsi="Calibri"/>
         </w:rPr>
         <w:t xml:space="preserve">Ship: if the party keeps the rival freight sled, it is worth Cr15,000 on resale.</w:t>
-      </w:r>
-    </w:p>
-    <w:p>
-      <w:pPr>
-        <w:pStyle w:val="ListParagraph"/>
-        <w:numPr>
-          <w:ilvl w:val="0"/>
-          <w:numId w:val="2"/>
-        </w:numPr>
-        <w:spacing w:after="60"/>
-      </w:pPr>
-      <w:r>
-        <w:rPr>
-          <w:rFonts w:ascii="Calibri" w:cs="Calibri" w:eastAsia="Calibri" w:hAnsi="Calibri"/>
-        </w:rPr>
-        <w:t xml:space="preserve">Fuel: a successful fuel-skimming run saves the Cr20,000 advance.</w:t>
       </w:r>
     </w:p>
     <w:p>
@@ -9414,7 +10408,7 @@
               <w:rPr>
                 <w:rFonts w:ascii="Calibri" w:cs="Calibri" w:eastAsia="Calibri" w:hAnsi="Calibri"/>
               </w:rPr>
-              <w:t xml:space="preserve">The Calloway's Pride. Full cover. The deck plan inside is the Far Trader layout: cargo hold amidships, drives aft, bridge and sensors forward.</w:t>
+              <w:t xml:space="preserve">The Calloway's Pride. Full cover. The deck plan inside is the Far Trader layout: cargo hold amidships, drives aft, bridge forward on the side away from the camp, engineering forward on the camp side.</w:t>
             </w:r>
           </w:p>
         </w:tc>
@@ -9634,7 +10628,7 @@
               <w:rPr>
                 <w:rFonts w:ascii="Calibri" w:cs="Calibri" w:eastAsia="Calibri" w:hAnsi="Calibri"/>
               </w:rPr>
-              <w:t xml:space="preserve">Fuel canisters. A stray hit may ignite them (see Scene 4).</w:t>
+              <w:t xml:space="preserve">Fuel canisters. Rule on them at the table.</w:t>
             </w:r>
           </w:p>
         </w:tc>
@@ -9854,7 +10848,7 @@
               <w:rPr>
                 <w:rFonts w:ascii="Calibri" w:cs="Calibri" w:eastAsia="Calibri" w:hAnsi="Calibri"/>
               </w:rPr>
-              <w:t xml:space="preserve">The torn-open west engine pod. The breach into engineering is hidden from the camp.</w:t>
+              <w:t xml:space="preserve">The destroyed, torn-open bridge on the side away from the camp: the quiet way in.</w:t>
             </w:r>
           </w:p>
         </w:tc>

</xml_diff>